<commit_message>
before overspeed penalty attempt to make the net generalize to all axes
</commit_message>
<xml_diff>
--- a/documentation/thesis text.docx
+++ b/documentation/thesis text.docx
@@ -3239,9 +3239,46 @@
         <w:pStyle w:val="ListParagraph"/>
         <w:ind w:left="360"/>
       </w:pPr>
+      <w:r>
+        <w:t xml:space="preserve">Given </w:t>
+      </w:r>
+      <w:proofErr w:type="spellStart"/>
+      <w:r>
+        <w:t>wd</w:t>
+      </w:r>
+      <w:proofErr w:type="spellEnd"/>
+      <w:r>
+        <w:t xml:space="preserve">(t) based on (14)-(15), and the corresponding cable </w:t>
+      </w:r>
       <w:bookmarkStart w:id="0" w:name="_GoBack"/>
       <w:bookmarkEnd w:id="0"/>
       <w:r>
+        <w:t xml:space="preserve">forces f(t) </w:t>
+      </w:r>
+      <w:r>
+        <w:rPr>
+          <w:rFonts w:ascii="Cambria Math" w:hAnsi="Cambria Math" w:cs="Cambria Math"/>
+        </w:rPr>
+        <w:t>∈</w:t>
+      </w:r>
+      <w:r>
+        <w:t xml:space="preserve"> R 3n generating such a wrench is: f(t) = G(t) †</w:t>
+      </w:r>
+      <w:proofErr w:type="spellStart"/>
+      <w:r>
+        <w:t>wd</w:t>
+      </w:r>
+      <w:proofErr w:type="spellEnd"/>
+      <w:r>
+        <w:t>(t) + N(t) λ(t), (16) where λ(t) represents a functional variable to be optimized, and we use the short hand G(t) = G(RL(t)) and N(t) = N(RL(t)).</w:t>
+      </w:r>
+    </w:p>
+    <w:p>
+      <w:pPr>
+        <w:pStyle w:val="ListParagraph"/>
+        <w:ind w:left="360"/>
+      </w:pPr>
+      <w:r>
         <w:t xml:space="preserve"> </w:t>
       </w:r>
     </w:p>
@@ -3257,6 +3294,7 @@
         <w:rPr>
           <w:lang w:bidi="ar-EG"/>
         </w:rPr>
+        <w:lastRenderedPageBreak/>
         <w:t xml:space="preserve">Methodology: </w:t>
       </w:r>
     </w:p>
@@ -3278,7 +3316,6 @@
         <w:rPr>
           <w:rFonts w:ascii="Cambria Math" w:hAnsi="Cambria Math" w:cs="Cambria Math"/>
         </w:rPr>
-        <w:lastRenderedPageBreak/>
         <w:t xml:space="preserve">In order to decentralize the controller, </w:t>
       </w:r>
       <w:r>
@@ -3756,14 +3793,11 @@
         </w:rPr>
       </w:pPr>
       <w:r>
+        <w:lastRenderedPageBreak/>
         <w:t xml:space="preserve">Cutting the runtime is not only necessary for onboard deployment </w:t>
       </w:r>
       <w:r>
-        <w:t xml:space="preserve">but also practically a requirement if we want to do Residual RL on top of the whole pipeline as in phase 2. In order to do RL we need to simulate millions of steps, therefore any extra computational cost per </w:t>
-      </w:r>
-      <w:r>
-        <w:lastRenderedPageBreak/>
-        <w:t>step quickly add</w:t>
+        <w:t>but also practically a requirement if we want to do Residual RL on top of the whole pipeline as in phase 2. In order to do RL we need to simulate millions of steps, therefore any extra computational cost per step quickly add</w:t>
       </w:r>
       <w:r>
         <w:t>s</w:t>

</xml_diff>

<commit_message>
custom 2 x+y mid training (okayish) + thesis update
</commit_message>
<xml_diff>
--- a/documentation/thesis text.docx
+++ b/documentation/thesis text.docx
@@ -3625,39 +3625,7 @@
           <w:sz w:val="24"/>
           <w:szCs w:val="24"/>
         </w:rPr>
-        <w:t xml:space="preserve"> [</w:t>
-      </w:r>
-      <w:r>
-        <w:rPr>
-          <w:rFonts w:ascii="Times New Roman" w:hAnsi="Times New Roman" w:cs="Times New Roman"/>
-          <w:sz w:val="24"/>
-          <w:szCs w:val="24"/>
-        </w:rPr>
-        <w:t>−π</w:t>
-      </w:r>
-      <w:r>
-        <w:rPr>
-          <w:rFonts w:asciiTheme="majorBidi" w:hAnsiTheme="majorBidi" w:cstheme="majorBidi"/>
-          <w:sz w:val="24"/>
-          <w:szCs w:val="24"/>
-        </w:rPr>
-        <w:t xml:space="preserve">, </w:t>
-      </w:r>
-      <w:r>
-        <w:rPr>
-          <w:rFonts w:ascii="Times New Roman" w:hAnsi="Times New Roman" w:cs="Times New Roman"/>
-          <w:sz w:val="24"/>
-          <w:szCs w:val="24"/>
-        </w:rPr>
-        <w:t>π</w:t>
-      </w:r>
-      <w:r>
-        <w:rPr>
-          <w:rFonts w:asciiTheme="majorBidi" w:hAnsiTheme="majorBidi" w:cstheme="majorBidi"/>
-          <w:sz w:val="24"/>
-          <w:szCs w:val="24"/>
-        </w:rPr>
-        <w:t xml:space="preserve">), i = 1, . . . , n represent the </w:t>
+        <w:t xml:space="preserve"> [−π, π), i = 1, . . . , n represent the </w:t>
       </w:r>
       <w:r>
         <w:rPr>
@@ -4016,67 +3984,11 @@
       </w:r>
       <w:r>
         <w:rPr>
-          <w:rFonts w:ascii="Times New Roman" w:hAnsi="Times New Roman" w:cs="Times New Roman"/>
-          <w:sz w:val="24"/>
-          <w:szCs w:val="24"/>
-        </w:rPr>
-        <w:t>λ</w:t>
-      </w:r>
-      <w:r>
-        <w:rPr>
-          <w:rFonts w:asciiTheme="majorBidi" w:hAnsiTheme="majorBidi" w:cstheme="majorBidi"/>
-          <w:sz w:val="24"/>
-          <w:szCs w:val="24"/>
-        </w:rPr>
-        <w:t xml:space="preserve">(x(t)) </w:t>
-      </w:r>
-      <w:r>
-        <w:rPr>
-          <w:rFonts w:ascii="Times New Roman" w:hAnsi="Times New Roman" w:cs="Times New Roman"/>
-          <w:sz w:val="24"/>
-          <w:szCs w:val="24"/>
-        </w:rPr>
-        <w:t>−</w:t>
-      </w:r>
-      <w:r>
-        <w:rPr>
-          <w:rFonts w:asciiTheme="majorBidi" w:hAnsiTheme="majorBidi" w:cstheme="majorBidi"/>
-          <w:sz w:val="24"/>
-          <w:szCs w:val="24"/>
-        </w:rPr>
-        <w:t xml:space="preserve"> </w:t>
-      </w:r>
-      <w:r>
-        <w:rPr>
-          <w:rFonts w:ascii="Times New Roman" w:hAnsi="Times New Roman" w:cs="Times New Roman"/>
-          <w:sz w:val="24"/>
-          <w:szCs w:val="24"/>
-        </w:rPr>
-        <w:t>λ</w:t>
-      </w:r>
-      <w:r>
-        <w:rPr>
-          <w:rFonts w:asciiTheme="majorBidi" w:hAnsiTheme="majorBidi" w:cstheme="majorBidi"/>
-          <w:sz w:val="24"/>
-          <w:szCs w:val="24"/>
-        </w:rPr>
-        <w:t xml:space="preserve">(x(t </w:t>
-      </w:r>
-      <w:r>
-        <w:rPr>
-          <w:rFonts w:ascii="Times New Roman" w:hAnsi="Times New Roman" w:cs="Times New Roman"/>
-          <w:sz w:val="24"/>
-          <w:szCs w:val="24"/>
-        </w:rPr>
-        <w:t>−</w:t>
-      </w:r>
-      <w:r>
-        <w:rPr>
-          <w:rFonts w:asciiTheme="majorBidi" w:hAnsiTheme="majorBidi" w:cstheme="majorBidi"/>
-          <w:sz w:val="24"/>
-          <w:szCs w:val="24"/>
-        </w:rPr>
-        <w:t>))</w:t>
+          <w:rFonts w:asciiTheme="majorBidi" w:hAnsiTheme="majorBidi" w:cstheme="majorBidi"/>
+          <w:sz w:val="24"/>
+          <w:szCs w:val="24"/>
+        </w:rPr>
+        <w:t>λ(x(t)) − λ(x(t −))</w:t>
       </w:r>
       <w:r>
         <w:rPr>
@@ -4104,51 +4016,11 @@
       </w:r>
       <w:r>
         <w:rPr>
-          <w:rFonts w:ascii="Times New Roman" w:hAnsi="Times New Roman" w:cs="Times New Roman"/>
-          <w:sz w:val="24"/>
-          <w:szCs w:val="24"/>
-        </w:rPr>
-        <w:t>λ˙</w:t>
-      </w:r>
-      <w:r>
-        <w:rPr>
-          <w:rFonts w:asciiTheme="majorBidi" w:hAnsiTheme="majorBidi" w:cstheme="majorBidi"/>
-          <w:sz w:val="24"/>
-          <w:szCs w:val="24"/>
-        </w:rPr>
-        <w:t xml:space="preserve">(x(t)) </w:t>
-      </w:r>
-      <w:r>
-        <w:rPr>
-          <w:rFonts w:ascii="Times New Roman" w:hAnsi="Times New Roman" w:cs="Times New Roman"/>
-          <w:sz w:val="24"/>
-          <w:szCs w:val="24"/>
-        </w:rPr>
-        <w:t>−</w:t>
-      </w:r>
-      <w:r>
-        <w:rPr>
-          <w:rFonts w:asciiTheme="majorBidi" w:hAnsiTheme="majorBidi" w:cstheme="majorBidi"/>
-          <w:sz w:val="24"/>
-          <w:szCs w:val="24"/>
-        </w:rPr>
-        <w:t xml:space="preserve"> </w:t>
-      </w:r>
-      <w:r>
-        <w:rPr>
-          <w:rFonts w:ascii="Times New Roman" w:hAnsi="Times New Roman" w:cs="Times New Roman"/>
-          <w:sz w:val="24"/>
-          <w:szCs w:val="24"/>
-        </w:rPr>
-        <w:t>λ˙</w:t>
-      </w:r>
-      <w:r>
-        <w:rPr>
-          <w:rFonts w:asciiTheme="majorBidi" w:hAnsiTheme="majorBidi" w:cstheme="majorBidi"/>
-          <w:sz w:val="24"/>
-          <w:szCs w:val="24"/>
-        </w:rPr>
-        <w:t>(x(t −))</w:t>
+          <w:rFonts w:asciiTheme="majorBidi" w:hAnsiTheme="majorBidi" w:cstheme="majorBidi"/>
+          <w:sz w:val="24"/>
+          <w:szCs w:val="24"/>
+        </w:rPr>
+        <w:t>λ˙(x(t)) − λ˙(x(t −))</w:t>
       </w:r>
       <w:r>
         <w:rPr>
@@ -4777,97 +4649,7 @@
           <w:szCs w:val="24"/>
           <w14:ligatures w14:val="none"/>
         </w:rPr>
-        <w:t xml:space="preserve">Put Figure 2 here, </w:t>
-      </w:r>
-      <w:r>
-        <w:rPr>
-          <w:rFonts w:asciiTheme="majorBidi" w:hAnsiTheme="majorBidi" w:cstheme="majorBidi"/>
-          <w:kern w:val="0"/>
-          <w:sz w:val="24"/>
-          <w:szCs w:val="24"/>
-          <w14:ligatures w14:val="none"/>
-        </w:rPr>
-        <w:t>Overall</w:t>
-      </w:r>
-      <w:r>
-        <w:rPr>
-          <w:rFonts w:asciiTheme="majorBidi" w:hAnsiTheme="majorBidi" w:cstheme="majorBidi"/>
-          <w:kern w:val="0"/>
-          <w:sz w:val="24"/>
-          <w:szCs w:val="24"/>
-          <w14:ligatures w14:val="none"/>
-        </w:rPr>
-        <w:t xml:space="preserve"> classical</w:t>
-      </w:r>
-      <w:r>
-        <w:rPr>
-          <w:rFonts w:asciiTheme="majorBidi" w:hAnsiTheme="majorBidi" w:cstheme="majorBidi"/>
-          <w:kern w:val="0"/>
-          <w:sz w:val="24"/>
-          <w:szCs w:val="24"/>
-          <w14:ligatures w14:val="none"/>
-        </w:rPr>
-        <w:t xml:space="preserve"> control</w:t>
-      </w:r>
-      <w:r>
-        <w:rPr>
-          <w:rFonts w:asciiTheme="majorBidi" w:hAnsiTheme="majorBidi" w:cstheme="majorBidi"/>
-          <w:kern w:val="0"/>
-          <w:sz w:val="24"/>
-          <w:szCs w:val="24"/>
-          <w14:ligatures w14:val="none"/>
-        </w:rPr>
-        <w:t xml:space="preserve"> pipeline</w:t>
-      </w:r>
-      <w:r>
-        <w:rPr>
-          <w:rFonts w:asciiTheme="majorBidi" w:hAnsiTheme="majorBidi" w:cstheme="majorBidi"/>
-          <w:kern w:val="0"/>
-          <w:sz w:val="24"/>
-          <w:szCs w:val="24"/>
-          <w14:ligatures w14:val="none"/>
-        </w:rPr>
-        <w:t xml:space="preserve"> scheme including load-wrench controller (green block), </w:t>
-      </w:r>
-      <w:r>
-        <w:rPr>
-          <w:rFonts w:asciiTheme="majorBidi" w:hAnsiTheme="majorBidi" w:cstheme="majorBidi"/>
-          <w:kern w:val="0"/>
-          <w:sz w:val="24"/>
-          <w:szCs w:val="24"/>
-          <w14:ligatures w14:val="none"/>
-        </w:rPr>
-        <w:t xml:space="preserve">the </w:t>
-      </w:r>
-      <w:r>
-        <w:rPr>
-          <w:rFonts w:asciiTheme="majorBidi" w:hAnsiTheme="majorBidi" w:cstheme="majorBidi"/>
-          <w:kern w:val="0"/>
-          <w:sz w:val="24"/>
-          <w:szCs w:val="24"/>
-          <w14:ligatures w14:val="none"/>
-        </w:rPr>
-        <w:t>carrier-trajectory generator</w:t>
-      </w:r>
-      <w:r>
-        <w:rPr>
-          <w:rFonts w:asciiTheme="majorBidi" w:hAnsiTheme="majorBidi" w:cstheme="majorBidi"/>
-          <w:kern w:val="0"/>
-          <w:sz w:val="24"/>
-          <w:szCs w:val="24"/>
-          <w14:ligatures w14:val="none"/>
-        </w:rPr>
-        <w:t xml:space="preserve"> </w:t>
-      </w:r>
-      <w:r>
-        <w:rPr>
-          <w:rFonts w:asciiTheme="majorBidi" w:hAnsiTheme="majorBidi" w:cstheme="majorBidi"/>
-          <w:kern w:val="0"/>
-          <w:sz w:val="24"/>
-          <w:szCs w:val="24"/>
-          <w14:ligatures w14:val="none"/>
-        </w:rPr>
-        <w:t>(blue blocks), and the optimization layer (red block).</w:t>
+        <w:t>Put Figure 2 here, Overall classical control pipeline scheme including load-wrench controller (green block), the carrier-trajectory generator (blue blocks), and the optimization layer (red block).</w:t>
       </w:r>
     </w:p>
     <w:p>
@@ -5349,7 +5131,23 @@
           <w:sz w:val="24"/>
           <w:szCs w:val="24"/>
         </w:rPr>
-        <w:t xml:space="preserve">. The goal would be to train a Neural Network (NN) to mimic the output of the optimizer. We face an interesting choice here, either to train the NN to output λ(t) directly or output just ξ(t), A(t) and we can then reconstruct λ(t) using the time t and phases ϕi using eq. (17). Outputting </w:t>
+        <w:t>. The goal would be to train a Neural Network (NN) to mimic the output of the optimizer. We face an interesting choice here, either to train the NN to output λ(t) directly or output just ξ(t), A(t) and we can then reconstruct λ(t) using the time t and phase</w:t>
+      </w:r>
+      <w:r>
+        <w:rPr>
+          <w:rFonts w:asciiTheme="majorBidi" w:hAnsiTheme="majorBidi" w:cstheme="majorBidi"/>
+          <w:sz w:val="24"/>
+          <w:szCs w:val="24"/>
+        </w:rPr>
+        <w:t xml:space="preserve"> shift</w:t>
+      </w:r>
+      <w:r>
+        <w:rPr>
+          <w:rFonts w:asciiTheme="majorBidi" w:hAnsiTheme="majorBidi" w:cstheme="majorBidi"/>
+          <w:sz w:val="24"/>
+          <w:szCs w:val="24"/>
+        </w:rPr>
+        <w:t xml:space="preserve">s ϕi using eq. (17). Outputting </w:t>
       </w:r>
       <w:r>
         <w:rPr>
@@ -5393,23 +5191,7 @@
           <w:sz w:val="24"/>
           <w:szCs w:val="24"/>
         </w:rPr>
-        <w:t>A possible extension would be shaping the reward function to account for fixed-wings dynamics</w:t>
-      </w:r>
-      <w:r>
-        <w:rPr>
-          <w:rFonts w:asciiTheme="majorBidi" w:hAnsiTheme="majorBidi" w:cstheme="majorBidi"/>
-          <w:sz w:val="24"/>
-          <w:szCs w:val="24"/>
-        </w:rPr>
-        <w:t xml:space="preserve"> other than the non-stopping constraint</w:t>
-      </w:r>
-      <w:r>
-        <w:rPr>
-          <w:rFonts w:asciiTheme="majorBidi" w:hAnsiTheme="majorBidi" w:cstheme="majorBidi"/>
-          <w:sz w:val="24"/>
-          <w:szCs w:val="24"/>
-        </w:rPr>
-        <w:t xml:space="preserve"> (e.g. minimum turning radius). </w:t>
+        <w:t xml:space="preserve">A possible extension would be shaping the reward function to account for fixed-wings dynamics other than the non-stopping constraint (e.g. minimum turning radius). </w:t>
       </w:r>
       <w:r>
         <w:rPr>
@@ -5478,12 +5260,14 @@
         <w:spacing w:line="360" w:lineRule="auto"/>
         <w:ind w:left="360"/>
         <w:rPr>
-          <w:sz w:val="24"/>
-          <w:szCs w:val="24"/>
-        </w:rPr>
-      </w:pPr>
-      <w:r>
-        <w:rPr>
+          <w:rFonts w:asciiTheme="majorBidi" w:hAnsiTheme="majorBidi" w:cstheme="majorBidi"/>
+          <w:sz w:val="24"/>
+          <w:szCs w:val="24"/>
+        </w:rPr>
+      </w:pPr>
+      <w:r>
+        <w:rPr>
+          <w:rFonts w:asciiTheme="majorBidi" w:hAnsiTheme="majorBidi" w:cstheme="majorBidi"/>
           <w:sz w:val="24"/>
           <w:szCs w:val="24"/>
         </w:rPr>
@@ -5499,6 +5283,7 @@
       </w:r>
       <w:r>
         <w:rPr>
+          <w:rFonts w:asciiTheme="majorBidi" w:hAnsiTheme="majorBidi" w:cstheme="majorBidi"/>
           <w:sz w:val="24"/>
           <w:szCs w:val="24"/>
         </w:rPr>
@@ -5514,6 +5299,7 @@
       </w:r>
       <w:r>
         <w:rPr>
+          <w:rFonts w:asciiTheme="majorBidi" w:hAnsiTheme="majorBidi" w:cstheme="majorBidi"/>
           <w:sz w:val="24"/>
           <w:szCs w:val="24"/>
         </w:rPr>
@@ -5537,6 +5323,7 @@
       </w:pPr>
       <w:r>
         <w:rPr>
+          <w:rFonts w:asciiTheme="majorBidi" w:hAnsiTheme="majorBidi" w:cstheme="majorBidi"/>
           <w:sz w:val="24"/>
           <w:szCs w:val="24"/>
         </w:rPr>
@@ -5560,6 +5347,7 @@
       </w:pPr>
       <w:r>
         <w:rPr>
+          <w:rFonts w:asciiTheme="majorBidi" w:hAnsiTheme="majorBidi" w:cstheme="majorBidi"/>
           <w:sz w:val="24"/>
           <w:szCs w:val="24"/>
         </w:rPr>
@@ -5572,6 +5360,7 @@
         <w:spacing w:line="360" w:lineRule="auto"/>
         <w:ind w:left="1080"/>
         <w:rPr>
+          <w:rFonts w:asciiTheme="majorBidi" w:hAnsiTheme="majorBidi" w:cstheme="majorBidi"/>
           <w:sz w:val="24"/>
           <w:szCs w:val="24"/>
           <w:u w:val="single"/>
@@ -5579,6 +5368,7 @@
       </w:pPr>
       <w:r>
         <w:rPr>
+          <w:rFonts w:asciiTheme="majorBidi" w:hAnsiTheme="majorBidi" w:cstheme="majorBidi"/>
           <w:sz w:val="24"/>
           <w:szCs w:val="24"/>
         </w:rPr>
@@ -5594,6 +5384,7 @@
       </w:r>
       <w:r>
         <w:rPr>
+          <w:rFonts w:asciiTheme="majorBidi" w:hAnsiTheme="majorBidi" w:cstheme="majorBidi"/>
           <w:sz w:val="24"/>
           <w:szCs w:val="24"/>
         </w:rPr>
@@ -5609,6 +5400,7 @@
       </w:r>
       <w:r>
         <w:rPr>
+          <w:rFonts w:asciiTheme="majorBidi" w:hAnsiTheme="majorBidi" w:cstheme="majorBidi"/>
           <w:sz w:val="24"/>
           <w:szCs w:val="24"/>
         </w:rPr>
@@ -5624,6 +5416,7 @@
       </w:r>
       <w:r>
         <w:rPr>
+          <w:rFonts w:asciiTheme="majorBidi" w:hAnsiTheme="majorBidi" w:cstheme="majorBidi"/>
           <w:sz w:val="24"/>
           <w:szCs w:val="24"/>
         </w:rPr>
@@ -5639,6 +5432,7 @@
       </w:r>
       <w:r>
         <w:rPr>
+          <w:rFonts w:asciiTheme="majorBidi" w:hAnsiTheme="majorBidi" w:cstheme="majorBidi"/>
           <w:sz w:val="24"/>
           <w:szCs w:val="24"/>
         </w:rPr>
@@ -5654,6 +5448,7 @@
       </w:r>
       <w:r>
         <w:rPr>
+          <w:rFonts w:asciiTheme="majorBidi" w:hAnsiTheme="majorBidi" w:cstheme="majorBidi"/>
           <w:sz w:val="24"/>
           <w:szCs w:val="24"/>
         </w:rPr>
@@ -5669,6 +5464,7 @@
       </w:r>
       <w:r>
         <w:rPr>
+          <w:rFonts w:asciiTheme="majorBidi" w:hAnsiTheme="majorBidi" w:cstheme="majorBidi"/>
           <w:sz w:val="24"/>
           <w:szCs w:val="24"/>
         </w:rPr>
@@ -5676,6 +5472,7 @@
       </w:r>
       <w:r>
         <w:rPr>
+          <w:rFonts w:asciiTheme="majorBidi" w:hAnsiTheme="majorBidi" w:cstheme="majorBidi"/>
           <w:sz w:val="24"/>
           <w:szCs w:val="24"/>
           <w:u w:val="single"/>
@@ -5693,6 +5490,7 @@
       </w:r>
       <w:r>
         <w:rPr>
+          <w:rFonts w:asciiTheme="majorBidi" w:hAnsiTheme="majorBidi" w:cstheme="majorBidi"/>
           <w:sz w:val="24"/>
           <w:szCs w:val="24"/>
           <w:u w:val="single"/>
@@ -6119,7 +5917,23 @@
           <w:sz w:val="24"/>
           <w:szCs w:val="24"/>
         </w:rPr>
-        <w:t>a phase assigned to each drone</w:t>
+        <w:t>a phase</w:t>
+      </w:r>
+      <w:r>
+        <w:rPr>
+          <w:rFonts w:asciiTheme="majorBidi" w:hAnsiTheme="majorBidi" w:cstheme="majorBidi"/>
+          <w:sz w:val="24"/>
+          <w:szCs w:val="24"/>
+        </w:rPr>
+        <w:t xml:space="preserve"> shift</w:t>
+      </w:r>
+      <w:r>
+        <w:rPr>
+          <w:rFonts w:asciiTheme="majorBidi" w:hAnsiTheme="majorBidi" w:cstheme="majorBidi"/>
+          <w:sz w:val="24"/>
+          <w:szCs w:val="24"/>
+        </w:rPr>
+        <w:t xml:space="preserve"> assigned to each drone</w:t>
       </w:r>
       <w:r>
         <w:rPr>
@@ -6281,7 +6095,7 @@
       </w:r>
       <w:r>
         <w:rPr>
-          <w:rFonts w:ascii="Cambria Math" w:hAnsi="Cambria Math" w:cs="Cambria Math"/>
+          <w:rFonts w:asciiTheme="majorBidi" w:hAnsiTheme="majorBidi" w:cstheme="majorBidi"/>
           <w:sz w:val="24"/>
           <w:szCs w:val="24"/>
         </w:rPr>
@@ -6301,7 +6115,39 @@
           <w:sz w:val="24"/>
           <w:szCs w:val="24"/>
         </w:rPr>
-        <w:t xml:space="preserve">The lambda vector comes directly from the optimizer, the optimizer depends on the drone velocities and its own memory of the A, ksi and the phase of each drone. The phases are constant for a given configuration so the </w:t>
+        <w:t>The lambda vector comes directly from the optimizer, the optimizer depends on the drone velocities and its own memory of the A, ksi and the phase</w:t>
+      </w:r>
+      <w:r>
+        <w:rPr>
+          <w:rFonts w:asciiTheme="majorBidi" w:hAnsiTheme="majorBidi" w:cstheme="majorBidi"/>
+          <w:sz w:val="24"/>
+          <w:szCs w:val="24"/>
+        </w:rPr>
+        <w:t xml:space="preserve"> shift</w:t>
+      </w:r>
+      <w:r>
+        <w:rPr>
+          <w:rFonts w:asciiTheme="majorBidi" w:hAnsiTheme="majorBidi" w:cstheme="majorBidi"/>
+          <w:sz w:val="24"/>
+          <w:szCs w:val="24"/>
+        </w:rPr>
+        <w:t xml:space="preserve"> of each drone. The phase</w:t>
+      </w:r>
+      <w:r>
+        <w:rPr>
+          <w:rFonts w:asciiTheme="majorBidi" w:hAnsiTheme="majorBidi" w:cstheme="majorBidi"/>
+          <w:sz w:val="24"/>
+          <w:szCs w:val="24"/>
+        </w:rPr>
+        <w:t xml:space="preserve"> shift</w:t>
+      </w:r>
+      <w:r>
+        <w:rPr>
+          <w:rFonts w:asciiTheme="majorBidi" w:hAnsiTheme="majorBidi" w:cstheme="majorBidi"/>
+          <w:sz w:val="24"/>
+          <w:szCs w:val="24"/>
+        </w:rPr>
+        <w:t xml:space="preserve">s are constant for a given configuration so the </w:t>
       </w:r>
       <w:r>
         <w:rPr>
@@ -6437,7 +6283,16 @@
           <w:sz w:val="24"/>
           <w:szCs w:val="24"/>
         </w:rPr>
-        <w:t xml:space="preserve"> a m</w:t>
+        <w:t xml:space="preserve"> a </w:t>
+      </w:r>
+      <w:r>
+        <w:rPr>
+          <w:rFonts w:asciiTheme="majorBidi" w:hAnsiTheme="majorBidi" w:cstheme="majorBidi"/>
+          <w:sz w:val="24"/>
+          <w:szCs w:val="24"/>
+        </w:rPr>
+        <w:lastRenderedPageBreak/>
+        <w:t>m</w:t>
       </w:r>
       <w:r>
         <w:rPr>
@@ -6453,16 +6308,7 @@
           <w:sz w:val="24"/>
           <w:szCs w:val="24"/>
         </w:rPr>
-        <w:t xml:space="preserve"> </w:t>
-      </w:r>
-      <w:r>
-        <w:rPr>
-          <w:rFonts w:asciiTheme="majorBidi" w:hAnsiTheme="majorBidi" w:cstheme="majorBidi"/>
-          <w:sz w:val="24"/>
-          <w:szCs w:val="24"/>
-        </w:rPr>
-        <w:lastRenderedPageBreak/>
-        <w:t>[4]</w:t>
+        <w:t xml:space="preserve"> [4]</w:t>
       </w:r>
       <w:r>
         <w:rPr>
@@ -6554,6 +6400,7 @@
       </w:r>
       <w:r>
         <w:rPr>
+          <w:rFonts w:asciiTheme="majorBidi" w:hAnsiTheme="majorBidi" w:cstheme="majorBidi"/>
           <w:kern w:val="0"/>
           <w:sz w:val="24"/>
           <w:szCs w:val="24"/>
@@ -7023,15 +6870,7 @@
           <w:sz w:val="24"/>
           <w:szCs w:val="24"/>
         </w:rPr>
-        <w:t xml:space="preserve"> ms/step</w:t>
-      </w:r>
-      <w:r>
-        <w:rPr>
-          <w:rFonts w:asciiTheme="majorBidi" w:hAnsiTheme="majorBidi" w:cstheme="majorBidi"/>
-          <w:sz w:val="24"/>
-          <w:szCs w:val="24"/>
-        </w:rPr>
-        <w:t xml:space="preserve">. This means that parallelizing the environment and running thousands of instances on the GPU would be useless anyway. </w:t>
+        <w:t xml:space="preserve"> ms/step. This means that parallelizing the environment and running thousands of instances on the GPU would be useless anyway. </w:t>
       </w:r>
       <w:r>
         <w:rPr>
@@ -7047,55 +6886,7 @@
           <w:sz w:val="24"/>
           <w:szCs w:val="24"/>
         </w:rPr>
-        <w:t xml:space="preserve">, the bottleneck shifted to simulating the environment. </w:t>
-      </w:r>
-      <w:r>
-        <w:rPr>
-          <w:rFonts w:asciiTheme="majorBidi" w:hAnsiTheme="majorBidi" w:cstheme="majorBidi"/>
-          <w:sz w:val="24"/>
-          <w:szCs w:val="24"/>
-        </w:rPr>
-        <w:t>This marked the point</w:t>
-      </w:r>
-      <w:r>
-        <w:rPr>
-          <w:rFonts w:asciiTheme="majorBidi" w:hAnsiTheme="majorBidi" w:cstheme="majorBidi"/>
-          <w:sz w:val="24"/>
-          <w:szCs w:val="24"/>
-        </w:rPr>
-        <w:t xml:space="preserve"> at which the Simulink generated FMU</w:t>
-      </w:r>
-      <w:r>
-        <w:rPr>
-          <w:rFonts w:asciiTheme="majorBidi" w:hAnsiTheme="majorBidi" w:cstheme="majorBidi"/>
-          <w:sz w:val="24"/>
-          <w:szCs w:val="24"/>
-        </w:rPr>
-        <w:t xml:space="preserve"> choice became increasingly burdensome</w:t>
-      </w:r>
-      <w:r>
-        <w:rPr>
-          <w:rFonts w:asciiTheme="majorBidi" w:hAnsiTheme="majorBidi" w:cstheme="majorBidi"/>
-          <w:sz w:val="24"/>
-          <w:szCs w:val="24"/>
-        </w:rPr>
-        <w:t xml:space="preserve">. However, it was still possible to train a prototype agent that </w:t>
-      </w:r>
-      <w:r>
-        <w:rPr>
-          <w:rFonts w:asciiTheme="majorBidi" w:hAnsiTheme="majorBidi" w:cstheme="majorBidi"/>
-          <w:sz w:val="24"/>
-          <w:szCs w:val="24"/>
-        </w:rPr>
-        <w:t>demonstrates the feasibility of the proposed approach</w:t>
-      </w:r>
-      <w:r>
-        <w:rPr>
-          <w:rFonts w:asciiTheme="majorBidi" w:hAnsiTheme="majorBidi" w:cstheme="majorBidi"/>
-          <w:sz w:val="24"/>
-          <w:szCs w:val="24"/>
-        </w:rPr>
-        <w:t xml:space="preserve">. </w:t>
+        <w:t xml:space="preserve">, the bottleneck shifted to simulating the environment. This marked the point at which the Simulink generated FMU choice became increasingly burdensome. However, it was still possible to train a prototype agent that demonstrates the feasibility of the proposed approach. </w:t>
       </w:r>
       <w:r>
         <w:rPr>
@@ -7157,37 +6948,373 @@
         <w:spacing w:line="360" w:lineRule="auto"/>
         <w:ind w:left="360"/>
         <w:rPr>
+          <w:rFonts w:asciiTheme="majorBidi" w:hAnsiTheme="majorBidi" w:cstheme="majorBidi"/>
+          <w:kern w:val="0"/>
+          <w:sz w:val="24"/>
+          <w:szCs w:val="24"/>
+          <w14:ligatures w14:val="none"/>
+        </w:rPr>
+      </w:pPr>
+      <w:r>
+        <w:rPr>
+          <w:rFonts w:asciiTheme="majorBidi" w:hAnsiTheme="majorBidi" w:cstheme="majorBidi"/>
+          <w:sz w:val="24"/>
+          <w:szCs w:val="24"/>
+          <w:lang w:bidi="ar-EG"/>
+        </w:rPr>
+        <w:t>As a starting point,</w:t>
+      </w:r>
+      <w:r>
+        <w:rPr>
+          <w:rFonts w:asciiTheme="majorBidi" w:hAnsiTheme="majorBidi" w:cstheme="majorBidi"/>
+          <w:sz w:val="24"/>
+          <w:szCs w:val="24"/>
+          <w:lang w:bidi="ar-EG"/>
+        </w:rPr>
+        <w:t xml:space="preserve"> we attempted a simple supervised learning setup. We generate a trajectory using the CCS (later referred to</w:t>
+      </w:r>
+      <w:r>
+        <w:rPr>
+          <w:rFonts w:asciiTheme="majorBidi" w:hAnsiTheme="majorBidi" w:cstheme="majorBidi"/>
+          <w:sz w:val="24"/>
+          <w:szCs w:val="24"/>
+          <w:lang w:bidi="ar-EG"/>
+        </w:rPr>
+        <w:t xml:space="preserve"> </w:t>
+      </w:r>
+      <w:r>
+        <w:rPr>
+          <w:rFonts w:asciiTheme="majorBidi" w:hAnsiTheme="majorBidi" w:cstheme="majorBidi"/>
+          <w:sz w:val="24"/>
+          <w:szCs w:val="24"/>
+          <w:lang w:bidi="ar-EG"/>
+        </w:rPr>
+        <w:t xml:space="preserve">as the expert), we collect the inputs that we intend to feed the NN at each time step and finally we record the output </w:t>
+      </w:r>
+      <w:r>
+        <w:rPr>
           <w:rFonts w:ascii="Cambria Math" w:hAnsi="Cambria Math" w:cs="Cambria Math"/>
-          <w:kern w:val="0"/>
-          <w:sz w:val="24"/>
-          <w:szCs w:val="24"/>
-          <w14:ligatures w14:val="none"/>
-        </w:rPr>
-      </w:pPr>
-      <w:r>
-        <w:rPr>
-          <w:rFonts w:asciiTheme="majorBidi" w:hAnsiTheme="majorBidi" w:cstheme="majorBidi"/>
-          <w:sz w:val="24"/>
-          <w:szCs w:val="24"/>
-          <w:lang w:bidi="ar-EG"/>
-        </w:rPr>
-        <w:t>As a starting point,</w:t>
-      </w:r>
-      <w:r>
-        <w:rPr>
-          <w:rFonts w:asciiTheme="majorBidi" w:hAnsiTheme="majorBidi" w:cstheme="majorBidi"/>
-          <w:sz w:val="24"/>
-          <w:szCs w:val="24"/>
-          <w:lang w:bidi="ar-EG"/>
-        </w:rPr>
-        <w:t xml:space="preserve"> we attempted a simple supervised learning setup. We generate a trajectory using the CCS (later referred to</w:t>
-      </w:r>
-      <w:r>
-        <w:rPr>
-          <w:rFonts w:asciiTheme="majorBidi" w:hAnsiTheme="majorBidi" w:cstheme="majorBidi"/>
-          <w:sz w:val="24"/>
-          <w:szCs w:val="24"/>
-          <w:lang w:bidi="ar-EG"/>
+          <w:sz w:val="24"/>
+          <w:szCs w:val="24"/>
+        </w:rPr>
+        <w:t>𝜆</w:t>
+      </w:r>
+      <w:r>
+        <w:rPr>
+          <w:rFonts w:asciiTheme="majorBidi" w:hAnsiTheme="majorBidi" w:cstheme="majorBidi"/>
+          <w:sz w:val="24"/>
+          <w:szCs w:val="24"/>
+        </w:rPr>
+        <w:t xml:space="preserve"> calculated by the expert. This creates a Dataset D={(si​,ai​)}i=1N​, where our state si will be the input and action ai is the </w:t>
+      </w:r>
+      <w:r>
+        <w:rPr>
+          <w:rFonts w:ascii="Cambria Math" w:hAnsi="Cambria Math" w:cs="Cambria Math"/>
+          <w:kern w:val="0"/>
+          <w:sz w:val="24"/>
+          <w:szCs w:val="24"/>
+          <w14:ligatures w14:val="none"/>
+        </w:rPr>
+        <w:t>𝜆</w:t>
+      </w:r>
+      <w:r>
+        <w:rPr>
+          <w:rFonts w:asciiTheme="majorBidi" w:hAnsiTheme="majorBidi" w:cstheme="majorBidi"/>
+          <w:kern w:val="0"/>
+          <w:sz w:val="24"/>
+          <w:szCs w:val="24"/>
+          <w14:ligatures w14:val="none"/>
+        </w:rPr>
+        <w:t xml:space="preserve"> output.</w:t>
+      </w:r>
+    </w:p>
+    <w:p>
+      <w:pPr>
+        <w:spacing w:line="360" w:lineRule="auto"/>
+        <w:ind w:left="360"/>
+        <w:rPr>
+          <w:rFonts w:asciiTheme="majorBidi" w:hAnsiTheme="majorBidi" w:cstheme="majorBidi"/>
+          <w:kern w:val="0"/>
+          <w:sz w:val="24"/>
+          <w:szCs w:val="24"/>
+          <w14:ligatures w14:val="none"/>
+        </w:rPr>
+      </w:pPr>
+      <w:r>
+        <w:rPr>
+          <w:rFonts w:asciiTheme="majorBidi" w:hAnsiTheme="majorBidi" w:cstheme="majorBidi"/>
+          <w:kern w:val="0"/>
+          <w:sz w:val="24"/>
+          <w:szCs w:val="24"/>
+          <w14:ligatures w14:val="none"/>
+        </w:rPr>
+        <w:lastRenderedPageBreak/>
+        <w:t>We can then train the policy neural network in a supervised learning setting, where regression is performed on expert state–action pairs.</w:t>
+      </w:r>
+    </w:p>
+    <w:p>
+      <w:pPr>
+        <w:spacing w:line="360" w:lineRule="auto"/>
+        <w:ind w:left="360"/>
+        <w:rPr>
+          <w:rFonts w:asciiTheme="majorBidi" w:hAnsiTheme="majorBidi" w:cstheme="majorBidi"/>
+          <w:sz w:val="24"/>
+          <w:szCs w:val="24"/>
+        </w:rPr>
+      </w:pPr>
+      <w:r>
+        <w:rPr>
+          <w:rFonts w:asciiTheme="majorBidi" w:hAnsiTheme="majorBidi" w:cstheme="majorBidi"/>
+          <w:kern w:val="0"/>
+          <w:sz w:val="24"/>
+          <w:szCs w:val="24"/>
+          <w14:ligatures w14:val="none"/>
+        </w:rPr>
+        <w:t xml:space="preserve">As a first attempt, only one trajectory was used to simplify computational load and </w:t>
+      </w:r>
+      <w:r>
+        <w:rPr>
+          <w:rFonts w:asciiTheme="majorBidi" w:hAnsiTheme="majorBidi" w:cstheme="majorBidi"/>
+          <w:kern w:val="0"/>
+          <w:sz w:val="24"/>
+          <w:szCs w:val="24"/>
+          <w14:ligatures w14:val="none"/>
+        </w:rPr>
+        <w:t>allows us to investigate whether t</w:t>
+      </w:r>
+      <w:r>
+        <w:rPr>
+          <w:rFonts w:asciiTheme="majorBidi" w:hAnsiTheme="majorBidi" w:cstheme="majorBidi"/>
+          <w:kern w:val="0"/>
+          <w:sz w:val="24"/>
+          <w:szCs w:val="24"/>
+          <w14:ligatures w14:val="none"/>
+        </w:rPr>
+        <w:t>he policy neural network</w:t>
+      </w:r>
+      <w:r>
+        <w:rPr>
+          <w:rFonts w:asciiTheme="majorBidi" w:hAnsiTheme="majorBidi" w:cstheme="majorBidi"/>
+          <w:kern w:val="0"/>
+          <w:sz w:val="24"/>
+          <w:szCs w:val="24"/>
+          <w14:ligatures w14:val="none"/>
+        </w:rPr>
+        <w:t xml:space="preserve"> (an MLP) provide </w:t>
+      </w:r>
+      <w:r>
+        <w:rPr>
+          <w:rFonts w:ascii="Cambria Math" w:hAnsi="Cambria Math" w:cs="Cambria Math"/>
+          <w:kern w:val="0"/>
+          <w:sz w:val="24"/>
+          <w:szCs w:val="24"/>
+          <w14:ligatures w14:val="none"/>
+        </w:rPr>
+        <w:t>𝜆</w:t>
+      </w:r>
+      <w:r>
+        <w:rPr>
+          <w:rFonts w:asciiTheme="majorBidi" w:hAnsiTheme="majorBidi" w:cstheme="majorBidi"/>
+          <w:kern w:val="0"/>
+          <w:sz w:val="24"/>
+          <w:szCs w:val="24"/>
+          <w14:ligatures w14:val="none"/>
+        </w:rPr>
+        <w:t xml:space="preserve"> and fly the carriers successfully in closed loop. The main challenge being that in</w:t>
+      </w:r>
+      <w:r>
+        <w:rPr>
+          <w:rFonts w:asciiTheme="majorBidi" w:hAnsiTheme="majorBidi" w:cstheme="majorBidi"/>
+          <w:sz w:val="24"/>
+          <w:szCs w:val="24"/>
+        </w:rPr>
+        <w:t xml:space="preserve"> this setti</w:t>
+      </w:r>
+      <w:r>
+        <w:rPr>
+          <w:rFonts w:asciiTheme="majorBidi" w:hAnsiTheme="majorBidi" w:cstheme="majorBidi"/>
+          <w:sz w:val="24"/>
+          <w:szCs w:val="24"/>
+        </w:rPr>
+        <w:t xml:space="preserve">ng, the policy receives </w:t>
+      </w:r>
+      <w:r>
+        <w:rPr>
+          <w:rFonts w:asciiTheme="majorBidi" w:hAnsiTheme="majorBidi" w:cstheme="majorBidi"/>
+          <w:sz w:val="24"/>
+          <w:szCs w:val="24"/>
+        </w:rPr>
+        <w:t>states</w:t>
+      </w:r>
+      <w:r>
+        <w:rPr>
+          <w:rFonts w:asciiTheme="majorBidi" w:hAnsiTheme="majorBidi" w:cstheme="majorBidi"/>
+          <w:sz w:val="24"/>
+          <w:szCs w:val="24"/>
+        </w:rPr>
+        <w:t xml:space="preserve"> generated by its actions</w:t>
+      </w:r>
+      <w:r>
+        <w:rPr>
+          <w:rFonts w:asciiTheme="majorBidi" w:hAnsiTheme="majorBidi" w:cstheme="majorBidi"/>
+          <w:sz w:val="24"/>
+          <w:szCs w:val="24"/>
+        </w:rPr>
+        <w:t xml:space="preserve"> as inputs during execution, rather than relying on expert-generated states.</w:t>
+      </w:r>
+      <w:r>
+        <w:rPr>
+          <w:rFonts w:asciiTheme="majorBidi" w:hAnsiTheme="majorBidi" w:cstheme="majorBidi"/>
+          <w:sz w:val="24"/>
+          <w:szCs w:val="24"/>
+        </w:rPr>
+        <w:t xml:space="preserve"> The trajectory was chosen </w:t>
+      </w:r>
+      <w:r>
+        <w:rPr>
+          <w:rFonts w:asciiTheme="majorBidi" w:hAnsiTheme="majorBidi" w:cstheme="majorBidi"/>
+          <w:sz w:val="24"/>
+          <w:szCs w:val="24"/>
+        </w:rPr>
+        <w:t>with to ensure that the optimizer is engaged multiple times during the trajectory so that ξ(t) and A(t) meaningfully change. This is to ensure that the net captures a broad range of the optimizer’s behavior.</w:t>
+      </w:r>
+    </w:p>
+    <w:p>
+      <w:pPr>
+        <w:spacing w:line="360" w:lineRule="auto"/>
+        <w:ind w:left="360"/>
+        <w:rPr>
+          <w:rFonts w:asciiTheme="majorBidi" w:hAnsiTheme="majorBidi" w:cstheme="majorBidi"/>
+          <w:sz w:val="24"/>
+          <w:szCs w:val="24"/>
+        </w:rPr>
+      </w:pPr>
+      <w:r>
+        <w:rPr>
+          <w:rFonts w:asciiTheme="majorBidi" w:hAnsiTheme="majorBidi" w:cstheme="majorBidi"/>
+          <w:sz w:val="24"/>
+          <w:szCs w:val="24"/>
+        </w:rPr>
+        <w:t xml:space="preserve">Figure 3: Components of the initial desired load trajectory used in the first attempt. The load starts from rest, follows a linear trajectory along the x-axis, and then comes to rest at its final position. </w:t>
+      </w:r>
+    </w:p>
+    <w:p>
+      <w:pPr>
+        <w:spacing w:line="360" w:lineRule="auto"/>
+        <w:ind w:left="360"/>
+        <w:rPr>
+          <w:rFonts w:asciiTheme="majorBidi" w:hAnsiTheme="majorBidi" w:cstheme="majorBidi"/>
+          <w:sz w:val="24"/>
+          <w:szCs w:val="24"/>
+        </w:rPr>
+      </w:pPr>
+      <w:r>
+        <w:rPr>
+          <w:rFonts w:asciiTheme="majorBidi" w:hAnsiTheme="majorBidi" w:cstheme="majorBidi"/>
+          <w:sz w:val="24"/>
+          <w:szCs w:val="24"/>
+        </w:rPr>
+        <w:t>After the initial attempt proved successful and the policy was able to closely mimic the optimizer, the approach was generalized to a diverse set of trajectories, as will discussed in following sections.</w:t>
+      </w:r>
+    </w:p>
+    <w:p>
+      <w:pPr>
+        <w:spacing w:line="360" w:lineRule="auto"/>
+        <w:ind w:left="360"/>
+        <w:rPr>
+          <w:rFonts w:asciiTheme="majorBidi" w:hAnsiTheme="majorBidi" w:cstheme="majorBidi"/>
+          <w:sz w:val="24"/>
+          <w:szCs w:val="24"/>
+        </w:rPr>
+      </w:pPr>
+      <w:r>
+        <w:rPr>
+          <w:rFonts w:asciiTheme="majorBidi" w:hAnsiTheme="majorBidi" w:cstheme="majorBidi"/>
+          <w:sz w:val="24"/>
+          <w:szCs w:val="24"/>
+        </w:rPr>
+        <w:t xml:space="preserve">State/Input Design: </w:t>
+      </w:r>
+    </w:p>
+    <w:p>
+      <w:pPr>
+        <w:spacing w:line="360" w:lineRule="auto"/>
+        <w:ind w:left="360"/>
+        <w:rPr>
+          <w:rFonts w:asciiTheme="majorBidi" w:hAnsiTheme="majorBidi" w:cstheme="majorBidi"/>
+          <w:kern w:val="0"/>
+          <w:sz w:val="24"/>
+          <w:szCs w:val="24"/>
+          <w14:ligatures w14:val="none"/>
+        </w:rPr>
+      </w:pPr>
+      <w:r>
+        <w:rPr>
+          <w:rFonts w:asciiTheme="majorBidi" w:hAnsiTheme="majorBidi" w:cstheme="majorBidi"/>
+          <w:sz w:val="24"/>
+          <w:szCs w:val="24"/>
+        </w:rPr>
+        <w:t xml:space="preserve">As discussed earlier, this is a critical design choice since the optimizer has many internal </w:t>
+      </w:r>
+      <w:r>
+        <w:rPr>
+          <w:rFonts w:asciiTheme="majorBidi" w:hAnsiTheme="majorBidi" w:cstheme="majorBidi"/>
+          <w:sz w:val="24"/>
+          <w:szCs w:val="24"/>
+        </w:rPr>
+        <w:t>variables</w:t>
+      </w:r>
+      <w:r>
+        <w:rPr>
+          <w:rFonts w:asciiTheme="majorBidi" w:hAnsiTheme="majorBidi" w:cstheme="majorBidi"/>
+          <w:sz w:val="24"/>
+          <w:szCs w:val="24"/>
+        </w:rPr>
+        <w:t xml:space="preserve"> and the MLP has no memory element.</w:t>
+      </w:r>
+      <w:r>
+        <w:rPr>
+          <w:rFonts w:asciiTheme="majorBidi" w:hAnsiTheme="majorBidi" w:cstheme="majorBidi"/>
+          <w:sz w:val="24"/>
+          <w:szCs w:val="24"/>
+        </w:rPr>
+        <w:t xml:space="preserve"> Furthermore, </w:t>
+      </w:r>
+      <w:r>
+        <w:rPr>
+          <w:rFonts w:ascii="Cambria Math" w:hAnsi="Cambria Math" w:cs="Cambria Math"/>
+          <w:kern w:val="0"/>
+          <w:sz w:val="24"/>
+          <w:szCs w:val="24"/>
+          <w14:ligatures w14:val="none"/>
+        </w:rPr>
+        <w:t>𝜆</w:t>
+      </w:r>
+      <w:r>
+        <w:rPr>
+          <w:rFonts w:asciiTheme="majorBidi" w:hAnsiTheme="majorBidi" w:cstheme="majorBidi"/>
+          <w:kern w:val="0"/>
+          <w:sz w:val="24"/>
+          <w:szCs w:val="24"/>
+          <w14:ligatures w14:val="none"/>
+        </w:rPr>
+        <w:t xml:space="preserve"> is not just a function of these internal states </w:t>
+      </w:r>
+      <w:r>
+        <w:rPr>
+          <w:rFonts w:asciiTheme="majorBidi" w:hAnsiTheme="majorBidi" w:cstheme="majorBidi"/>
+          <w:kern w:val="0"/>
+          <w:sz w:val="24"/>
+          <w:szCs w:val="24"/>
+          <w14:ligatures w14:val="none"/>
+        </w:rPr>
+        <w:t>but also a function of time. Indeed, given fixed</w:t>
+      </w:r>
+      <w:r>
+        <w:rPr>
+          <w:rFonts w:asciiTheme="majorBidi" w:hAnsiTheme="majorBidi" w:cstheme="majorBidi"/>
+          <w:sz w:val="24"/>
+          <w:szCs w:val="24"/>
         </w:rPr>
         <w:t xml:space="preserve"> </w:t>
       </w:r>
@@ -7196,9 +7323,42 @@
           <w:rFonts w:asciiTheme="majorBidi" w:hAnsiTheme="majorBidi" w:cstheme="majorBidi"/>
           <w:sz w:val="24"/>
           <w:szCs w:val="24"/>
-          <w:lang w:bidi="ar-EG"/>
-        </w:rPr>
-        <w:t xml:space="preserve">as the expert), we collect the inputs that we intend to feed the NN at each time step and finally we record the output </w:t>
+        </w:rPr>
+        <w:t>ϕ</w:t>
+      </w:r>
+      <w:r>
+        <w:rPr>
+          <w:rFonts w:asciiTheme="majorBidi" w:hAnsiTheme="majorBidi" w:cstheme="majorBidi"/>
+          <w:sz w:val="24"/>
+          <w:szCs w:val="24"/>
+        </w:rPr>
+        <w:t>,</w:t>
+      </w:r>
+      <w:r>
+        <w:rPr>
+          <w:rFonts w:asciiTheme="majorBidi" w:hAnsiTheme="majorBidi" w:cstheme="majorBidi"/>
+          <w:kern w:val="0"/>
+          <w:sz w:val="24"/>
+          <w:szCs w:val="24"/>
+          <w14:ligatures w14:val="none"/>
+        </w:rPr>
+        <w:t xml:space="preserve"> </w:t>
+      </w:r>
+      <w:r>
+        <w:rPr>
+          <w:rFonts w:asciiTheme="majorBidi" w:hAnsiTheme="majorBidi" w:cstheme="majorBidi"/>
+          <w:sz w:val="24"/>
+          <w:szCs w:val="24"/>
+        </w:rPr>
+        <w:t>ξ and A</w:t>
+      </w:r>
+      <w:r>
+        <w:rPr>
+          <w:rFonts w:asciiTheme="majorBidi" w:hAnsiTheme="majorBidi" w:cstheme="majorBidi"/>
+          <w:sz w:val="24"/>
+          <w:szCs w:val="24"/>
+        </w:rPr>
+        <w:t xml:space="preserve">, </w:t>
       </w:r>
       <w:r>
         <w:rPr>
@@ -7210,40 +7370,40 @@
       </w:r>
       <w:r>
         <w:rPr>
+          <w:rFonts w:asciiTheme="majorBidi" w:hAnsiTheme="majorBidi" w:cstheme="majorBidi"/>
+          <w:kern w:val="0"/>
+          <w:sz w:val="24"/>
+          <w:szCs w:val="24"/>
+          <w14:ligatures w14:val="none"/>
+        </w:rPr>
+        <w:t xml:space="preserve"> is still time varying since it is a sinusoid eq. (17). </w:t>
+      </w:r>
+    </w:p>
+    <w:p>
+      <w:pPr>
+        <w:spacing w:line="360" w:lineRule="auto"/>
+        <w:ind w:left="360"/>
+        <w:rPr>
+          <w:rFonts w:asciiTheme="majorBidi" w:hAnsiTheme="majorBidi" w:cstheme="majorBidi"/>
+          <w:kern w:val="0"/>
+          <w:sz w:val="24"/>
+          <w:szCs w:val="24"/>
+          <w14:ligatures w14:val="none"/>
+        </w:rPr>
+      </w:pPr>
+      <w:r>
+        <w:rPr>
+          <w:rFonts w:asciiTheme="majorBidi" w:hAnsiTheme="majorBidi" w:cstheme="majorBidi"/>
+          <w:kern w:val="0"/>
+          <w:sz w:val="24"/>
+          <w:szCs w:val="24"/>
+          <w14:ligatures w14:val="none"/>
+        </w:rPr>
+        <w:t xml:space="preserve">We can generally split the variables that </w:t>
+      </w:r>
+      <w:r>
+        <w:rPr>
           <w:rFonts w:ascii="Cambria Math" w:hAnsi="Cambria Math" w:cs="Cambria Math"/>
-          <w:sz w:val="24"/>
-          <w:szCs w:val="24"/>
-        </w:rPr>
-        <w:t xml:space="preserve"> calculated by the expert. This </w:t>
-      </w:r>
-      <w:r>
-        <w:rPr>
-          <w:rFonts w:ascii="Cambria Math" w:hAnsi="Cambria Math" w:cs="Cambria Math"/>
-          <w:sz w:val="24"/>
-          <w:szCs w:val="24"/>
-        </w:rPr>
-        <w:lastRenderedPageBreak/>
-        <w:t xml:space="preserve">creates a Dataset </w:t>
-      </w:r>
-      <w:r>
-        <w:rPr>
-          <w:rFonts w:ascii="Cambria Math" w:hAnsi="Cambria Math" w:cs="Cambria Math"/>
-          <w:sz w:val="24"/>
-          <w:szCs w:val="24"/>
-        </w:rPr>
-        <w:t>D={(si​,ai​)}i=1N​</w:t>
-      </w:r>
-      <w:r>
-        <w:rPr>
-          <w:rFonts w:ascii="Cambria Math" w:hAnsi="Cambria Math" w:cs="Cambria Math"/>
-          <w:sz w:val="24"/>
-          <w:szCs w:val="24"/>
-        </w:rPr>
-        <w:t xml:space="preserve">, where our state si will be the input and action ai is the </w:t>
-      </w:r>
-      <w:r>
-        <w:rPr>
-          <w:rFonts w:ascii="Cambria Math" w:hAnsi="Cambria Math" w:cs="Cambria Math"/>
           <w:kern w:val="0"/>
           <w:sz w:val="24"/>
           <w:szCs w:val="24"/>
@@ -7253,448 +7413,7 @@
       </w:r>
       <w:r>
         <w:rPr>
-          <w:rFonts w:ascii="Cambria Math" w:hAnsi="Cambria Math" w:cs="Cambria Math"/>
-          <w:kern w:val="0"/>
-          <w:sz w:val="24"/>
-          <w:szCs w:val="24"/>
-          <w14:ligatures w14:val="none"/>
-        </w:rPr>
-        <w:t xml:space="preserve"> output.</w:t>
-      </w:r>
-    </w:p>
-    <w:p>
-      <w:pPr>
-        <w:spacing w:line="360" w:lineRule="auto"/>
-        <w:ind w:left="360"/>
-        <w:rPr>
-          <w:rFonts w:ascii="Cambria Math" w:hAnsi="Cambria Math" w:cs="Cambria Math"/>
-          <w:kern w:val="0"/>
-          <w:sz w:val="24"/>
-          <w:szCs w:val="24"/>
-          <w14:ligatures w14:val="none"/>
-        </w:rPr>
-      </w:pPr>
-      <w:r>
-        <w:rPr>
-          <w:rFonts w:ascii="Cambria Math" w:hAnsi="Cambria Math" w:cs="Cambria Math"/>
-          <w:kern w:val="0"/>
-          <w:sz w:val="24"/>
-          <w:szCs w:val="24"/>
-          <w14:ligatures w14:val="none"/>
-        </w:rPr>
-        <w:t>We can then train the policy neural network in a supervised learning setting, where regression is performed on expert state–action pairs.</w:t>
-      </w:r>
-    </w:p>
-    <w:p>
-      <w:pPr>
-        <w:spacing w:line="360" w:lineRule="auto"/>
-        <w:ind w:left="360"/>
-        <w:rPr>
-          <w:rFonts w:asciiTheme="majorBidi" w:hAnsiTheme="majorBidi" w:cstheme="majorBidi"/>
-          <w:sz w:val="24"/>
-          <w:szCs w:val="24"/>
-        </w:rPr>
-      </w:pPr>
-      <w:r>
-        <w:rPr>
-          <w:rFonts w:ascii="Cambria Math" w:hAnsi="Cambria Math" w:cs="Cambria Math"/>
-          <w:kern w:val="0"/>
-          <w:sz w:val="24"/>
-          <w:szCs w:val="24"/>
-          <w14:ligatures w14:val="none"/>
-        </w:rPr>
-        <w:t xml:space="preserve">As a first attempt, only one trajectory was used to simplify computational load and </w:t>
-      </w:r>
-      <w:r>
-        <w:rPr>
-          <w:rFonts w:ascii="Cambria Math" w:hAnsi="Cambria Math" w:cs="Cambria Math"/>
-          <w:kern w:val="0"/>
-          <w:sz w:val="24"/>
-          <w:szCs w:val="24"/>
-          <w14:ligatures w14:val="none"/>
-        </w:rPr>
-        <w:t>allows us to investigate whether t</w:t>
-      </w:r>
-      <w:r>
-        <w:rPr>
-          <w:rFonts w:ascii="Cambria Math" w:hAnsi="Cambria Math" w:cs="Cambria Math"/>
-          <w:kern w:val="0"/>
-          <w:sz w:val="24"/>
-          <w:szCs w:val="24"/>
-          <w14:ligatures w14:val="none"/>
-        </w:rPr>
-        <w:t>he policy neural network</w:t>
-      </w:r>
-      <w:r>
-        <w:rPr>
-          <w:rFonts w:ascii="Cambria Math" w:hAnsi="Cambria Math" w:cs="Cambria Math"/>
-          <w:kern w:val="0"/>
-          <w:sz w:val="24"/>
-          <w:szCs w:val="24"/>
-          <w14:ligatures w14:val="none"/>
-        </w:rPr>
-        <w:t xml:space="preserve"> (an MLP) provide </w:t>
-      </w:r>
-      <w:r>
-        <w:rPr>
-          <w:rFonts w:ascii="Cambria Math" w:hAnsi="Cambria Math" w:cs="Cambria Math"/>
-          <w:kern w:val="0"/>
-          <w:sz w:val="24"/>
-          <w:szCs w:val="24"/>
-          <w14:ligatures w14:val="none"/>
-        </w:rPr>
-        <w:t>𝜆</w:t>
-      </w:r>
-      <w:r>
-        <w:rPr>
-          <w:rFonts w:ascii="Cambria Math" w:hAnsi="Cambria Math" w:cs="Cambria Math"/>
-          <w:kern w:val="0"/>
-          <w:sz w:val="24"/>
-          <w:szCs w:val="24"/>
-          <w14:ligatures w14:val="none"/>
-        </w:rPr>
-        <w:t xml:space="preserve"> and fly the carriers successfully in closed loop. The main challenge being that in</w:t>
-      </w:r>
-      <w:r>
-        <w:rPr>
-          <w:rFonts w:asciiTheme="majorBidi" w:hAnsiTheme="majorBidi" w:cstheme="majorBidi"/>
-          <w:sz w:val="24"/>
-          <w:szCs w:val="24"/>
-        </w:rPr>
-        <w:t xml:space="preserve"> this setti</w:t>
-      </w:r>
-      <w:r>
-        <w:rPr>
-          <w:rFonts w:asciiTheme="majorBidi" w:hAnsiTheme="majorBidi" w:cstheme="majorBidi"/>
-          <w:sz w:val="24"/>
-          <w:szCs w:val="24"/>
-        </w:rPr>
-        <w:t xml:space="preserve">ng, the policy receives </w:t>
-      </w:r>
-      <w:r>
-        <w:rPr>
-          <w:rFonts w:asciiTheme="majorBidi" w:hAnsiTheme="majorBidi" w:cstheme="majorBidi"/>
-          <w:sz w:val="24"/>
-          <w:szCs w:val="24"/>
-        </w:rPr>
-        <w:t>states</w:t>
-      </w:r>
-      <w:r>
-        <w:rPr>
-          <w:rFonts w:asciiTheme="majorBidi" w:hAnsiTheme="majorBidi" w:cstheme="majorBidi"/>
-          <w:sz w:val="24"/>
-          <w:szCs w:val="24"/>
-        </w:rPr>
-        <w:t xml:space="preserve"> generated by its actions</w:t>
-      </w:r>
-      <w:r>
-        <w:rPr>
-          <w:rFonts w:asciiTheme="majorBidi" w:hAnsiTheme="majorBidi" w:cstheme="majorBidi"/>
-          <w:sz w:val="24"/>
-          <w:szCs w:val="24"/>
-        </w:rPr>
-        <w:t xml:space="preserve"> as inputs during execution, rather than relying on expert-generated states.</w:t>
-      </w:r>
-      <w:r>
-        <w:rPr>
-          <w:rFonts w:asciiTheme="majorBidi" w:hAnsiTheme="majorBidi" w:cstheme="majorBidi"/>
-          <w:sz w:val="24"/>
-          <w:szCs w:val="24"/>
-        </w:rPr>
-        <w:t xml:space="preserve"> The trajectory was chosen </w:t>
-      </w:r>
-      <w:r>
-        <w:rPr>
-          <w:rFonts w:asciiTheme="majorBidi" w:hAnsiTheme="majorBidi" w:cstheme="majorBidi"/>
-          <w:sz w:val="24"/>
-          <w:szCs w:val="24"/>
-        </w:rPr>
-        <w:t xml:space="preserve">with to ensure that the optimizer is engaged multiple times during the trajectory so that </w:t>
-      </w:r>
-      <w:r>
-        <w:rPr>
-          <w:rFonts w:asciiTheme="majorBidi" w:hAnsiTheme="majorBidi" w:cstheme="majorBidi"/>
-          <w:sz w:val="24"/>
-          <w:szCs w:val="24"/>
-        </w:rPr>
-        <w:t>ξ(t) and A(t)</w:t>
-      </w:r>
-      <w:r>
-        <w:rPr>
-          <w:rFonts w:asciiTheme="majorBidi" w:hAnsiTheme="majorBidi" w:cstheme="majorBidi"/>
-          <w:sz w:val="24"/>
-          <w:szCs w:val="24"/>
-        </w:rPr>
-        <w:t xml:space="preserve"> meaningfully change. This is to ensure that the net captures a broad range of the optimizer’s behavior.</w:t>
-      </w:r>
-    </w:p>
-    <w:p>
-      <w:pPr>
-        <w:spacing w:line="360" w:lineRule="auto"/>
-        <w:ind w:left="360"/>
-        <w:rPr>
-          <w:rFonts w:asciiTheme="majorBidi" w:hAnsiTheme="majorBidi" w:cstheme="majorBidi"/>
-          <w:sz w:val="24"/>
-          <w:szCs w:val="24"/>
-        </w:rPr>
-      </w:pPr>
-      <w:r>
-        <w:rPr>
-          <w:rFonts w:asciiTheme="majorBidi" w:hAnsiTheme="majorBidi" w:cstheme="majorBidi"/>
-          <w:sz w:val="24"/>
-          <w:szCs w:val="24"/>
-        </w:rPr>
-        <w:t xml:space="preserve">Figure 3: </w:t>
-      </w:r>
-      <w:r>
-        <w:rPr>
-          <w:rFonts w:asciiTheme="majorBidi" w:hAnsiTheme="majorBidi" w:cstheme="majorBidi"/>
-          <w:sz w:val="24"/>
-          <w:szCs w:val="24"/>
-        </w:rPr>
-        <w:t>Components of the initial desired load trajectory used in the first attempt. The load starts from rest, follows a linear trajectory along the x-axis, and then comes to rest at its final position.</w:t>
-      </w:r>
-      <w:r>
-        <w:rPr>
-          <w:rFonts w:asciiTheme="majorBidi" w:hAnsiTheme="majorBidi" w:cstheme="majorBidi"/>
-          <w:sz w:val="24"/>
-          <w:szCs w:val="24"/>
-        </w:rPr>
-        <w:t xml:space="preserve"> </w:t>
-      </w:r>
-    </w:p>
-    <w:p>
-      <w:pPr>
-        <w:spacing w:line="360" w:lineRule="auto"/>
-        <w:ind w:left="360"/>
-        <w:rPr>
-          <w:rFonts w:asciiTheme="majorBidi" w:hAnsiTheme="majorBidi" w:cstheme="majorBidi"/>
-          <w:sz w:val="24"/>
-          <w:szCs w:val="24"/>
-        </w:rPr>
-      </w:pPr>
-      <w:r>
-        <w:rPr>
-          <w:rFonts w:asciiTheme="majorBidi" w:hAnsiTheme="majorBidi" w:cstheme="majorBidi"/>
-          <w:sz w:val="24"/>
-          <w:szCs w:val="24"/>
-        </w:rPr>
-        <w:t>After the initial attempt proved successful and the policy was able to closely mimic the optimizer, the approach was generalized to a diverse set of trajectories, as</w:t>
-      </w:r>
-      <w:r>
-        <w:rPr>
-          <w:rFonts w:asciiTheme="majorBidi" w:hAnsiTheme="majorBidi" w:cstheme="majorBidi"/>
-          <w:sz w:val="24"/>
-          <w:szCs w:val="24"/>
-        </w:rPr>
-        <w:t xml:space="preserve"> will</w:t>
-      </w:r>
-      <w:r>
-        <w:rPr>
-          <w:rFonts w:asciiTheme="majorBidi" w:hAnsiTheme="majorBidi" w:cstheme="majorBidi"/>
-          <w:sz w:val="24"/>
-          <w:szCs w:val="24"/>
-        </w:rPr>
-        <w:t xml:space="preserve"> discussed in following</w:t>
-      </w:r>
-      <w:r>
-        <w:rPr>
-          <w:rFonts w:asciiTheme="majorBidi" w:hAnsiTheme="majorBidi" w:cstheme="majorBidi"/>
-          <w:sz w:val="24"/>
-          <w:szCs w:val="24"/>
-        </w:rPr>
-        <w:t xml:space="preserve"> sections.</w:t>
-      </w:r>
-    </w:p>
-    <w:p>
-      <w:pPr>
-        <w:spacing w:line="360" w:lineRule="auto"/>
-        <w:ind w:left="360"/>
-        <w:rPr>
-          <w:rFonts w:asciiTheme="majorBidi" w:hAnsiTheme="majorBidi" w:cstheme="majorBidi"/>
-          <w:sz w:val="24"/>
-          <w:szCs w:val="24"/>
-        </w:rPr>
-      </w:pPr>
-      <w:r>
-        <w:rPr>
-          <w:rFonts w:asciiTheme="majorBidi" w:hAnsiTheme="majorBidi" w:cstheme="majorBidi"/>
-          <w:sz w:val="24"/>
-          <w:szCs w:val="24"/>
-        </w:rPr>
-        <w:t xml:space="preserve">State/Input Design: </w:t>
-      </w:r>
-    </w:p>
-    <w:p>
-      <w:pPr>
-        <w:spacing w:line="360" w:lineRule="auto"/>
-        <w:ind w:left="360"/>
-        <w:rPr>
-          <w:rFonts w:ascii="Cambria Math" w:hAnsi="Cambria Math" w:cs="Cambria Math"/>
-          <w:kern w:val="0"/>
-          <w:sz w:val="24"/>
-          <w:szCs w:val="24"/>
-          <w14:ligatures w14:val="none"/>
-        </w:rPr>
-      </w:pPr>
-      <w:r>
-        <w:rPr>
-          <w:rFonts w:asciiTheme="majorBidi" w:hAnsiTheme="majorBidi" w:cstheme="majorBidi"/>
-          <w:sz w:val="24"/>
-          <w:szCs w:val="24"/>
-        </w:rPr>
-        <w:t xml:space="preserve">As discussed earlier, this is a critical design choice since the optimizer has many internal </w:t>
-      </w:r>
-      <w:r>
-        <w:rPr>
-          <w:rFonts w:asciiTheme="majorBidi" w:hAnsiTheme="majorBidi" w:cstheme="majorBidi"/>
-          <w:sz w:val="24"/>
-          <w:szCs w:val="24"/>
-        </w:rPr>
-        <w:t>variables</w:t>
-      </w:r>
-      <w:r>
-        <w:rPr>
-          <w:rFonts w:asciiTheme="majorBidi" w:hAnsiTheme="majorBidi" w:cstheme="majorBidi"/>
-          <w:sz w:val="24"/>
-          <w:szCs w:val="24"/>
-        </w:rPr>
-        <w:t xml:space="preserve"> and the MLP has no memory element.</w:t>
-      </w:r>
-      <w:r>
-        <w:rPr>
-          <w:rFonts w:asciiTheme="majorBidi" w:hAnsiTheme="majorBidi" w:cstheme="majorBidi"/>
-          <w:sz w:val="24"/>
-          <w:szCs w:val="24"/>
-        </w:rPr>
-        <w:t xml:space="preserve"> Furthermore, </w:t>
-      </w:r>
-      <w:r>
-        <w:rPr>
-          <w:rFonts w:ascii="Cambria Math" w:hAnsi="Cambria Math" w:cs="Cambria Math"/>
-          <w:kern w:val="0"/>
-          <w:sz w:val="24"/>
-          <w:szCs w:val="24"/>
-          <w14:ligatures w14:val="none"/>
-        </w:rPr>
-        <w:t>𝜆</w:t>
-      </w:r>
-      <w:r>
-        <w:rPr>
-          <w:rFonts w:ascii="Cambria Math" w:hAnsi="Cambria Math" w:cs="Cambria Math"/>
-          <w:kern w:val="0"/>
-          <w:sz w:val="24"/>
-          <w:szCs w:val="24"/>
-          <w14:ligatures w14:val="none"/>
-        </w:rPr>
-        <w:t xml:space="preserve"> is not just a function of these internal states </w:t>
-      </w:r>
-      <w:r>
-        <w:rPr>
-          <w:rFonts w:ascii="Cambria Math" w:hAnsi="Cambria Math" w:cs="Cambria Math"/>
-          <w:kern w:val="0"/>
-          <w:sz w:val="24"/>
-          <w:szCs w:val="24"/>
-          <w14:ligatures w14:val="none"/>
-        </w:rPr>
-        <w:t>but also a function of time. Indeed, given fixed</w:t>
-      </w:r>
-      <w:r>
-        <w:rPr>
-          <w:rFonts w:asciiTheme="majorBidi" w:hAnsiTheme="majorBidi" w:cstheme="majorBidi"/>
-          <w:sz w:val="24"/>
-          <w:szCs w:val="24"/>
-        </w:rPr>
-        <w:t xml:space="preserve"> </w:t>
-      </w:r>
-      <w:r>
-        <w:rPr>
-          <w:rFonts w:asciiTheme="majorBidi" w:hAnsiTheme="majorBidi" w:cstheme="majorBidi"/>
-          <w:sz w:val="24"/>
-          <w:szCs w:val="24"/>
-        </w:rPr>
-        <w:t>ϕ</w:t>
-      </w:r>
-      <w:r>
-        <w:rPr>
-          <w:rFonts w:asciiTheme="majorBidi" w:hAnsiTheme="majorBidi" w:cstheme="majorBidi"/>
-          <w:sz w:val="24"/>
-          <w:szCs w:val="24"/>
-        </w:rPr>
-        <w:t>,</w:t>
-      </w:r>
-      <w:r>
-        <w:rPr>
-          <w:rFonts w:ascii="Cambria Math" w:hAnsi="Cambria Math" w:cs="Cambria Math"/>
-          <w:kern w:val="0"/>
-          <w:sz w:val="24"/>
-          <w:szCs w:val="24"/>
-          <w14:ligatures w14:val="none"/>
-        </w:rPr>
-        <w:t xml:space="preserve"> </w:t>
-      </w:r>
-      <w:r>
-        <w:rPr>
-          <w:rFonts w:ascii="Cambria Math" w:hAnsi="Cambria Math" w:cs="Cambria Math"/>
-          <w:sz w:val="24"/>
-          <w:szCs w:val="24"/>
-        </w:rPr>
-        <w:t>ξ and A</w:t>
-      </w:r>
-      <w:r>
-        <w:rPr>
-          <w:rFonts w:ascii="Cambria Math" w:hAnsi="Cambria Math" w:cs="Cambria Math"/>
-          <w:sz w:val="24"/>
-          <w:szCs w:val="24"/>
-        </w:rPr>
-        <w:t>, 𝜆</w:t>
-      </w:r>
-      <w:r>
-        <w:rPr>
-          <w:rFonts w:ascii="Cambria Math" w:hAnsi="Cambria Math" w:cs="Cambria Math"/>
-          <w:kern w:val="0"/>
-          <w:sz w:val="24"/>
-          <w:szCs w:val="24"/>
-          <w14:ligatures w14:val="none"/>
-        </w:rPr>
-        <w:t xml:space="preserve"> is still time varying since it is a sinusoid eq. (17). </w:t>
-      </w:r>
-    </w:p>
-    <w:p>
-      <w:pPr>
-        <w:spacing w:line="360" w:lineRule="auto"/>
-        <w:ind w:left="360"/>
-        <w:rPr>
-          <w:rFonts w:ascii="Cambria Math" w:hAnsi="Cambria Math" w:cs="Cambria Math"/>
-          <w:kern w:val="0"/>
-          <w:sz w:val="24"/>
-          <w:szCs w:val="24"/>
-          <w14:ligatures w14:val="none"/>
-        </w:rPr>
-      </w:pPr>
-      <w:r>
-        <w:rPr>
-          <w:rFonts w:ascii="Cambria Math" w:hAnsi="Cambria Math" w:cs="Cambria Math"/>
-          <w:kern w:val="0"/>
-          <w:sz w:val="24"/>
-          <w:szCs w:val="24"/>
-          <w14:ligatures w14:val="none"/>
-        </w:rPr>
-        <w:t xml:space="preserve">We can generally split the variables that </w:t>
-      </w:r>
-      <w:r>
-        <w:rPr>
-          <w:rFonts w:ascii="Cambria Math" w:hAnsi="Cambria Math" w:cs="Cambria Math"/>
-          <w:kern w:val="0"/>
-          <w:sz w:val="24"/>
-          <w:szCs w:val="24"/>
-          <w14:ligatures w14:val="none"/>
-        </w:rPr>
-        <w:t>𝜆</w:t>
-      </w:r>
-      <w:r>
-        <w:rPr>
-          <w:rFonts w:ascii="Cambria Math" w:hAnsi="Cambria Math" w:cs="Cambria Math"/>
+          <w:rFonts w:asciiTheme="majorBidi" w:hAnsiTheme="majorBidi" w:cstheme="majorBidi"/>
           <w:kern w:val="0"/>
           <w:sz w:val="24"/>
           <w:szCs w:val="24"/>
@@ -7794,7 +7513,7 @@
       </w:r>
       <w:r>
         <w:rPr>
-          <w:rFonts w:ascii="Cambria Math" w:hAnsi="Cambria Math" w:cs="Cambria Math"/>
+          <w:rFonts w:asciiTheme="majorBidi" w:hAnsiTheme="majorBidi" w:cstheme="majorBidi"/>
           <w:kern w:val="0"/>
           <w:sz w:val="24"/>
           <w:szCs w:val="24"/>
@@ -7804,7 +7523,7 @@
       </w:r>
       <w:r>
         <w:rPr>
-          <w:rFonts w:ascii="Cambria Math" w:hAnsi="Cambria Math" w:cs="Cambria Math"/>
+          <w:rFonts w:asciiTheme="majorBidi" w:hAnsiTheme="majorBidi" w:cstheme="majorBidi"/>
           <w:kern w:val="0"/>
           <w:sz w:val="24"/>
           <w:szCs w:val="24"/>
@@ -7829,13 +7548,12 @@
       </w:pPr>
       <w:r>
         <w:rPr>
-          <w:rFonts w:ascii="Cambria Math" w:hAnsi="Cambria Math" w:cs="Cambria Math"/>
-          <w:kern w:val="0"/>
-          <w:sz w:val="24"/>
-          <w:szCs w:val="24"/>
-          <w14:ligatures w14:val="none"/>
-        </w:rPr>
-        <w:lastRenderedPageBreak/>
+          <w:rFonts w:asciiTheme="majorBidi" w:hAnsiTheme="majorBidi" w:cstheme="majorBidi"/>
+          <w:kern w:val="0"/>
+          <w:sz w:val="24"/>
+          <w:szCs w:val="24"/>
+          <w14:ligatures w14:val="none"/>
+        </w:rPr>
         <w:t xml:space="preserve">Time: in order to build the sinusoid after determining all the internal variables. </w:t>
       </w:r>
     </w:p>
@@ -7844,42 +7562,22 @@
         <w:spacing w:before="100" w:beforeAutospacing="1" w:after="100" w:afterAutospacing="1" w:line="240" w:lineRule="auto"/>
         <w:ind w:firstLine="360"/>
         <w:rPr>
-          <w:rFonts w:ascii="Times New Roman" w:eastAsia="Times New Roman" w:hAnsi="Times New Roman" w:cs="Times New Roman"/>
-          <w:kern w:val="0"/>
-          <w:sz w:val="24"/>
-          <w:szCs w:val="24"/>
-          <w14:ligatures w14:val="none"/>
-        </w:rPr>
-      </w:pPr>
-      <w:r>
-        <w:rPr>
-          <w:rFonts w:ascii="Times New Roman" w:eastAsia="Times New Roman" w:hAnsi="Times New Roman" w:cs="Times New Roman"/>
-          <w:kern w:val="0"/>
-          <w:sz w:val="24"/>
-          <w:szCs w:val="24"/>
-          <w14:ligatures w14:val="none"/>
-        </w:rPr>
-        <w:t>We discuss each o</w:t>
-      </w:r>
-      <w:r>
-        <w:rPr>
-          <w:rFonts w:ascii="Times New Roman" w:eastAsia="Times New Roman" w:hAnsi="Times New Roman" w:cs="Times New Roman"/>
-          <w:kern w:val="0"/>
-          <w:sz w:val="24"/>
-          <w:szCs w:val="24"/>
-          <w14:ligatures w14:val="none"/>
-        </w:rPr>
-        <w:t>f them in turn in the remainder of this sub</w:t>
-      </w:r>
-      <w:r>
-        <w:rPr>
-          <w:rFonts w:ascii="Times New Roman" w:eastAsia="Times New Roman" w:hAnsi="Times New Roman" w:cs="Times New Roman"/>
-          <w:kern w:val="0"/>
-          <w:sz w:val="24"/>
-          <w:szCs w:val="24"/>
-          <w14:ligatures w14:val="none"/>
-        </w:rPr>
-        <w:t>section.</w:t>
+          <w:rFonts w:asciiTheme="majorBidi" w:eastAsia="Times New Roman" w:hAnsiTheme="majorBidi" w:cstheme="majorBidi"/>
+          <w:kern w:val="0"/>
+          <w:sz w:val="24"/>
+          <w:szCs w:val="24"/>
+          <w14:ligatures w14:val="none"/>
+        </w:rPr>
+      </w:pPr>
+      <w:r>
+        <w:rPr>
+          <w:rFonts w:asciiTheme="majorBidi" w:eastAsia="Times New Roman" w:hAnsiTheme="majorBidi" w:cstheme="majorBidi"/>
+          <w:kern w:val="0"/>
+          <w:sz w:val="24"/>
+          <w:szCs w:val="24"/>
+          <w14:ligatures w14:val="none"/>
+        </w:rPr>
+        <w:t>We discuss each of them in turn in the remainder of this subsection.</w:t>
       </w:r>
     </w:p>
     <w:p>
@@ -7887,576 +7585,2513 @@
         <w:spacing w:before="100" w:beforeAutospacing="1" w:after="100" w:afterAutospacing="1" w:line="240" w:lineRule="auto"/>
         <w:ind w:firstLine="360"/>
         <w:rPr>
+          <w:rFonts w:asciiTheme="majorBidi" w:eastAsia="Times New Roman" w:hAnsiTheme="majorBidi" w:cstheme="majorBidi"/>
+          <w:kern w:val="0"/>
+          <w:sz w:val="24"/>
+          <w:szCs w:val="24"/>
+          <w14:ligatures w14:val="none"/>
+        </w:rPr>
+      </w:pPr>
+      <w:r>
+        <w:rPr>
+          <w:rFonts w:asciiTheme="majorBidi" w:hAnsiTheme="majorBidi" w:cstheme="majorBidi"/>
+          <w:sz w:val="24"/>
+          <w:szCs w:val="24"/>
+        </w:rPr>
+        <w:lastRenderedPageBreak/>
+        <w:t>Physical system states</w:t>
+      </w:r>
+      <w:r>
+        <w:rPr>
+          <w:rFonts w:asciiTheme="majorBidi" w:hAnsiTheme="majorBidi" w:cstheme="majorBidi"/>
+          <w:sz w:val="24"/>
+          <w:szCs w:val="24"/>
+        </w:rPr>
+        <w:t>:</w:t>
+      </w:r>
+    </w:p>
+    <w:p>
+      <w:pPr>
+        <w:spacing w:line="360" w:lineRule="auto"/>
+        <w:ind w:left="360"/>
+        <w:rPr>
+          <w:rFonts w:asciiTheme="majorBidi" w:hAnsiTheme="majorBidi" w:cstheme="majorBidi"/>
+          <w:sz w:val="24"/>
+          <w:szCs w:val="24"/>
+        </w:rPr>
+      </w:pPr>
+      <w:r>
+        <w:rPr>
+          <w:rFonts w:asciiTheme="majorBidi" w:hAnsiTheme="majorBidi" w:cstheme="majorBidi"/>
+          <w:sz w:val="24"/>
+          <w:szCs w:val="24"/>
+        </w:rPr>
+        <w:t>Naturally,</w:t>
+      </w:r>
+      <w:r>
+        <w:rPr>
+          <w:rFonts w:asciiTheme="majorBidi" w:hAnsiTheme="majorBidi" w:cstheme="majorBidi"/>
+          <w:sz w:val="24"/>
+          <w:szCs w:val="24"/>
+        </w:rPr>
+        <w:t xml:space="preserve"> </w:t>
+      </w:r>
+      <w:r>
+        <w:rPr>
+          <w:rFonts w:asciiTheme="majorBidi" w:hAnsiTheme="majorBidi" w:cstheme="majorBidi"/>
+          <w:sz w:val="24"/>
+          <w:szCs w:val="24"/>
+        </w:rPr>
+        <w:t xml:space="preserve">the reconstructed velocities of the carriers </w:t>
+      </w:r>
+      <w:r>
+        <w:rPr>
+          <w:rFonts w:asciiTheme="majorBidi" w:hAnsiTheme="majorBidi" w:cstheme="majorBidi"/>
+          <w:sz w:val="24"/>
+          <w:szCs w:val="24"/>
+        </w:rPr>
+        <w:t>p˙Ri</w:t>
+      </w:r>
+      <w:r>
+        <w:rPr>
+          <w:rFonts w:asciiTheme="majorBidi" w:hAnsiTheme="majorBidi" w:cstheme="majorBidi"/>
+          <w:sz w:val="24"/>
+          <w:szCs w:val="24"/>
+        </w:rPr>
+        <w:t xml:space="preserve"> , i = 1, … , n are a going to be part of the state. For our particular implementation we chose n = 4, so the first part of our state is p˙R1,2,3,4 </w:t>
+      </w:r>
+      <w:r>
+        <w:rPr>
+          <w:rFonts w:ascii="Cambria Math" w:hAnsi="Cambria Math" w:cs="Cambria Math"/>
+          <w:sz w:val="24"/>
+          <w:szCs w:val="24"/>
+        </w:rPr>
+        <w:t>∈</w:t>
+      </w:r>
+      <w:r>
+        <w:rPr>
+          <w:rFonts w:asciiTheme="majorBidi" w:hAnsiTheme="majorBidi" w:cstheme="majorBidi"/>
+          <w:sz w:val="24"/>
+          <w:szCs w:val="24"/>
+        </w:rPr>
+        <w:t xml:space="preserve"> R12 i.e. the carrier velocity vectors stacked. </w:t>
+      </w:r>
+      <w:r>
+        <w:rPr>
+          <w:rFonts w:asciiTheme="majorBidi" w:hAnsiTheme="majorBidi" w:cstheme="majorBidi"/>
+          <w:sz w:val="24"/>
+          <w:szCs w:val="24"/>
+        </w:rPr>
+        <w:t>While technically only the velocity norms are needed, the whole vectors were provided</w:t>
+      </w:r>
+      <w:r>
+        <w:rPr>
+          <w:rFonts w:asciiTheme="majorBidi" w:hAnsiTheme="majorBidi" w:cstheme="majorBidi"/>
+          <w:sz w:val="24"/>
+          <w:szCs w:val="24"/>
+        </w:rPr>
+        <w:t xml:space="preserve"> thus increasing</w:t>
+      </w:r>
+      <w:r>
+        <w:rPr>
+          <w:rFonts w:asciiTheme="majorBidi" w:hAnsiTheme="majorBidi" w:cstheme="majorBidi"/>
+          <w:sz w:val="24"/>
+          <w:szCs w:val="24"/>
+        </w:rPr>
+        <w:t xml:space="preserve"> the information available to the MLP</w:t>
+      </w:r>
+      <w:r>
+        <w:rPr>
+          <w:rFonts w:asciiTheme="majorBidi" w:hAnsiTheme="majorBidi" w:cstheme="majorBidi"/>
+          <w:sz w:val="24"/>
+          <w:szCs w:val="24"/>
+        </w:rPr>
+        <w:t xml:space="preserve"> and </w:t>
+      </w:r>
+      <w:r>
+        <w:rPr>
+          <w:rFonts w:asciiTheme="majorBidi" w:hAnsiTheme="majorBidi" w:cstheme="majorBidi"/>
+          <w:sz w:val="24"/>
+          <w:szCs w:val="24"/>
+          <w:lang w:bidi="ar-EG"/>
+        </w:rPr>
+        <w:t>allowing</w:t>
+      </w:r>
+      <w:r>
+        <w:rPr>
+          <w:rFonts w:asciiTheme="majorBidi" w:hAnsiTheme="majorBidi" w:cstheme="majorBidi"/>
+          <w:sz w:val="24"/>
+          <w:szCs w:val="24"/>
+        </w:rPr>
+        <w:t xml:space="preserve"> it to</w:t>
+      </w:r>
+      <w:r>
+        <w:rPr>
+          <w:rFonts w:asciiTheme="majorBidi" w:hAnsiTheme="majorBidi" w:cstheme="majorBidi"/>
+          <w:sz w:val="24"/>
+          <w:szCs w:val="24"/>
+        </w:rPr>
+        <w:t xml:space="preserve"> calculate the norm </w:t>
+      </w:r>
+      <w:r>
+        <w:rPr>
+          <w:rFonts w:asciiTheme="majorBidi" w:hAnsiTheme="majorBidi" w:cstheme="majorBidi"/>
+          <w:sz w:val="24"/>
+          <w:szCs w:val="24"/>
+        </w:rPr>
+        <w:t xml:space="preserve">internally. </w:t>
+      </w:r>
+    </w:p>
+    <w:p>
+      <w:pPr>
+        <w:spacing w:line="360" w:lineRule="auto"/>
+        <w:ind w:left="360"/>
+        <w:rPr>
+          <w:rFonts w:asciiTheme="majorBidi" w:hAnsiTheme="majorBidi" w:cstheme="majorBidi"/>
+          <w:sz w:val="24"/>
+          <w:szCs w:val="24"/>
+        </w:rPr>
+      </w:pPr>
+      <w:r>
+        <w:rPr>
+          <w:rFonts w:asciiTheme="majorBidi" w:hAnsiTheme="majorBidi" w:cstheme="majorBidi"/>
+          <w:sz w:val="24"/>
+          <w:szCs w:val="24"/>
+        </w:rPr>
+        <w:t>Internal variables</w:t>
+      </w:r>
+      <w:r>
+        <w:rPr>
+          <w:rFonts w:asciiTheme="majorBidi" w:hAnsiTheme="majorBidi" w:cstheme="majorBidi"/>
+          <w:sz w:val="24"/>
+          <w:szCs w:val="24"/>
+        </w:rPr>
+        <w:t>:</w:t>
+      </w:r>
+    </w:p>
+    <w:p>
+      <w:pPr>
+        <w:spacing w:line="360" w:lineRule="auto"/>
+        <w:ind w:left="360"/>
+        <w:rPr>
+          <w:rFonts w:asciiTheme="majorBidi" w:hAnsiTheme="majorBidi" w:cstheme="majorBidi"/>
+          <w:kern w:val="0"/>
+          <w:sz w:val="24"/>
+          <w:szCs w:val="24"/>
+          <w14:ligatures w14:val="none"/>
+        </w:rPr>
+      </w:pPr>
+      <w:r>
+        <w:rPr>
+          <w:rFonts w:asciiTheme="majorBidi" w:hAnsiTheme="majorBidi" w:cstheme="majorBidi"/>
+          <w:sz w:val="24"/>
+          <w:szCs w:val="24"/>
+        </w:rPr>
+        <w:t>T</w:t>
+      </w:r>
+      <w:r>
+        <w:rPr>
+          <w:rFonts w:asciiTheme="majorBidi" w:hAnsiTheme="majorBidi" w:cstheme="majorBidi"/>
+          <w:sz w:val="24"/>
+          <w:szCs w:val="24"/>
+        </w:rPr>
+        <w:t>he phase shifts</w:t>
+      </w:r>
+      <w:r>
+        <w:rPr>
+          <w:rFonts w:asciiTheme="majorBidi" w:hAnsiTheme="majorBidi" w:cstheme="majorBidi"/>
+          <w:kern w:val="0"/>
+          <w:sz w:val="24"/>
+          <w:szCs w:val="24"/>
+          <w14:ligatures w14:val="none"/>
+        </w:rPr>
+        <w:t xml:space="preserve"> </w:t>
+      </w:r>
+      <w:r>
+        <w:rPr>
+          <w:rFonts w:asciiTheme="majorBidi" w:hAnsiTheme="majorBidi" w:cstheme="majorBidi"/>
+          <w:kern w:val="0"/>
+          <w:sz w:val="24"/>
+          <w:szCs w:val="24"/>
+          <w14:ligatures w14:val="none"/>
+        </w:rPr>
+        <w:t>ϕ</w:t>
+      </w:r>
+      <w:r>
+        <w:rPr>
+          <w:rFonts w:asciiTheme="majorBidi" w:hAnsiTheme="majorBidi" w:cstheme="majorBidi"/>
+          <w:kern w:val="0"/>
+          <w:sz w:val="24"/>
+          <w:szCs w:val="24"/>
+          <w14:ligatures w14:val="none"/>
+        </w:rPr>
+        <w:t>i, i =</w:t>
+      </w:r>
+      <w:r>
+        <w:rPr>
+          <w:rFonts w:asciiTheme="majorBidi" w:hAnsiTheme="majorBidi" w:cstheme="majorBidi"/>
+          <w:sz w:val="24"/>
+          <w:szCs w:val="24"/>
+        </w:rPr>
+        <w:t xml:space="preserve"> </w:t>
+      </w:r>
+      <w:r>
+        <w:rPr>
+          <w:rFonts w:asciiTheme="majorBidi" w:hAnsiTheme="majorBidi" w:cstheme="majorBidi"/>
+          <w:sz w:val="24"/>
+          <w:szCs w:val="24"/>
+        </w:rPr>
+        <w:t xml:space="preserve">1,2,3,4 </w:t>
+      </w:r>
+      <w:r>
+        <w:rPr>
+          <w:rFonts w:asciiTheme="majorBidi" w:hAnsiTheme="majorBidi" w:cstheme="majorBidi"/>
+          <w:sz w:val="24"/>
+          <w:szCs w:val="24"/>
+        </w:rPr>
+        <w:t>are constant for a given configuration</w:t>
+      </w:r>
+      <w:r>
+        <w:rPr>
+          <w:rFonts w:asciiTheme="majorBidi" w:hAnsiTheme="majorBidi" w:cstheme="majorBidi"/>
+          <w:sz w:val="24"/>
+          <w:szCs w:val="24"/>
+        </w:rPr>
+        <w:t xml:space="preserve"> and therefore can be memorized</w:t>
+      </w:r>
+      <w:r>
+        <w:rPr>
+          <w:rFonts w:asciiTheme="majorBidi" w:hAnsiTheme="majorBidi" w:cstheme="majorBidi"/>
+          <w:sz w:val="24"/>
+          <w:szCs w:val="24"/>
+        </w:rPr>
+        <w:t xml:space="preserve">. </w:t>
+      </w:r>
+      <w:r>
+        <w:rPr>
+          <w:rFonts w:asciiTheme="majorBidi" w:hAnsiTheme="majorBidi" w:cstheme="majorBidi"/>
+          <w:sz w:val="24"/>
+          <w:szCs w:val="24"/>
+        </w:rPr>
+        <w:t xml:space="preserve">On the other hand, </w:t>
+      </w:r>
+      <w:r>
+        <w:rPr>
+          <w:rFonts w:asciiTheme="majorBidi" w:hAnsiTheme="majorBidi" w:cstheme="majorBidi"/>
+          <w:sz w:val="24"/>
+          <w:szCs w:val="24"/>
+        </w:rPr>
+        <w:t>ξ(t) and A(t)</w:t>
+      </w:r>
+      <w:r>
+        <w:rPr>
+          <w:rFonts w:asciiTheme="majorBidi" w:hAnsiTheme="majorBidi" w:cstheme="majorBidi"/>
+          <w:sz w:val="24"/>
+          <w:szCs w:val="24"/>
+        </w:rPr>
+        <w:t xml:space="preserve"> are variable </w:t>
+      </w:r>
+      <w:r>
+        <w:rPr>
+          <w:rFonts w:asciiTheme="majorBidi" w:hAnsiTheme="majorBidi" w:cstheme="majorBidi"/>
+          <w:sz w:val="24"/>
+          <w:szCs w:val="24"/>
+        </w:rPr>
+        <w:t>and depend on t</w:t>
+      </w:r>
+      <w:r>
+        <w:rPr>
+          <w:rFonts w:asciiTheme="majorBidi" w:hAnsiTheme="majorBidi" w:cstheme="majorBidi"/>
+          <w:sz w:val="24"/>
+          <w:szCs w:val="24"/>
+          <w:lang w:bidi="ar-EG"/>
+        </w:rPr>
+        <w:t xml:space="preserve">heir previous value </w:t>
+      </w:r>
+      <w:r>
+        <w:rPr>
+          <w:rFonts w:asciiTheme="majorBidi" w:hAnsiTheme="majorBidi" w:cstheme="majorBidi"/>
+          <w:sz w:val="24"/>
+          <w:szCs w:val="24"/>
+        </w:rPr>
+        <w:t xml:space="preserve">and the carrier velocity norms. Since the initial value for them in the optimizer is constant, a reasonable assumption would be that the network can memorize them if they remain unchanged. But since they only change based on the carrier velocities (which are provided to the policy), the policy can just memorize the initial condition and learn to change them similar to the optimizer </w:t>
+      </w:r>
+      <w:r>
+        <w:rPr>
+          <w:rFonts w:asciiTheme="majorBidi" w:hAnsiTheme="majorBidi" w:cstheme="majorBidi"/>
+          <w:sz w:val="24"/>
+          <w:szCs w:val="24"/>
+        </w:rPr>
+        <w:t xml:space="preserve">conditioned on the velocity norms. The challenge is MLPs don’t have any memory or internal state. Consequently, if the policy learns to change </w:t>
+      </w:r>
+      <w:r>
+        <w:rPr>
+          <w:rFonts w:asciiTheme="majorBidi" w:hAnsiTheme="majorBidi" w:cstheme="majorBidi"/>
+          <w:sz w:val="24"/>
+          <w:szCs w:val="24"/>
+        </w:rPr>
+        <w:t>ξ(t) and A(t)</w:t>
+      </w:r>
+      <w:r>
+        <w:rPr>
+          <w:rFonts w:asciiTheme="majorBidi" w:hAnsiTheme="majorBidi" w:cstheme="majorBidi"/>
+          <w:sz w:val="24"/>
+          <w:szCs w:val="24"/>
+        </w:rPr>
+        <w:t xml:space="preserve"> in a given step based on its input and what the expert action was by the next step it will have no memory of this and will fall back to the default/initial </w:t>
+      </w:r>
+      <w:r>
+        <w:rPr>
+          <w:rFonts w:asciiTheme="majorBidi" w:hAnsiTheme="majorBidi" w:cstheme="majorBidi"/>
+          <w:sz w:val="24"/>
+          <w:szCs w:val="24"/>
+        </w:rPr>
+        <w:t>ξ(t) and A(t)</w:t>
+      </w:r>
+      <w:r>
+        <w:rPr>
+          <w:rFonts w:asciiTheme="majorBidi" w:hAnsiTheme="majorBidi" w:cstheme="majorBidi"/>
+          <w:sz w:val="24"/>
+          <w:szCs w:val="24"/>
+        </w:rPr>
+        <w:t xml:space="preserve"> that structurally memorized. A reasonable remedy would be to supply the policy’s last action as part of the current state/input. So </w:t>
+      </w:r>
+      <w:r>
+        <w:rPr>
+          <w:rFonts w:asciiTheme="majorBidi" w:hAnsiTheme="majorBidi" w:cstheme="majorBidi"/>
+          <w:sz w:val="24"/>
+          <w:szCs w:val="24"/>
+        </w:rPr>
+        <w:t xml:space="preserve">a(t) </w:t>
+      </w:r>
+      <w:r>
+        <w:rPr>
+          <w:rFonts w:ascii="Cambria Math" w:hAnsi="Cambria Math" w:cs="Cambria Math"/>
+          <w:sz w:val="24"/>
+          <w:szCs w:val="24"/>
+        </w:rPr>
+        <w:t>∈</w:t>
+      </w:r>
+      <w:r>
+        <w:rPr>
+          <w:rFonts w:asciiTheme="majorBidi" w:hAnsiTheme="majorBidi" w:cstheme="majorBidi"/>
+          <w:sz w:val="24"/>
+          <w:szCs w:val="24"/>
+        </w:rPr>
+        <w:t xml:space="preserve"> s(t+1) or in our case </w:t>
+      </w:r>
+      <w:r>
+        <w:rPr>
+          <w:rFonts w:ascii="Cambria Math" w:hAnsi="Cambria Math" w:cs="Cambria Math"/>
+          <w:kern w:val="0"/>
+          <w:sz w:val="24"/>
+          <w:szCs w:val="24"/>
+          <w14:ligatures w14:val="none"/>
+        </w:rPr>
+        <w:t>𝜆</w:t>
+      </w:r>
+      <w:r>
+        <w:rPr>
+          <w:rFonts w:asciiTheme="majorBidi" w:hAnsiTheme="majorBidi" w:cstheme="majorBidi"/>
+          <w:kern w:val="0"/>
+          <w:sz w:val="24"/>
+          <w:szCs w:val="24"/>
+          <w14:ligatures w14:val="none"/>
+        </w:rPr>
+        <w:t xml:space="preserve">(t) </w:t>
+      </w:r>
+      <w:r>
+        <w:rPr>
+          <w:rFonts w:ascii="Cambria Math" w:hAnsi="Cambria Math" w:cs="Cambria Math"/>
+          <w:kern w:val="0"/>
+          <w:sz w:val="24"/>
+          <w:szCs w:val="24"/>
+          <w14:ligatures w14:val="none"/>
+        </w:rPr>
+        <w:t>∈</w:t>
+      </w:r>
+      <w:r>
+        <w:rPr>
+          <w:rFonts w:asciiTheme="majorBidi" w:hAnsiTheme="majorBidi" w:cstheme="majorBidi"/>
+          <w:kern w:val="0"/>
+          <w:sz w:val="24"/>
+          <w:szCs w:val="24"/>
+          <w14:ligatures w14:val="none"/>
+        </w:rPr>
+        <w:t xml:space="preserve"> s(t+1)</w:t>
+      </w:r>
+      <w:r>
+        <w:rPr>
+          <w:rFonts w:asciiTheme="majorBidi" w:hAnsiTheme="majorBidi" w:cstheme="majorBidi"/>
+          <w:kern w:val="0"/>
+          <w:sz w:val="24"/>
+          <w:szCs w:val="24"/>
+          <w14:ligatures w14:val="none"/>
+        </w:rPr>
+        <w:t xml:space="preserve">. </w:t>
+      </w:r>
+    </w:p>
+    <w:p>
+      <w:pPr>
+        <w:spacing w:line="360" w:lineRule="auto"/>
+        <w:ind w:left="360"/>
+        <w:rPr>
+          <w:rFonts w:asciiTheme="majorBidi" w:hAnsiTheme="majorBidi" w:cstheme="majorBidi"/>
+          <w:sz w:val="24"/>
+          <w:szCs w:val="24"/>
+        </w:rPr>
+      </w:pPr>
+      <w:r>
+        <w:rPr>
+          <w:rFonts w:asciiTheme="majorBidi" w:hAnsiTheme="majorBidi" w:cstheme="majorBidi"/>
+          <w:kern w:val="0"/>
+          <w:sz w:val="24"/>
+          <w:szCs w:val="24"/>
+          <w14:ligatures w14:val="none"/>
+        </w:rPr>
+        <w:t xml:space="preserve">For learning a single trajectory, this proved to be </w:t>
+      </w:r>
+      <w:r>
+        <w:rPr>
+          <w:rFonts w:asciiTheme="majorBidi" w:hAnsiTheme="majorBidi" w:cstheme="majorBidi"/>
+          <w:kern w:val="0"/>
+          <w:sz w:val="24"/>
+          <w:szCs w:val="24"/>
+          <w14:ligatures w14:val="none"/>
+        </w:rPr>
+        <w:t xml:space="preserve">sufficient. However, during </w:t>
+      </w:r>
+      <w:r>
+        <w:rPr>
+          <w:rFonts w:asciiTheme="majorBidi" w:hAnsiTheme="majorBidi" w:cstheme="majorBidi"/>
+          <w:kern w:val="0"/>
+          <w:sz w:val="24"/>
+          <w:szCs w:val="24"/>
+          <w14:ligatures w14:val="none"/>
+        </w:rPr>
+        <w:t>generalization it was not enough</w:t>
+      </w:r>
+      <w:r>
+        <w:rPr>
+          <w:rFonts w:asciiTheme="majorBidi" w:hAnsiTheme="majorBidi" w:cstheme="majorBidi"/>
+          <w:kern w:val="0"/>
+          <w:sz w:val="24"/>
+          <w:szCs w:val="24"/>
+          <w14:ligatures w14:val="none"/>
+        </w:rPr>
+        <w:t xml:space="preserve"> and the policy was not able to accurately mimic the optimizer</w:t>
+      </w:r>
+      <w:r>
+        <w:rPr>
+          <w:rFonts w:asciiTheme="majorBidi" w:hAnsiTheme="majorBidi" w:cstheme="majorBidi"/>
+          <w:kern w:val="0"/>
+          <w:sz w:val="24"/>
+          <w:szCs w:val="24"/>
+          <w14:ligatures w14:val="none"/>
+        </w:rPr>
+        <w:t>. By analyzing it</w:t>
+      </w:r>
+      <w:r>
+        <w:rPr>
+          <w:rFonts w:asciiTheme="majorBidi" w:hAnsiTheme="majorBidi" w:cstheme="majorBidi"/>
+          <w:kern w:val="0"/>
+          <w:sz w:val="24"/>
+          <w:szCs w:val="24"/>
+          <w14:ligatures w14:val="none"/>
+        </w:rPr>
+        <w:t>s failure mode and the underlying causes</w:t>
+      </w:r>
+      <w:r>
+        <w:rPr>
+          <w:rFonts w:asciiTheme="majorBidi" w:hAnsiTheme="majorBidi" w:cstheme="majorBidi"/>
+          <w:kern w:val="0"/>
+          <w:sz w:val="24"/>
+          <w:szCs w:val="24"/>
+          <w14:ligatures w14:val="none"/>
+        </w:rPr>
+        <w:t xml:space="preserve">, more history information </w:t>
+      </w:r>
+      <w:r>
+        <w:rPr>
+          <w:rFonts w:asciiTheme="majorBidi" w:hAnsiTheme="majorBidi" w:cstheme="majorBidi"/>
+          <w:kern w:val="0"/>
+          <w:sz w:val="24"/>
+          <w:szCs w:val="24"/>
+          <w14:ligatures w14:val="none"/>
+        </w:rPr>
+        <w:t>was determined</w:t>
+      </w:r>
+      <w:r>
+        <w:rPr>
+          <w:rFonts w:asciiTheme="majorBidi" w:hAnsiTheme="majorBidi" w:cstheme="majorBidi"/>
+          <w:kern w:val="0"/>
+          <w:sz w:val="24"/>
+          <w:szCs w:val="24"/>
+          <w14:ligatures w14:val="none"/>
+        </w:rPr>
+        <w:t xml:space="preserve"> to be necessary (will be discussed in detail in the results section). As a result, instead of just supplying the last </w:t>
+      </w:r>
+      <w:r>
+        <w:rPr>
+          <w:rFonts w:ascii="Cambria Math" w:hAnsi="Cambria Math" w:cs="Cambria Math"/>
+          <w:kern w:val="0"/>
+          <w:sz w:val="24"/>
+          <w:szCs w:val="24"/>
+          <w14:ligatures w14:val="none"/>
+        </w:rPr>
+        <w:t>𝜆</w:t>
+      </w:r>
+      <w:r>
+        <w:rPr>
+          <w:rFonts w:asciiTheme="majorBidi" w:hAnsiTheme="majorBidi" w:cstheme="majorBidi"/>
+          <w:kern w:val="0"/>
+          <w:sz w:val="24"/>
+          <w:szCs w:val="24"/>
+          <w14:ligatures w14:val="none"/>
+        </w:rPr>
+        <w:t xml:space="preserve"> </w:t>
+      </w:r>
+      <w:r>
+        <w:rPr>
+          <w:rFonts w:asciiTheme="majorBidi" w:hAnsiTheme="majorBidi" w:cstheme="majorBidi"/>
+          <w:kern w:val="0"/>
+          <w:sz w:val="24"/>
+          <w:szCs w:val="24"/>
+          <w14:ligatures w14:val="none"/>
+        </w:rPr>
+        <w:t>as an input to the next time step, log-spaced point taps (λ at lags 1, 2, 4</w:t>
+      </w:r>
+      <w:r>
+        <w:rPr>
+          <w:rFonts w:asciiTheme="majorBidi" w:hAnsiTheme="majorBidi" w:cstheme="majorBidi"/>
+          <w:kern w:val="0"/>
+          <w:sz w:val="24"/>
+          <w:szCs w:val="24"/>
+          <w14:ligatures w14:val="none"/>
+        </w:rPr>
+        <w:t>, 8, 16, 32, 64, 128, 198</w:t>
+      </w:r>
+      <w:r>
+        <w:rPr>
+          <w:rFonts w:asciiTheme="majorBidi" w:hAnsiTheme="majorBidi" w:cstheme="majorBidi"/>
+          <w:kern w:val="0"/>
+          <w:sz w:val="24"/>
+          <w:szCs w:val="24"/>
+          <w14:ligatures w14:val="none"/>
+        </w:rPr>
+        <w:t xml:space="preserve">, </w:t>
+      </w:r>
+      <w:r>
+        <w:rPr>
+          <w:rFonts w:asciiTheme="majorBidi" w:hAnsiTheme="majorBidi" w:cstheme="majorBidi"/>
+          <w:kern w:val="0"/>
+          <w:sz w:val="24"/>
+          <w:szCs w:val="24"/>
+          <w14:ligatures w14:val="none"/>
+        </w:rPr>
+        <w:t>256 steps)</w:t>
+      </w:r>
+      <w:r>
+        <w:rPr>
+          <w:rFonts w:asciiTheme="majorBidi" w:hAnsiTheme="majorBidi" w:cstheme="majorBidi"/>
+          <w:kern w:val="0"/>
+          <w:sz w:val="24"/>
+          <w:szCs w:val="24"/>
+          <w14:ligatures w14:val="none"/>
+        </w:rPr>
+        <w:t xml:space="preserve"> were used.</w:t>
+      </w:r>
+      <w:r>
+        <w:rPr>
+          <w:rFonts w:asciiTheme="majorBidi" w:hAnsiTheme="majorBidi" w:cstheme="majorBidi"/>
+          <w:kern w:val="0"/>
+          <w:sz w:val="24"/>
+          <w:szCs w:val="24"/>
+          <w14:ligatures w14:val="none"/>
+        </w:rPr>
+        <w:t xml:space="preserve"> </w:t>
+      </w:r>
+    </w:p>
+    <w:p>
+      <w:pPr>
+        <w:spacing w:line="360" w:lineRule="auto"/>
+        <w:ind w:left="360"/>
+        <w:rPr>
+          <w:rFonts w:asciiTheme="majorBidi" w:hAnsiTheme="majorBidi" w:cstheme="majorBidi"/>
+          <w:sz w:val="24"/>
+          <w:szCs w:val="24"/>
+        </w:rPr>
+      </w:pPr>
+      <w:r>
+        <w:rPr>
+          <w:rFonts w:asciiTheme="majorBidi" w:hAnsiTheme="majorBidi" w:cstheme="majorBidi"/>
+          <w:sz w:val="24"/>
+          <w:szCs w:val="24"/>
+        </w:rPr>
+        <w:t xml:space="preserve">This technique means we need to provide multiple historical </w:t>
+      </w:r>
+      <w:r>
+        <w:rPr>
+          <w:rFonts w:ascii="Cambria Math" w:hAnsi="Cambria Math" w:cs="Cambria Math"/>
+          <w:kern w:val="0"/>
+          <w:sz w:val="24"/>
+          <w:szCs w:val="24"/>
+          <w14:ligatures w14:val="none"/>
+        </w:rPr>
+        <w:t>𝜆</w:t>
+      </w:r>
+      <w:r>
+        <w:rPr>
+          <w:rFonts w:asciiTheme="majorBidi" w:hAnsiTheme="majorBidi" w:cstheme="majorBidi"/>
+          <w:kern w:val="0"/>
+          <w:sz w:val="24"/>
+          <w:szCs w:val="24"/>
+          <w14:ligatures w14:val="none"/>
+        </w:rPr>
+        <w:t xml:space="preserve">s that did not exist at t=0. To </w:t>
+      </w:r>
+      <w:r>
+        <w:rPr>
+          <w:rFonts w:asciiTheme="majorBidi" w:hAnsiTheme="majorBidi" w:cstheme="majorBidi"/>
+          <w:kern w:val="0"/>
+          <w:sz w:val="24"/>
+          <w:szCs w:val="24"/>
+          <w14:ligatures w14:val="none"/>
+        </w:rPr>
+        <w:t>address</w:t>
+      </w:r>
+      <w:r>
+        <w:rPr>
+          <w:rFonts w:asciiTheme="majorBidi" w:hAnsiTheme="majorBidi" w:cstheme="majorBidi"/>
+          <w:kern w:val="0"/>
+          <w:sz w:val="24"/>
+          <w:szCs w:val="24"/>
+          <w14:ligatures w14:val="none"/>
+        </w:rPr>
+        <w:t xml:space="preserve"> this </w:t>
+      </w:r>
+      <w:r>
+        <w:rPr>
+          <w:rFonts w:asciiTheme="majorBidi" w:hAnsiTheme="majorBidi" w:cstheme="majorBidi"/>
+          <w:kern w:val="0"/>
+          <w:sz w:val="24"/>
+          <w:szCs w:val="24"/>
+          <w14:ligatures w14:val="none"/>
+        </w:rPr>
+        <w:t>challenge</w:t>
+      </w:r>
+      <w:r>
+        <w:rPr>
+          <w:rFonts w:asciiTheme="majorBidi" w:hAnsiTheme="majorBidi" w:cstheme="majorBidi"/>
+          <w:kern w:val="0"/>
+          <w:sz w:val="24"/>
+          <w:szCs w:val="24"/>
+          <w14:ligatures w14:val="none"/>
+        </w:rPr>
+        <w:t xml:space="preserve">, we assume that the initial </w:t>
+      </w:r>
+      <w:r>
+        <w:rPr>
+          <w:rFonts w:asciiTheme="majorBidi" w:hAnsiTheme="majorBidi" w:cstheme="majorBidi"/>
+          <w:sz w:val="24"/>
+          <w:szCs w:val="24"/>
+        </w:rPr>
+        <w:t>ξ(t) and A(t)</w:t>
+      </w:r>
+      <w:r>
+        <w:rPr>
+          <w:rFonts w:asciiTheme="majorBidi" w:hAnsiTheme="majorBidi" w:cstheme="majorBidi"/>
+          <w:sz w:val="24"/>
+          <w:szCs w:val="24"/>
+        </w:rPr>
+        <w:t xml:space="preserve"> are agreed on once in the beginning</w:t>
+      </w:r>
+      <w:r>
+        <w:rPr>
+          <w:rFonts w:asciiTheme="majorBidi" w:hAnsiTheme="majorBidi" w:cstheme="majorBidi"/>
+          <w:sz w:val="24"/>
+          <w:szCs w:val="24"/>
+        </w:rPr>
+        <w:t xml:space="preserve"> (either by communication or just hardcoding) </w:t>
+      </w:r>
+      <w:r>
+        <w:rPr>
+          <w:rFonts w:asciiTheme="majorBidi" w:hAnsiTheme="majorBidi" w:cstheme="majorBidi"/>
+          <w:sz w:val="24"/>
+          <w:szCs w:val="24"/>
+        </w:rPr>
+        <w:t xml:space="preserve">. They are then used to construct the historical </w:t>
+      </w:r>
+      <w:r>
+        <w:rPr>
+          <w:rFonts w:ascii="Cambria Math" w:hAnsi="Cambria Math" w:cs="Cambria Math"/>
+          <w:kern w:val="0"/>
+          <w:sz w:val="24"/>
+          <w:szCs w:val="24"/>
+          <w14:ligatures w14:val="none"/>
+        </w:rPr>
+        <w:t>𝜆</w:t>
+      </w:r>
+      <w:r>
+        <w:rPr>
+          <w:rFonts w:asciiTheme="majorBidi" w:hAnsiTheme="majorBidi" w:cstheme="majorBidi"/>
+          <w:kern w:val="0"/>
+          <w:sz w:val="24"/>
+          <w:szCs w:val="24"/>
+          <w14:ligatures w14:val="none"/>
+        </w:rPr>
+        <w:t xml:space="preserve">s by extrapolation in the past knowing the fixed phase shifts of the configuration. </w:t>
+      </w:r>
+    </w:p>
+    <w:p>
+      <w:pPr>
+        <w:spacing w:line="360" w:lineRule="auto"/>
+        <w:ind w:left="360"/>
+        <w:rPr>
+          <w:rFonts w:asciiTheme="majorBidi" w:hAnsiTheme="majorBidi" w:cstheme="majorBidi"/>
+          <w:sz w:val="24"/>
+          <w:szCs w:val="24"/>
+        </w:rPr>
+      </w:pPr>
+      <w:r>
+        <w:rPr>
+          <w:rFonts w:asciiTheme="majorBidi" w:hAnsiTheme="majorBidi" w:cstheme="majorBidi"/>
+          <w:sz w:val="24"/>
+          <w:szCs w:val="24"/>
+        </w:rPr>
+        <w:lastRenderedPageBreak/>
+        <w:t xml:space="preserve">Time: </w:t>
+      </w:r>
+    </w:p>
+    <w:p>
+      <w:pPr>
+        <w:spacing w:line="360" w:lineRule="auto"/>
+        <w:ind w:left="360"/>
+        <w:rPr>
+          <w:rFonts w:asciiTheme="majorBidi" w:hAnsiTheme="majorBidi" w:cstheme="majorBidi"/>
+          <w:sz w:val="24"/>
+          <w:szCs w:val="24"/>
+        </w:rPr>
+      </w:pPr>
+      <w:r>
+        <w:rPr>
+          <w:rFonts w:asciiTheme="majorBidi" w:hAnsiTheme="majorBidi" w:cstheme="majorBidi"/>
+          <w:sz w:val="24"/>
+          <w:szCs w:val="24"/>
+        </w:rPr>
+        <w:t>Although providing the time directly</w:t>
+      </w:r>
+      <w:r>
+        <w:rPr>
+          <w:rFonts w:asciiTheme="majorBidi" w:hAnsiTheme="majorBidi" w:cstheme="majorBidi"/>
+          <w:sz w:val="24"/>
+          <w:szCs w:val="24"/>
+        </w:rPr>
+        <w:t xml:space="preserve"> to the NN</w:t>
+      </w:r>
+      <w:r>
+        <w:rPr>
+          <w:rFonts w:asciiTheme="majorBidi" w:hAnsiTheme="majorBidi" w:cstheme="majorBidi"/>
+          <w:sz w:val="24"/>
+          <w:szCs w:val="24"/>
+        </w:rPr>
+        <w:t xml:space="preserve"> may appear to be the most straightforward solution</w:t>
+      </w:r>
+      <w:r>
+        <w:rPr>
+          <w:rFonts w:asciiTheme="majorBidi" w:hAnsiTheme="majorBidi" w:cstheme="majorBidi"/>
+          <w:sz w:val="24"/>
+          <w:szCs w:val="24"/>
+        </w:rPr>
+        <w:t xml:space="preserve">, this approach leads to several problems. First of all, during the initial stage when we are training on one trajectory, this risks that the network just memorizes which actions to do just based on time. This completely invalidates the test and compromises the investigation of whether the provided state is enough to make the actions learnable. Secondly, it creates generalization </w:t>
+      </w:r>
+      <w:r>
+        <w:rPr>
+          <w:rFonts w:asciiTheme="majorBidi" w:hAnsiTheme="majorBidi" w:cstheme="majorBidi"/>
+          <w:sz w:val="24"/>
+          <w:szCs w:val="24"/>
+        </w:rPr>
+        <w:t>risks</w:t>
+      </w:r>
+      <w:r>
+        <w:rPr>
+          <w:rFonts w:asciiTheme="majorBidi" w:hAnsiTheme="majorBidi" w:cstheme="majorBidi"/>
+          <w:sz w:val="24"/>
+          <w:szCs w:val="24"/>
+        </w:rPr>
+        <w:t xml:space="preserve"> when we attempt to run episodes </w:t>
+      </w:r>
+      <w:r>
+        <w:rPr>
+          <w:rFonts w:asciiTheme="majorBidi" w:hAnsiTheme="majorBidi" w:cstheme="majorBidi"/>
+          <w:sz w:val="24"/>
+          <w:szCs w:val="24"/>
+        </w:rPr>
+        <w:t>longer</w:t>
+      </w:r>
+      <w:r>
+        <w:rPr>
+          <w:rFonts w:asciiTheme="majorBidi" w:hAnsiTheme="majorBidi" w:cstheme="majorBidi"/>
+          <w:sz w:val="24"/>
+          <w:szCs w:val="24"/>
+        </w:rPr>
+        <w:t xml:space="preserve"> than those used in the training. </w:t>
+      </w:r>
+      <w:r>
+        <w:rPr>
+          <w:rFonts w:asciiTheme="majorBidi" w:hAnsiTheme="majorBidi" w:cstheme="majorBidi"/>
+          <w:sz w:val="24"/>
+          <w:szCs w:val="24"/>
+        </w:rPr>
+        <w:t>Lastly, it creates normalization problems since we normalize our observation space before feeding it to the net, by using larger and larger time stamps we distort this normalization and destabilize the resulting observations.</w:t>
+      </w:r>
+      <w:r>
+        <w:rPr>
+          <w:rFonts w:ascii="Cambria Math" w:hAnsi="Cambria Math" w:cs="Cambria Math"/>
+          <w:kern w:val="0"/>
+          <w:sz w:val="24"/>
+          <w:szCs w:val="24"/>
+          <w14:ligatures w14:val="none"/>
+        </w:rPr>
+        <w:t xml:space="preserve"> </w:t>
+      </w:r>
+    </w:p>
+    <w:p>
+      <w:pPr>
+        <w:spacing w:line="360" w:lineRule="auto"/>
+        <w:ind w:left="360"/>
+        <w:rPr>
+          <w:rFonts w:asciiTheme="majorBidi" w:hAnsiTheme="majorBidi" w:cstheme="majorBidi"/>
+          <w:kern w:val="0"/>
+          <w:sz w:val="24"/>
+          <w:szCs w:val="24"/>
+          <w:lang w:bidi="ar-EG"/>
+          <w14:ligatures w14:val="none"/>
+        </w:rPr>
+      </w:pPr>
+      <w:r>
+        <w:rPr>
+          <w:rFonts w:asciiTheme="majorBidi" w:hAnsiTheme="majorBidi" w:cstheme="majorBidi"/>
+          <w:kern w:val="0"/>
+          <w:sz w:val="24"/>
+          <w:szCs w:val="24"/>
+          <w14:ligatures w14:val="none"/>
+        </w:rPr>
+        <w:t xml:space="preserve">The main goal of using the time to determine the current phase in the sinusoid </w:t>
+      </w:r>
+      <w:r>
+        <w:rPr>
+          <w:rFonts w:asciiTheme="majorBidi" w:hAnsiTheme="majorBidi" w:cstheme="majorBidi"/>
+          <w:kern w:val="0"/>
+          <w:sz w:val="24"/>
+          <w:szCs w:val="24"/>
+          <w14:ligatures w14:val="none"/>
+        </w:rPr>
+        <w:t>function</w:t>
+      </w:r>
+      <w:r>
+        <w:rPr>
+          <w:rFonts w:asciiTheme="majorBidi" w:hAnsiTheme="majorBidi" w:cstheme="majorBidi"/>
+          <w:kern w:val="0"/>
+          <w:sz w:val="24"/>
+          <w:szCs w:val="24"/>
+          <w14:ligatures w14:val="none"/>
+        </w:rPr>
+        <w:t>.</w:t>
+      </w:r>
+      <w:r>
+        <w:rPr>
+          <w:rFonts w:asciiTheme="majorBidi" w:hAnsiTheme="majorBidi" w:cstheme="majorBidi"/>
+          <w:kern w:val="0"/>
+          <w:sz w:val="24"/>
+          <w:szCs w:val="24"/>
+          <w14:ligatures w14:val="none"/>
+        </w:rPr>
+        <w:t xml:space="preserve"> Consequently, </w:t>
+      </w:r>
+      <w:r>
+        <w:rPr>
+          <w:rFonts w:asciiTheme="majorBidi" w:hAnsiTheme="majorBidi" w:cstheme="majorBidi"/>
+          <w:kern w:val="0"/>
+          <w:sz w:val="24"/>
+          <w:szCs w:val="24"/>
+          <w:lang w:bidi="ar-EG"/>
+          <w14:ligatures w14:val="none"/>
+        </w:rPr>
+        <w:t xml:space="preserve">we need only to encode the position in the oscillation. </w:t>
+      </w:r>
+      <w:r>
+        <w:rPr>
+          <w:rFonts w:asciiTheme="majorBidi" w:hAnsiTheme="majorBidi" w:cstheme="majorBidi"/>
+          <w:kern w:val="0"/>
+          <w:sz w:val="24"/>
+          <w:szCs w:val="24"/>
+          <w:lang w:bidi="ar-EG"/>
+          <w14:ligatures w14:val="none"/>
+        </w:rPr>
+        <w:t>It can be</w:t>
+      </w:r>
+      <w:r>
+        <w:rPr>
+          <w:rFonts w:asciiTheme="majorBidi" w:hAnsiTheme="majorBidi" w:cstheme="majorBidi"/>
+          <w:kern w:val="0"/>
+          <w:sz w:val="24"/>
+          <w:szCs w:val="24"/>
+          <w:lang w:bidi="ar-EG"/>
+          <w14:ligatures w14:val="none"/>
+        </w:rPr>
+        <w:t xml:space="preserve"> </w:t>
+      </w:r>
+      <w:r>
+        <w:rPr>
+          <w:rFonts w:asciiTheme="majorBidi" w:hAnsiTheme="majorBidi" w:cstheme="majorBidi"/>
+          <w:kern w:val="0"/>
+          <w:sz w:val="24"/>
+          <w:szCs w:val="24"/>
+          <w:lang w:bidi="ar-EG"/>
+          <w14:ligatures w14:val="none"/>
+        </w:rPr>
+        <w:t>argued</w:t>
+      </w:r>
+      <w:r>
+        <w:rPr>
+          <w:rFonts w:asciiTheme="majorBidi" w:hAnsiTheme="majorBidi" w:cstheme="majorBidi"/>
+          <w:kern w:val="0"/>
+          <w:sz w:val="24"/>
+          <w:szCs w:val="24"/>
+          <w:lang w:bidi="ar-EG"/>
+          <w14:ligatures w14:val="none"/>
+        </w:rPr>
+        <w:t xml:space="preserve"> that the previous </w:t>
+      </w:r>
+      <w:r>
+        <w:rPr>
+          <w:rFonts w:ascii="Cambria Math" w:hAnsi="Cambria Math" w:cs="Cambria Math"/>
+          <w:kern w:val="0"/>
+          <w:sz w:val="24"/>
+          <w:szCs w:val="24"/>
+          <w14:ligatures w14:val="none"/>
+        </w:rPr>
+        <w:t>𝜆</w:t>
+      </w:r>
+      <w:r>
+        <w:rPr>
+          <w:rFonts w:asciiTheme="majorBidi" w:hAnsiTheme="majorBidi" w:cstheme="majorBidi"/>
+          <w:kern w:val="0"/>
+          <w:sz w:val="24"/>
+          <w:szCs w:val="24"/>
+          <w14:ligatures w14:val="none"/>
+        </w:rPr>
+        <w:t xml:space="preserve"> carries this information and therefore should be enough</w:t>
+      </w:r>
+      <w:r>
+        <w:rPr>
+          <w:rFonts w:asciiTheme="majorBidi" w:hAnsiTheme="majorBidi" w:cstheme="majorBidi"/>
+          <w:kern w:val="0"/>
+          <w:sz w:val="24"/>
+          <w:szCs w:val="24"/>
+          <w14:ligatures w14:val="none"/>
+        </w:rPr>
+        <w:t xml:space="preserve">. </w:t>
+      </w:r>
+      <w:r>
+        <w:rPr>
+          <w:rFonts w:asciiTheme="majorBidi" w:hAnsiTheme="majorBidi" w:cstheme="majorBidi"/>
+          <w:kern w:val="0"/>
+          <w:sz w:val="24"/>
+          <w:szCs w:val="24"/>
+          <w14:ligatures w14:val="none"/>
+        </w:rPr>
+        <w:t xml:space="preserve">However, this might be too demanding as any small perturbation or </w:t>
+      </w:r>
+      <w:r>
+        <w:rPr>
+          <w:rFonts w:asciiTheme="majorBidi" w:hAnsiTheme="majorBidi" w:cstheme="majorBidi"/>
+          <w:kern w:val="0"/>
+          <w:sz w:val="24"/>
+          <w:szCs w:val="24"/>
+          <w:lang w:bidi="ar-EG"/>
+          <w14:ligatures w14:val="none"/>
+        </w:rPr>
+        <w:t>noise in the output can cause the NN to deviate and think it is in a different phase</w:t>
+      </w:r>
+      <w:r>
+        <w:rPr>
+          <w:rFonts w:asciiTheme="majorBidi" w:hAnsiTheme="majorBidi" w:cstheme="majorBidi"/>
+          <w:kern w:val="0"/>
+          <w:sz w:val="24"/>
+          <w:szCs w:val="24"/>
+          <w:lang w:bidi="ar-EG"/>
+          <w14:ligatures w14:val="none"/>
+        </w:rPr>
+        <w:t xml:space="preserve"> at the next time step</w:t>
+      </w:r>
+      <w:r>
+        <w:rPr>
+          <w:rFonts w:asciiTheme="majorBidi" w:hAnsiTheme="majorBidi" w:cstheme="majorBidi"/>
+          <w:kern w:val="0"/>
+          <w:sz w:val="24"/>
+          <w:szCs w:val="24"/>
+          <w:lang w:bidi="ar-EG"/>
+          <w14:ligatures w14:val="none"/>
+        </w:rPr>
+        <w:t xml:space="preserve">. </w:t>
+      </w:r>
+      <w:r>
+        <w:rPr>
+          <w:rFonts w:asciiTheme="majorBidi" w:hAnsiTheme="majorBidi" w:cstheme="majorBidi"/>
+          <w:kern w:val="0"/>
+          <w:sz w:val="24"/>
+          <w:szCs w:val="24"/>
+          <w:lang w:bidi="ar-EG"/>
+          <w14:ligatures w14:val="none"/>
+        </w:rPr>
+        <w:t>The</w:t>
+      </w:r>
+      <w:r>
+        <w:rPr>
+          <w:rFonts w:asciiTheme="majorBidi" w:hAnsiTheme="majorBidi" w:cstheme="majorBidi"/>
+          <w:kern w:val="0"/>
+          <w:sz w:val="24"/>
+          <w:szCs w:val="24"/>
+          <w:lang w:bidi="ar-EG"/>
+          <w14:ligatures w14:val="none"/>
+        </w:rPr>
+        <w:t xml:space="preserve"> perturbed output is used as input at the next time step, creating a feedback loop in which the resulting deviation can propagate and compound over subsequent steps. As the policy continues to act on increasingly perturbed observations, the instability can become self-reinforcing, while simultaneously driving the physical system away from its intended state. </w:t>
+      </w:r>
+    </w:p>
+    <w:p>
+      <w:pPr>
+        <w:spacing w:line="360" w:lineRule="auto"/>
+        <w:ind w:left="360"/>
+        <w:rPr>
+          <w:rFonts w:asciiTheme="majorBidi" w:hAnsiTheme="majorBidi" w:cstheme="majorBidi"/>
+          <w:kern w:val="0"/>
+          <w:sz w:val="24"/>
+          <w:szCs w:val="24"/>
+          <w:lang w:bidi="ar-EG"/>
+          <w14:ligatures w14:val="none"/>
+        </w:rPr>
+      </w:pPr>
+      <w:r>
+        <w:rPr>
+          <w:rFonts w:asciiTheme="majorBidi" w:hAnsiTheme="majorBidi" w:cstheme="majorBidi"/>
+          <w:kern w:val="0"/>
+          <w:sz w:val="24"/>
+          <w:szCs w:val="24"/>
+          <w14:ligatures w14:val="none"/>
+        </w:rPr>
+        <w:t xml:space="preserve">It is important to note that this information is not </w:t>
+      </w:r>
+      <w:r>
+        <w:rPr>
+          <w:rFonts w:asciiTheme="majorBidi" w:hAnsiTheme="majorBidi" w:cstheme="majorBidi"/>
+          <w:kern w:val="0"/>
+          <w:sz w:val="24"/>
+          <w:szCs w:val="24"/>
+          <w:lang w:bidi="ar-EG"/>
+          <w14:ligatures w14:val="none"/>
+        </w:rPr>
+        <w:t xml:space="preserve">encoded in any way in the load position, as it can be completely static while </w:t>
+      </w:r>
+      <w:r>
+        <w:rPr>
+          <w:rFonts w:ascii="Cambria Math" w:hAnsi="Cambria Math" w:cs="Cambria Math"/>
+          <w:kern w:val="0"/>
+          <w:sz w:val="24"/>
+          <w:szCs w:val="24"/>
+          <w14:ligatures w14:val="none"/>
+        </w:rPr>
+        <w:t>𝜆</w:t>
+      </w:r>
+      <w:r>
+        <w:rPr>
+          <w:rFonts w:asciiTheme="majorBidi" w:hAnsiTheme="majorBidi" w:cstheme="majorBidi"/>
+          <w:kern w:val="0"/>
+          <w:sz w:val="24"/>
+          <w:szCs w:val="24"/>
+          <w14:ligatures w14:val="none"/>
+        </w:rPr>
+        <w:t xml:space="preserve"> is oscillating.</w:t>
+      </w:r>
+      <w:r>
+        <w:rPr>
+          <w:rFonts w:asciiTheme="majorBidi" w:hAnsiTheme="majorBidi" w:cstheme="majorBidi"/>
+          <w:kern w:val="0"/>
+          <w:sz w:val="24"/>
+          <w:szCs w:val="24"/>
+          <w14:ligatures w14:val="none"/>
+        </w:rPr>
+        <w:t xml:space="preserve"> Nevertheless, </w:t>
+      </w:r>
+      <w:r>
+        <w:rPr>
+          <w:rFonts w:asciiTheme="majorBidi" w:hAnsiTheme="majorBidi" w:cstheme="majorBidi"/>
+          <w:kern w:val="0"/>
+          <w:sz w:val="24"/>
+          <w:szCs w:val="24"/>
+          <w:lang w:bidi="ar-EG"/>
+          <w14:ligatures w14:val="none"/>
+        </w:rPr>
+        <w:t>a</w:t>
+      </w:r>
+      <w:r>
+        <w:rPr>
+          <w:rFonts w:asciiTheme="majorBidi" w:hAnsiTheme="majorBidi" w:cstheme="majorBidi"/>
+          <w:kern w:val="0"/>
+          <w:sz w:val="24"/>
+          <w:szCs w:val="24"/>
+          <w:lang w:bidi="ar-EG"/>
+          <w14:ligatures w14:val="none"/>
+        </w:rPr>
+        <w:t xml:space="preserve">n interesting observation </w:t>
+      </w:r>
+      <w:r>
+        <w:rPr>
+          <w:rFonts w:asciiTheme="majorBidi" w:hAnsiTheme="majorBidi" w:cstheme="majorBidi"/>
+          <w:kern w:val="0"/>
+          <w:sz w:val="24"/>
+          <w:szCs w:val="24"/>
+          <w:lang w:bidi="ar-EG"/>
+          <w14:ligatures w14:val="none"/>
+        </w:rPr>
+        <w:t>is that</w:t>
+      </w:r>
+      <w:r>
+        <w:rPr>
+          <w:rFonts w:asciiTheme="majorBidi" w:hAnsiTheme="majorBidi" w:cstheme="majorBidi"/>
+          <w:kern w:val="0"/>
+          <w:sz w:val="24"/>
+          <w:szCs w:val="24"/>
+          <w:lang w:bidi="ar-EG"/>
+          <w14:ligatures w14:val="none"/>
+        </w:rPr>
+        <w:t xml:space="preserve"> </w:t>
+      </w:r>
+      <w:r>
+        <w:rPr>
+          <w:rFonts w:asciiTheme="majorBidi" w:hAnsiTheme="majorBidi" w:cstheme="majorBidi"/>
+          <w:kern w:val="0"/>
+          <w:sz w:val="24"/>
+          <w:szCs w:val="24"/>
+          <w:lang w:bidi="ar-EG"/>
+          <w14:ligatures w14:val="none"/>
+        </w:rPr>
+        <w:t xml:space="preserve">since each carrier is always orbiting based on </w:t>
+      </w:r>
+      <w:r>
+        <w:rPr>
+          <w:rFonts w:ascii="Cambria Math" w:hAnsi="Cambria Math" w:cs="Cambria Math"/>
+          <w:kern w:val="0"/>
+          <w:sz w:val="24"/>
+          <w:szCs w:val="24"/>
+          <w14:ligatures w14:val="none"/>
+        </w:rPr>
+        <w:t>𝜆</w:t>
+      </w:r>
+      <w:r>
+        <w:rPr>
+          <w:rFonts w:asciiTheme="majorBidi" w:hAnsiTheme="majorBidi" w:cstheme="majorBidi"/>
+          <w:kern w:val="0"/>
+          <w:sz w:val="24"/>
+          <w:szCs w:val="24"/>
+          <w:lang w:bidi="ar-EG"/>
+          <w14:ligatures w14:val="none"/>
+        </w:rPr>
+        <w:t xml:space="preserve">, its position and velocity implicitly encode its phase within the cycle. So the policy does not necessarily need to have access to time. The phase of the periodic signal is recoverable from the observable state of the system. In this sense, the dynamics of the environment effectively integrate the periodic signal into the carrier's physical state, allowing the policy to infer the corresponding phase of </w:t>
+      </w:r>
+      <w:r>
+        <w:rPr>
+          <w:rFonts w:ascii="Cambria Math" w:hAnsi="Cambria Math" w:cs="Cambria Math"/>
+          <w:kern w:val="0"/>
+          <w:sz w:val="24"/>
+          <w:szCs w:val="24"/>
+          <w14:ligatures w14:val="none"/>
+        </w:rPr>
+        <w:t>𝜆</w:t>
+      </w:r>
+      <w:r>
+        <w:rPr>
+          <w:rFonts w:asciiTheme="majorBidi" w:hAnsiTheme="majorBidi" w:cstheme="majorBidi"/>
+          <w:kern w:val="0"/>
+          <w:sz w:val="24"/>
+          <w:szCs w:val="24"/>
+          <w:lang w:bidi="ar-EG"/>
+          <w14:ligatures w14:val="none"/>
+        </w:rPr>
+        <w:t xml:space="preserve"> directly from the observation rather than relying on an external clock.</w:t>
+      </w:r>
+      <w:r>
+        <w:rPr>
+          <w:rFonts w:asciiTheme="majorBidi" w:hAnsiTheme="majorBidi" w:cstheme="majorBidi"/>
+          <w:kern w:val="0"/>
+          <w:sz w:val="24"/>
+          <w:szCs w:val="24"/>
+          <w:lang w:bidi="ar-EG"/>
+          <w14:ligatures w14:val="none"/>
+        </w:rPr>
+        <w:t xml:space="preserve"> The main challenge with this approach, though, is that it suffers from the same sensitivity and instability as depending on </w:t>
+      </w:r>
+      <w:r>
+        <w:rPr>
+          <w:rFonts w:ascii="Cambria Math" w:hAnsi="Cambria Math" w:cs="Cambria Math"/>
+          <w:kern w:val="0"/>
+          <w:sz w:val="24"/>
+          <w:szCs w:val="24"/>
+          <w14:ligatures w14:val="none"/>
+        </w:rPr>
+        <w:t>𝜆</w:t>
+      </w:r>
+      <w:r>
+        <w:rPr>
+          <w:rFonts w:asciiTheme="majorBidi" w:hAnsiTheme="majorBidi" w:cstheme="majorBidi"/>
+          <w:kern w:val="0"/>
+          <w:sz w:val="24"/>
+          <w:szCs w:val="24"/>
+          <w14:ligatures w14:val="none"/>
+        </w:rPr>
+        <w:t xml:space="preserve">(t-1). Once the carrier position and velocity are perturbed or noised in any way, the policy’s </w:t>
+      </w:r>
+      <w:r>
+        <w:rPr>
+          <w:rFonts w:asciiTheme="majorBidi" w:hAnsiTheme="majorBidi" w:cstheme="majorBidi"/>
+          <w:kern w:val="0"/>
+          <w:sz w:val="24"/>
+          <w:szCs w:val="24"/>
+          <w14:ligatures w14:val="none"/>
+        </w:rPr>
+        <w:lastRenderedPageBreak/>
+        <w:t>inference of the phase can deviate in an unrecoverable way</w:t>
+      </w:r>
+      <w:r>
+        <w:rPr>
+          <w:rFonts w:asciiTheme="majorBidi" w:hAnsiTheme="majorBidi" w:cstheme="majorBidi"/>
+          <w:kern w:val="0"/>
+          <w:sz w:val="24"/>
+          <w:szCs w:val="24"/>
+          <w14:ligatures w14:val="none"/>
+        </w:rPr>
+        <w:t xml:space="preserve"> that is similar to what was described in the previous paragraph.</w:t>
+      </w:r>
+    </w:p>
+    <w:p>
+      <w:pPr>
+        <w:spacing w:line="360" w:lineRule="auto"/>
+        <w:ind w:left="360"/>
+        <w:rPr>
+          <w:rFonts w:asciiTheme="majorBidi" w:hAnsiTheme="majorBidi" w:cstheme="majorBidi"/>
+          <w:kern w:val="0"/>
+          <w:sz w:val="24"/>
+          <w:szCs w:val="24"/>
+          <w:lang w:bidi="ar-EG"/>
+          <w14:ligatures w14:val="none"/>
+        </w:rPr>
+      </w:pPr>
+      <w:r>
+        <w:rPr>
+          <w:rFonts w:asciiTheme="majorBidi" w:hAnsiTheme="majorBidi" w:cstheme="majorBidi"/>
+          <w:kern w:val="0"/>
+          <w:sz w:val="24"/>
+          <w:szCs w:val="24"/>
+          <w:lang w:bidi="ar-EG"/>
+          <w14:ligatures w14:val="none"/>
+        </w:rPr>
+        <w:t>A promising solution would be to use the output of a periodic function in time. One possible function can be a saw tooth, but an even better solution can be using sin</w:t>
+      </w:r>
+      <w:r>
+        <w:rPr>
+          <w:rFonts w:asciiTheme="majorBidi" w:hAnsiTheme="majorBidi" w:cstheme="majorBidi"/>
+          <w:kern w:val="0"/>
+          <w:sz w:val="24"/>
+          <w:szCs w:val="24"/>
+          <w:lang w:bidi="ar-EG"/>
+          <w14:ligatures w14:val="none"/>
+        </w:rPr>
+        <w:t>e</w:t>
+      </w:r>
+      <w:r>
+        <w:rPr>
+          <w:rFonts w:asciiTheme="majorBidi" w:hAnsiTheme="majorBidi" w:cstheme="majorBidi"/>
+          <w:kern w:val="0"/>
+          <w:sz w:val="24"/>
+          <w:szCs w:val="24"/>
+          <w:lang w:bidi="ar-EG"/>
+          <w14:ligatures w14:val="none"/>
+        </w:rPr>
+        <w:t xml:space="preserve"> and cos</w:t>
+      </w:r>
+      <w:r>
+        <w:rPr>
+          <w:rFonts w:asciiTheme="majorBidi" w:hAnsiTheme="majorBidi" w:cstheme="majorBidi"/>
+          <w:kern w:val="0"/>
+          <w:sz w:val="24"/>
+          <w:szCs w:val="24"/>
+          <w:lang w:bidi="ar-EG"/>
+          <w14:ligatures w14:val="none"/>
+        </w:rPr>
+        <w:t>ine functions</w:t>
+      </w:r>
+      <w:r>
+        <w:rPr>
+          <w:rFonts w:asciiTheme="majorBidi" w:hAnsiTheme="majorBidi" w:cstheme="majorBidi"/>
+          <w:kern w:val="0"/>
+          <w:sz w:val="24"/>
+          <w:szCs w:val="24"/>
+          <w:lang w:bidi="ar-EG"/>
+          <w14:ligatures w14:val="none"/>
+        </w:rPr>
+        <w:t xml:space="preserve">.  </w:t>
+      </w:r>
+    </w:p>
+    <w:p>
+      <w:pPr>
+        <w:spacing w:line="360" w:lineRule="auto"/>
+        <w:ind w:left="360"/>
+        <w:rPr>
+          <w:rFonts w:asciiTheme="majorBidi" w:hAnsiTheme="majorBidi" w:cstheme="majorBidi"/>
+          <w:sz w:val="24"/>
+          <w:szCs w:val="24"/>
+          <w:lang w:bidi="ar-EG"/>
+        </w:rPr>
+      </w:pPr>
+      <w:r>
+        <w:rPr>
+          <w:rFonts w:asciiTheme="majorBidi" w:hAnsiTheme="majorBidi" w:cstheme="majorBidi"/>
+          <w:sz w:val="24"/>
+          <w:szCs w:val="24"/>
+          <w:lang w:bidi="ar-EG"/>
+        </w:rPr>
+        <w:t>Fourier time encoding</w:t>
+      </w:r>
+      <w:r>
+        <w:rPr>
+          <w:rFonts w:asciiTheme="majorBidi" w:hAnsiTheme="majorBidi" w:cstheme="majorBidi"/>
+          <w:sz w:val="24"/>
+          <w:szCs w:val="24"/>
+          <w:lang w:bidi="ar-EG"/>
+        </w:rPr>
+        <w:t>/</w:t>
+      </w:r>
+      <w:r>
+        <w:t xml:space="preserve"> </w:t>
+      </w:r>
+      <w:r>
+        <w:rPr>
+          <w:rFonts w:asciiTheme="majorBidi" w:hAnsiTheme="majorBidi" w:cstheme="majorBidi"/>
+          <w:sz w:val="24"/>
+          <w:szCs w:val="24"/>
+          <w:lang w:bidi="ar-EG"/>
+        </w:rPr>
+        <w:t>Fourier feature mapping</w:t>
+      </w:r>
+      <w:r>
+        <w:rPr>
+          <w:rFonts w:asciiTheme="majorBidi" w:hAnsiTheme="majorBidi" w:cstheme="majorBidi"/>
+          <w:sz w:val="24"/>
+          <w:szCs w:val="24"/>
+          <w:lang w:bidi="ar-EG"/>
+        </w:rPr>
+        <w:t>:</w:t>
+      </w:r>
+    </w:p>
+    <w:p>
+      <w:pPr>
+        <w:spacing w:line="360" w:lineRule="auto"/>
+        <w:ind w:left="360"/>
+        <w:rPr>
+          <w:rFonts w:asciiTheme="majorBidi" w:hAnsiTheme="majorBidi" w:cstheme="majorBidi"/>
+          <w:sz w:val="24"/>
+          <w:szCs w:val="24"/>
+          <w:lang w:bidi="ar-EG"/>
+        </w:rPr>
+      </w:pPr>
+      <w:r>
+        <w:rPr>
+          <w:rFonts w:asciiTheme="majorBidi" w:hAnsiTheme="majorBidi" w:cstheme="majorBidi"/>
+          <w:sz w:val="24"/>
+          <w:szCs w:val="24"/>
+          <w:lang w:bidi="ar-EG"/>
+        </w:rPr>
+        <w:t>Fourier time encoding (also called trigonometric clock embedding, sinusoidal time embedding, or Fourier feature encoding) is a way of representing time or phase as a vector of periodic functions instead of a single scalar</w:t>
+      </w:r>
+      <w:r>
+        <w:rPr>
+          <w:rFonts w:asciiTheme="majorBidi" w:hAnsiTheme="majorBidi" w:cstheme="majorBidi"/>
+          <w:sz w:val="24"/>
+          <w:szCs w:val="24"/>
+          <w:lang w:bidi="ar-EG"/>
+        </w:rPr>
+        <w:t xml:space="preserve"> [5]</w:t>
+      </w:r>
+      <w:r>
+        <w:rPr>
+          <w:rFonts w:asciiTheme="majorBidi" w:hAnsiTheme="majorBidi" w:cstheme="majorBidi"/>
+          <w:sz w:val="24"/>
+          <w:szCs w:val="24"/>
+          <w:lang w:bidi="ar-EG"/>
+        </w:rPr>
+        <w:t>.</w:t>
+      </w:r>
+    </w:p>
+    <w:p>
+      <w:pPr>
+        <w:spacing w:after="0" w:line="240" w:lineRule="auto"/>
+        <w:ind w:firstLine="360"/>
+        <w:rPr>
           <w:rFonts w:ascii="Times New Roman" w:eastAsia="Times New Roman" w:hAnsi="Times New Roman" w:cs="Times New Roman"/>
           <w:kern w:val="0"/>
           <w:sz w:val="24"/>
           <w:szCs w:val="24"/>
-          <w14:ligatures w14:val="none"/>
-        </w:rPr>
-      </w:pPr>
-      <w:r>
-        <w:rPr>
-          <w:rFonts w:asciiTheme="majorBidi" w:hAnsiTheme="majorBidi" w:cstheme="majorBidi"/>
-          <w:sz w:val="24"/>
-          <w:szCs w:val="24"/>
-        </w:rPr>
-        <w:t>Physical system states</w:t>
-      </w:r>
-      <w:r>
-        <w:rPr>
-          <w:rFonts w:asciiTheme="majorBidi" w:hAnsiTheme="majorBidi" w:cstheme="majorBidi"/>
-          <w:sz w:val="24"/>
-          <w:szCs w:val="24"/>
+          <w:rtl/>
+          <w14:ligatures w14:val="none"/>
+        </w:rPr>
+      </w:pPr>
+      <w:r>
+        <w:rPr>
+          <w:rFonts w:ascii="Times New Roman" w:eastAsia="Times New Roman" w:hAnsi="Times New Roman" w:cs="Times New Roman"/>
+          <w:kern w:val="0"/>
+          <w:sz w:val="24"/>
+          <w:szCs w:val="24"/>
+          <w14:ligatures w14:val="none"/>
+        </w:rPr>
+        <w:t>ϕ(t)</w:t>
+      </w:r>
+      <w:r>
+        <w:rPr>
+          <w:rFonts w:ascii="Times New Roman" w:eastAsia="Times New Roman" w:hAnsi="Times New Roman" w:cs="Times New Roman" w:hint="cs"/>
+          <w:kern w:val="0"/>
+          <w:sz w:val="24"/>
+          <w:szCs w:val="24"/>
+          <w:rtl/>
+          <w14:ligatures w14:val="none"/>
+        </w:rPr>
+        <w:t xml:space="preserve"> </w:t>
+      </w:r>
+      <w:r>
+        <w:rPr>
+          <w:rFonts w:ascii="Times New Roman" w:eastAsia="Times New Roman" w:hAnsi="Times New Roman" w:cs="Times New Roman"/>
+          <w:kern w:val="0"/>
+          <w:sz w:val="24"/>
+          <w:szCs w:val="24"/>
+          <w14:ligatures w14:val="none"/>
+        </w:rPr>
+        <w:t>=</w:t>
+      </w:r>
+      <w:r>
+        <w:rPr>
+          <w:rFonts w:ascii="Times New Roman" w:eastAsia="Times New Roman" w:hAnsi="Times New Roman" w:cs="Times New Roman"/>
+          <w:kern w:val="0"/>
+          <w:sz w:val="24"/>
+          <w:szCs w:val="24"/>
+          <w14:ligatures w14:val="none"/>
+        </w:rPr>
+        <w:t xml:space="preserve"> [sin⁡(ω</w:t>
+      </w:r>
+      <w:r>
+        <w:rPr>
+          <w:rFonts w:ascii="Times New Roman" w:eastAsia="Times New Roman" w:hAnsi="Times New Roman" w:cs="Times New Roman"/>
+          <w:kern w:val="0"/>
+          <w:sz w:val="24"/>
+          <w:szCs w:val="24"/>
+          <w14:ligatures w14:val="none"/>
+        </w:rPr>
+        <w:t>t)</w:t>
+      </w:r>
+      <w:r>
+        <w:rPr>
+          <w:rFonts w:ascii="Times New Roman" w:eastAsia="Times New Roman" w:hAnsi="Times New Roman" w:cs="Times New Roman"/>
+          <w:kern w:val="0"/>
+          <w:sz w:val="24"/>
+          <w:szCs w:val="24"/>
+          <w14:ligatures w14:val="none"/>
+        </w:rPr>
+        <w:t xml:space="preserve"> </w:t>
+      </w:r>
+      <w:r>
+        <w:rPr>
+          <w:rFonts w:ascii="Times New Roman" w:eastAsia="Times New Roman" w:hAnsi="Times New Roman" w:cs="Times New Roman"/>
+          <w:kern w:val="0"/>
+          <w:sz w:val="24"/>
+          <w:szCs w:val="24"/>
+          <w14:ligatures w14:val="none"/>
+        </w:rPr>
+        <w:t>,</w:t>
+      </w:r>
+      <w:r>
+        <w:rPr>
+          <w:rFonts w:ascii="Times New Roman" w:eastAsia="Times New Roman" w:hAnsi="Times New Roman" w:cs="Times New Roman"/>
+          <w:kern w:val="0"/>
+          <w:sz w:val="24"/>
+          <w:szCs w:val="24"/>
+          <w14:ligatures w14:val="none"/>
+        </w:rPr>
+        <w:t xml:space="preserve"> cos⁡(ω</w:t>
+      </w:r>
+      <w:r>
+        <w:rPr>
+          <w:rFonts w:ascii="Times New Roman" w:eastAsia="Times New Roman" w:hAnsi="Times New Roman" w:cs="Times New Roman"/>
+          <w:kern w:val="0"/>
+          <w:sz w:val="24"/>
+          <w:szCs w:val="24"/>
+          <w14:ligatures w14:val="none"/>
+        </w:rPr>
+        <w:t>t</w:t>
+      </w:r>
+      <w:r>
+        <w:rPr>
+          <w:rFonts w:ascii="Times New Roman" w:eastAsia="Times New Roman" w:hAnsi="Times New Roman" w:cs="Times New Roman"/>
+          <w:kern w:val="0"/>
+          <w:sz w:val="24"/>
+          <w:szCs w:val="24"/>
+          <w14:ligatures w14:val="none"/>
+        </w:rPr>
+        <w:t>)</w:t>
+      </w:r>
+      <w:r>
+        <w:rPr>
+          <w:rFonts w:ascii="Times New Roman" w:eastAsia="Times New Roman" w:hAnsi="Times New Roman" w:cs="Times New Roman"/>
+          <w:kern w:val="0"/>
+          <w:sz w:val="24"/>
+          <w:szCs w:val="24"/>
+          <w14:ligatures w14:val="none"/>
+        </w:rPr>
+        <w:t>]</w:t>
+      </w:r>
+      <w:r>
+        <w:rPr>
+          <w:rFonts w:ascii="Times New Roman" w:eastAsia="Times New Roman" w:hAnsi="Times New Roman" w:cs="Times New Roman"/>
+          <w:kern w:val="0"/>
+          <w:sz w:val="24"/>
+          <w:szCs w:val="24"/>
+          <w14:ligatures w14:val="none"/>
+        </w:rPr>
+        <w:t xml:space="preserve"> </w:t>
+      </w:r>
+    </w:p>
+    <w:p>
+      <w:pPr>
+        <w:spacing w:after="0" w:line="240" w:lineRule="auto"/>
+        <w:ind w:firstLine="360"/>
+        <w:rPr>
+          <w:rFonts w:asciiTheme="majorBidi" w:eastAsia="Times New Roman" w:hAnsiTheme="majorBidi" w:cstheme="majorBidi"/>
+          <w:kern w:val="0"/>
+          <w:sz w:val="24"/>
+          <w:szCs w:val="24"/>
+          <w:rtl/>
+          <w14:ligatures w14:val="none"/>
+        </w:rPr>
+      </w:pPr>
+    </w:p>
+    <w:p>
+      <w:pPr>
+        <w:spacing w:after="0" w:line="240" w:lineRule="auto"/>
+        <w:ind w:left="360"/>
+        <w:rPr>
+          <w:rFonts w:asciiTheme="majorBidi" w:eastAsia="Times New Roman" w:hAnsiTheme="majorBidi" w:cstheme="majorBidi"/>
+          <w:kern w:val="0"/>
+          <w:sz w:val="24"/>
+          <w:szCs w:val="24"/>
+          <w:lang w:bidi="ar-EG"/>
+          <w14:ligatures w14:val="none"/>
+        </w:rPr>
+      </w:pPr>
+      <w:r>
+        <w:rPr>
+          <w:rFonts w:asciiTheme="majorBidi" w:eastAsia="Times New Roman" w:hAnsiTheme="majorBidi" w:cstheme="majorBidi"/>
+          <w:kern w:val="0"/>
+          <w:sz w:val="24"/>
+          <w:szCs w:val="24"/>
+          <w14:ligatures w14:val="none"/>
+        </w:rPr>
+        <w:t xml:space="preserve">This anchors the observation </w:t>
+      </w:r>
+      <w:r>
+        <w:rPr>
+          <w:rFonts w:asciiTheme="majorBidi" w:eastAsia="Times New Roman" w:hAnsiTheme="majorBidi" w:cstheme="majorBidi"/>
+          <w:kern w:val="0"/>
+          <w:sz w:val="24"/>
+          <w:szCs w:val="24"/>
+          <w:lang w:bidi="ar-EG"/>
+          <w14:ligatures w14:val="none"/>
+        </w:rPr>
+        <w:t xml:space="preserve">in time, making </w:t>
+      </w:r>
+      <w:r>
+        <w:rPr>
+          <w:rFonts w:asciiTheme="majorBidi" w:eastAsia="Times New Roman" w:hAnsiTheme="majorBidi" w:cstheme="majorBidi"/>
+          <w:kern w:val="0"/>
+          <w:sz w:val="24"/>
+          <w:szCs w:val="24"/>
+          <w:lang w:bidi="ar-EG"/>
+          <w14:ligatures w14:val="none"/>
+        </w:rPr>
+        <w:t xml:space="preserve">any </w:t>
+      </w:r>
+      <w:r>
+        <w:rPr>
+          <w:rFonts w:asciiTheme="majorBidi" w:eastAsia="Times New Roman" w:hAnsiTheme="majorBidi" w:cstheme="majorBidi"/>
+          <w:kern w:val="0"/>
+          <w:sz w:val="24"/>
+          <w:szCs w:val="24"/>
+          <w:lang w:bidi="ar-EG"/>
+          <w14:ligatures w14:val="none"/>
+        </w:rPr>
+        <w:t>deviations recoverable</w:t>
+      </w:r>
+      <w:r>
+        <w:rPr>
+          <w:rFonts w:asciiTheme="majorBidi" w:eastAsia="Times New Roman" w:hAnsiTheme="majorBidi" w:cstheme="majorBidi"/>
+          <w:kern w:val="0"/>
+          <w:sz w:val="24"/>
+          <w:szCs w:val="24"/>
+          <w:lang w:bidi="ar-EG"/>
+          <w14:ligatures w14:val="none"/>
+        </w:rPr>
+        <w:t>. This observation is also immune to noise or perturbations</w:t>
+      </w:r>
+      <w:r>
+        <w:rPr>
+          <w:rFonts w:asciiTheme="majorBidi" w:eastAsia="Times New Roman" w:hAnsiTheme="majorBidi" w:cstheme="majorBidi"/>
+          <w:kern w:val="0"/>
+          <w:sz w:val="24"/>
+          <w:szCs w:val="24"/>
+          <w:lang w:bidi="ar-EG"/>
+          <w14:ligatures w14:val="none"/>
+        </w:rPr>
+        <w:t>.</w:t>
+      </w:r>
+      <w:r>
+        <w:rPr>
+          <w:rFonts w:asciiTheme="majorBidi" w:eastAsia="Times New Roman" w:hAnsiTheme="majorBidi" w:cstheme="majorBidi"/>
+          <w:kern w:val="0"/>
+          <w:sz w:val="24"/>
+          <w:szCs w:val="24"/>
+          <w:lang w:bidi="ar-EG"/>
+          <w14:ligatures w14:val="none"/>
+        </w:rPr>
+        <w:t xml:space="preserve"> Sine and cosine are combined since sine alone (or cosine alone) cannot uniquely iden</w:t>
+      </w:r>
+      <w:r>
+        <w:rPr>
+          <w:rFonts w:asciiTheme="majorBidi" w:eastAsia="Times New Roman" w:hAnsiTheme="majorBidi" w:cstheme="majorBidi"/>
+          <w:kern w:val="0"/>
+          <w:sz w:val="24"/>
+          <w:szCs w:val="24"/>
+          <w:lang w:bidi="ar-EG"/>
+          <w14:ligatures w14:val="none"/>
+        </w:rPr>
+        <w:t>tify the phase.</w:t>
+      </w:r>
+    </w:p>
+    <w:p>
+      <w:pPr>
+        <w:spacing w:after="0" w:line="240" w:lineRule="auto"/>
+        <w:ind w:left="360"/>
+        <w:rPr>
+          <w:rFonts w:asciiTheme="majorBidi" w:eastAsia="Times New Roman" w:hAnsiTheme="majorBidi" w:cstheme="majorBidi"/>
+          <w:kern w:val="0"/>
+          <w:sz w:val="24"/>
+          <w:szCs w:val="24"/>
+          <w:lang w:bidi="ar-EG"/>
+          <w14:ligatures w14:val="none"/>
+        </w:rPr>
+      </w:pPr>
+      <w:r>
+        <w:rPr>
+          <w:rFonts w:asciiTheme="majorBidi" w:eastAsia="Times New Roman" w:hAnsiTheme="majorBidi" w:cstheme="majorBidi"/>
+          <w:kern w:val="0"/>
+          <w:sz w:val="24"/>
+          <w:szCs w:val="24"/>
+          <w:lang w:bidi="ar-EG"/>
+          <w14:ligatures w14:val="none"/>
+        </w:rPr>
+        <w:t xml:space="preserve">sin(θ)=sin(π−θ), </w:t>
+      </w:r>
+      <w:r>
+        <w:rPr>
+          <w:rFonts w:asciiTheme="majorBidi" w:eastAsia="Times New Roman" w:hAnsiTheme="majorBidi" w:cstheme="majorBidi"/>
+          <w:kern w:val="0"/>
+          <w:sz w:val="24"/>
+          <w:szCs w:val="24"/>
+          <w14:ligatures w14:val="none"/>
+        </w:rPr>
+        <w:t>so two different phases can produce the same value.</w:t>
+      </w:r>
+    </w:p>
+    <w:p>
+      <w:pPr>
+        <w:spacing w:before="100" w:beforeAutospacing="1" w:after="100" w:afterAutospacing="1" w:line="240" w:lineRule="auto"/>
+        <w:ind w:left="360"/>
+        <w:rPr>
+          <w:rFonts w:asciiTheme="majorBidi" w:eastAsia="Times New Roman" w:hAnsiTheme="majorBidi" w:cstheme="majorBidi"/>
+          <w:kern w:val="0"/>
+          <w:sz w:val="24"/>
+          <w:szCs w:val="24"/>
+          <w14:ligatures w14:val="none"/>
+        </w:rPr>
+      </w:pPr>
+      <w:r>
+        <w:rPr>
+          <w:rFonts w:asciiTheme="majorBidi" w:eastAsia="Times New Roman" w:hAnsiTheme="majorBidi" w:cstheme="majorBidi"/>
+          <w:kern w:val="0"/>
+          <w:sz w:val="24"/>
+          <w:szCs w:val="24"/>
+          <w14:ligatures w14:val="none"/>
+        </w:rPr>
+        <w:t>With both sine and cosine, each phase corresponds to a unique point on the circle</w:t>
+      </w:r>
+      <w:r>
+        <w:rPr>
+          <w:rFonts w:asciiTheme="majorBidi" w:eastAsia="Times New Roman" w:hAnsiTheme="majorBidi" w:cstheme="majorBidi"/>
+          <w:kern w:val="0"/>
+          <w:sz w:val="24"/>
+          <w:szCs w:val="24"/>
+          <w14:ligatures w14:val="none"/>
+        </w:rPr>
+        <w:t>/phase</w:t>
+      </w:r>
+      <w:r>
+        <w:rPr>
+          <w:rFonts w:asciiTheme="majorBidi" w:eastAsia="Times New Roman" w:hAnsiTheme="majorBidi" w:cstheme="majorBidi"/>
+          <w:kern w:val="0"/>
+          <w:sz w:val="24"/>
+          <w:szCs w:val="24"/>
+          <w14:ligatures w14:val="none"/>
         </w:rPr>
         <w:t>:</w:t>
       </w:r>
-    </w:p>
-    <w:p>
-      <w:pPr>
-        <w:spacing w:line="360" w:lineRule="auto"/>
-        <w:ind w:left="360"/>
-        <w:rPr>
-          <w:rFonts w:ascii="Cambria Math" w:hAnsi="Cambria Math" w:cs="Cambria Math"/>
-          <w:sz w:val="24"/>
-          <w:szCs w:val="24"/>
-        </w:rPr>
-      </w:pPr>
-      <w:r>
-        <w:rPr>
-          <w:rFonts w:asciiTheme="majorBidi" w:hAnsiTheme="majorBidi" w:cstheme="majorBidi"/>
-          <w:sz w:val="24"/>
-          <w:szCs w:val="24"/>
-        </w:rPr>
-        <w:t>Naturally,</w:t>
-      </w:r>
-      <w:r>
-        <w:rPr>
-          <w:rFonts w:asciiTheme="majorBidi" w:hAnsiTheme="majorBidi" w:cstheme="majorBidi"/>
-          <w:sz w:val="24"/>
-          <w:szCs w:val="24"/>
+      <w:r>
+        <w:rPr>
+          <w:rFonts w:asciiTheme="majorBidi" w:eastAsia="Times New Roman" w:hAnsiTheme="majorBidi" w:cstheme="majorBidi"/>
+          <w:kern w:val="0"/>
+          <w:sz w:val="24"/>
+          <w:szCs w:val="24"/>
+          <w14:ligatures w14:val="none"/>
+        </w:rPr>
+        <w:t xml:space="preserve"> θ</w:t>
+      </w:r>
+      <w:r>
+        <w:rPr>
+          <w:rFonts w:asciiTheme="majorBidi" w:eastAsia="Times New Roman" w:hAnsiTheme="majorBidi" w:cstheme="majorBidi"/>
+          <w:kern w:val="0"/>
+          <w:sz w:val="24"/>
+          <w:szCs w:val="24"/>
+          <w14:ligatures w14:val="none"/>
         </w:rPr>
         <w:t xml:space="preserve"> </w:t>
       </w:r>
       <w:r>
         <w:rPr>
-          <w:rFonts w:asciiTheme="majorBidi" w:hAnsiTheme="majorBidi" w:cstheme="majorBidi"/>
-          <w:sz w:val="24"/>
-          <w:szCs w:val="24"/>
-        </w:rPr>
-        <w:t xml:space="preserve">the reconstructed velocities of the carriers </w:t>
-      </w:r>
-      <w:r>
-        <w:rPr>
-          <w:rFonts w:asciiTheme="majorBidi" w:hAnsiTheme="majorBidi" w:cstheme="majorBidi"/>
-          <w:sz w:val="24"/>
-          <w:szCs w:val="24"/>
-        </w:rPr>
-        <w:t>p˙Ri</w:t>
-      </w:r>
-      <w:r>
-        <w:rPr>
-          <w:rFonts w:asciiTheme="majorBidi" w:hAnsiTheme="majorBidi" w:cstheme="majorBidi"/>
-          <w:sz w:val="24"/>
-          <w:szCs w:val="24"/>
-        </w:rPr>
-        <w:t xml:space="preserve"> , i = 1, … , n are a going to be part of the state. For our particular implementation we chose n = 4, so the first part of our state is p˙R1,2,3,4 </w:t>
-      </w:r>
-      <w:r>
-        <w:rPr>
-          <w:rFonts w:ascii="Cambria Math" w:hAnsi="Cambria Math" w:cs="Cambria Math"/>
-          <w:sz w:val="24"/>
-          <w:szCs w:val="24"/>
-        </w:rPr>
-        <w:t>∈</w:t>
-      </w:r>
-      <w:r>
-        <w:rPr>
-          <w:rFonts w:ascii="Cambria Math" w:hAnsi="Cambria Math" w:cs="Cambria Math"/>
-          <w:sz w:val="24"/>
-          <w:szCs w:val="24"/>
-        </w:rPr>
-        <w:t xml:space="preserve"> R12 i.e. the carrier velocity vectors stacked. </w:t>
-      </w:r>
-      <w:r>
-        <w:rPr>
-          <w:rFonts w:ascii="Cambria Math" w:hAnsi="Cambria Math" w:cs="Cambria Math"/>
-          <w:sz w:val="24"/>
-          <w:szCs w:val="24"/>
-        </w:rPr>
-        <w:t>While technically only the velocity norms are needed, the whole vectors were provided</w:t>
-      </w:r>
-      <w:r>
-        <w:rPr>
-          <w:rFonts w:ascii="Cambria Math" w:hAnsi="Cambria Math" w:cs="Cambria Math"/>
-          <w:sz w:val="24"/>
-          <w:szCs w:val="24"/>
-        </w:rPr>
-        <w:t xml:space="preserve"> thus increasing</w:t>
-      </w:r>
-      <w:r>
-        <w:rPr>
-          <w:rFonts w:ascii="Cambria Math" w:hAnsi="Cambria Math" w:cs="Cambria Math"/>
-          <w:sz w:val="24"/>
-          <w:szCs w:val="24"/>
-        </w:rPr>
-        <w:t xml:space="preserve"> the information available to the MLP</w:t>
-      </w:r>
-      <w:r>
-        <w:rPr>
-          <w:rFonts w:ascii="Cambria Math" w:hAnsi="Cambria Math" w:cs="Cambria Math"/>
-          <w:sz w:val="24"/>
-          <w:szCs w:val="24"/>
-        </w:rPr>
-        <w:t xml:space="preserve"> and </w:t>
-      </w:r>
-      <w:r>
-        <w:rPr>
-          <w:rFonts w:ascii="Cambria Math" w:hAnsi="Cambria Math"/>
-          <w:sz w:val="24"/>
-          <w:szCs w:val="24"/>
-          <w:lang w:bidi="ar-EG"/>
-        </w:rPr>
-        <w:t>allowing</w:t>
-      </w:r>
-      <w:r>
-        <w:rPr>
-          <w:rFonts w:ascii="Cambria Math" w:hAnsi="Cambria Math" w:cs="Cambria Math"/>
-          <w:sz w:val="24"/>
-          <w:szCs w:val="24"/>
-        </w:rPr>
-        <w:t xml:space="preserve"> it to</w:t>
-      </w:r>
-      <w:r>
-        <w:rPr>
-          <w:rFonts w:ascii="Cambria Math" w:hAnsi="Cambria Math" w:cs="Cambria Math"/>
-          <w:sz w:val="24"/>
-          <w:szCs w:val="24"/>
-        </w:rPr>
-        <w:t xml:space="preserve"> calculate the norm </w:t>
-      </w:r>
-      <w:r>
-        <w:rPr>
-          <w:rFonts w:ascii="Cambria Math" w:hAnsi="Cambria Math" w:cs="Cambria Math"/>
-          <w:sz w:val="24"/>
-          <w:szCs w:val="24"/>
-        </w:rPr>
-        <w:t xml:space="preserve">internally. </w:t>
-      </w:r>
-    </w:p>
-    <w:p>
-      <w:pPr>
-        <w:spacing w:line="360" w:lineRule="auto"/>
-        <w:ind w:left="360"/>
-        <w:rPr>
-          <w:rFonts w:ascii="Cambria Math" w:hAnsi="Cambria Math" w:cs="Cambria Math"/>
-          <w:sz w:val="24"/>
-          <w:szCs w:val="24"/>
-        </w:rPr>
-      </w:pPr>
-      <w:r>
-        <w:rPr>
-          <w:rFonts w:asciiTheme="majorBidi" w:hAnsiTheme="majorBidi" w:cstheme="majorBidi"/>
-          <w:sz w:val="24"/>
-          <w:szCs w:val="24"/>
-        </w:rPr>
-        <w:t>Internal variables</w:t>
-      </w:r>
-      <w:r>
-        <w:rPr>
-          <w:rFonts w:asciiTheme="majorBidi" w:hAnsiTheme="majorBidi" w:cstheme="majorBidi"/>
-          <w:sz w:val="24"/>
-          <w:szCs w:val="24"/>
-        </w:rPr>
-        <w:t>:</w:t>
-      </w:r>
-    </w:p>
-    <w:p>
-      <w:pPr>
-        <w:spacing w:line="360" w:lineRule="auto"/>
-        <w:ind w:left="360"/>
-        <w:rPr>
-          <w:rFonts w:ascii="Cambria Math" w:hAnsi="Cambria Math" w:cs="Cambria Math"/>
-          <w:kern w:val="0"/>
-          <w:sz w:val="24"/>
-          <w:szCs w:val="24"/>
-          <w14:ligatures w14:val="none"/>
-        </w:rPr>
-      </w:pPr>
-      <w:r>
-        <w:rPr>
-          <w:rFonts w:ascii="Cambria Math" w:hAnsi="Cambria Math" w:cs="Cambria Math"/>
-          <w:sz w:val="24"/>
-          <w:szCs w:val="24"/>
-        </w:rPr>
-        <w:t>T</w:t>
-      </w:r>
-      <w:r>
-        <w:rPr>
-          <w:rFonts w:ascii="Cambria Math" w:hAnsi="Cambria Math" w:cs="Cambria Math"/>
-          <w:sz w:val="24"/>
-          <w:szCs w:val="24"/>
-        </w:rPr>
-        <w:t>he phases</w:t>
-      </w:r>
-      <w:r>
-        <w:rPr>
-          <w:rFonts w:asciiTheme="majorBidi" w:hAnsiTheme="majorBidi" w:cstheme="majorBidi"/>
-          <w:kern w:val="0"/>
-          <w:sz w:val="24"/>
-          <w:szCs w:val="24"/>
-          <w14:ligatures w14:val="none"/>
-        </w:rPr>
+          <w:rFonts w:ascii="Cambria Math" w:eastAsia="Times New Roman" w:hAnsi="Cambria Math" w:cs="Cambria Math"/>
+          <w:kern w:val="0"/>
+          <w:sz w:val="24"/>
+          <w:szCs w:val="24"/>
+          <w14:ligatures w14:val="none"/>
+        </w:rPr>
+        <w:t>⟶</w:t>
+      </w:r>
+      <w:r>
+        <w:rPr>
+          <w:rFonts w:asciiTheme="majorBidi" w:eastAsia="Times New Roman" w:hAnsiTheme="majorBidi" w:cstheme="majorBidi"/>
+          <w:kern w:val="0"/>
+          <w:sz w:val="24"/>
+          <w:szCs w:val="24"/>
+          <w14:ligatures w14:val="none"/>
+        </w:rPr>
+        <w:t xml:space="preserve"> [</w:t>
+      </w:r>
+      <w:r>
+        <w:rPr>
+          <w:rFonts w:asciiTheme="majorBidi" w:eastAsia="Times New Roman" w:hAnsiTheme="majorBidi" w:cstheme="majorBidi"/>
+          <w:kern w:val="0"/>
+          <w:sz w:val="24"/>
+          <w:szCs w:val="24"/>
+          <w14:ligatures w14:val="none"/>
+        </w:rPr>
+        <w:t>sin</w:t>
+      </w:r>
+      <w:r>
+        <w:rPr>
+          <w:rFonts w:asciiTheme="majorBidi" w:eastAsia="Times New Roman" w:hAnsiTheme="majorBidi" w:cstheme="majorBidi"/>
+          <w:kern w:val="0"/>
+          <w:sz w:val="24"/>
+          <w:szCs w:val="24"/>
+          <w14:ligatures w14:val="none"/>
+        </w:rPr>
+        <w:t>(</w:t>
+      </w:r>
+      <w:r>
+        <w:rPr>
+          <w:rFonts w:asciiTheme="majorBidi" w:eastAsia="Times New Roman" w:hAnsiTheme="majorBidi" w:cstheme="majorBidi"/>
+          <w:kern w:val="0"/>
+          <w:sz w:val="24"/>
+          <w:szCs w:val="24"/>
+          <w14:ligatures w14:val="none"/>
+        </w:rPr>
+        <w:t>θ</w:t>
+      </w:r>
+      <w:r>
+        <w:rPr>
+          <w:rFonts w:asciiTheme="majorBidi" w:eastAsia="Times New Roman" w:hAnsiTheme="majorBidi" w:cstheme="majorBidi"/>
+          <w:kern w:val="0"/>
+          <w:sz w:val="24"/>
+          <w:szCs w:val="24"/>
+          <w14:ligatures w14:val="none"/>
+        </w:rPr>
+        <w:t>), cos(θ)]</w:t>
+      </w:r>
+      <w:r>
+        <w:rPr>
+          <w:rFonts w:asciiTheme="majorBidi" w:eastAsia="Times New Roman" w:hAnsiTheme="majorBidi" w:cstheme="majorBidi"/>
+          <w:kern w:val="0"/>
+          <w:sz w:val="24"/>
+          <w:szCs w:val="24"/>
+          <w14:ligatures w14:val="none"/>
+        </w:rPr>
+        <w:t>.</w:t>
+      </w:r>
+    </w:p>
+    <w:p>
+      <w:pPr>
+        <w:spacing w:after="0" w:line="240" w:lineRule="auto"/>
+        <w:ind w:firstLine="360"/>
+        <w:rPr>
+          <w:rFonts w:asciiTheme="majorBidi" w:eastAsia="Times New Roman" w:hAnsiTheme="majorBidi" w:cstheme="majorBidi"/>
+          <w:kern w:val="0"/>
+          <w:sz w:val="24"/>
+          <w:szCs w:val="24"/>
+          <w14:ligatures w14:val="none"/>
+        </w:rPr>
+      </w:pPr>
+      <w:r>
+        <w:rPr>
+          <w:rFonts w:asciiTheme="majorBidi" w:eastAsia="Times New Roman" w:hAnsiTheme="majorBidi" w:cstheme="majorBidi"/>
+          <w:kern w:val="0"/>
+          <w:sz w:val="24"/>
+          <w:szCs w:val="24"/>
+          <w:lang w:bidi="ar-EG"/>
+          <w14:ligatures w14:val="none"/>
+        </w:rPr>
+        <w:t xml:space="preserve">Furthermore, we use a bank frequencies </w:t>
+      </w:r>
+      <w:r>
+        <w:rPr>
+          <w:rFonts w:asciiTheme="majorBidi" w:eastAsia="Times New Roman" w:hAnsiTheme="majorBidi" w:cstheme="majorBidi"/>
+          <w:kern w:val="0"/>
+          <w:sz w:val="24"/>
+          <w:szCs w:val="24"/>
+          <w14:ligatures w14:val="none"/>
+        </w:rPr>
+        <w:t>ω</w:t>
+      </w:r>
+      <w:r>
+        <w:rPr>
+          <w:rFonts w:asciiTheme="majorBidi" w:eastAsia="Times New Roman" w:hAnsiTheme="majorBidi" w:cstheme="majorBidi"/>
+          <w:kern w:val="0"/>
+          <w:sz w:val="24"/>
+          <w:szCs w:val="24"/>
+          <w14:ligatures w14:val="none"/>
+        </w:rPr>
+        <w:t xml:space="preserve"> instead of just one. </w:t>
+      </w:r>
+    </w:p>
+    <w:p>
+      <w:pPr>
+        <w:spacing w:after="0" w:line="240" w:lineRule="auto"/>
+        <w:ind w:firstLine="360"/>
+        <w:rPr>
+          <w:rStyle w:val="mclose"/>
+          <w:rFonts w:asciiTheme="majorBidi" w:hAnsiTheme="majorBidi" w:cstheme="majorBidi"/>
+          <w:sz w:val="24"/>
+          <w:szCs w:val="24"/>
+        </w:rPr>
+      </w:pPr>
+      <w:r>
+        <w:rPr>
+          <w:rFonts w:asciiTheme="majorBidi" w:eastAsia="Times New Roman" w:hAnsiTheme="majorBidi" w:cstheme="majorBidi"/>
+          <w:kern w:val="0"/>
+          <w:sz w:val="24"/>
+          <w:szCs w:val="24"/>
+          <w14:ligatures w14:val="none"/>
+        </w:rPr>
+        <w:t>ϕ(t)</w:t>
+      </w:r>
+      <w:r>
+        <w:rPr>
+          <w:rStyle w:val="mopen"/>
+          <w:rFonts w:asciiTheme="majorBidi" w:hAnsiTheme="majorBidi" w:cstheme="majorBidi"/>
+          <w:sz w:val="24"/>
+          <w:szCs w:val="24"/>
+        </w:rPr>
+        <w:t xml:space="preserve">  = </w:t>
+      </w:r>
+      <w:r>
+        <w:rPr>
+          <w:rStyle w:val="mopen"/>
+          <w:rFonts w:asciiTheme="majorBidi" w:hAnsiTheme="majorBidi" w:cstheme="majorBidi"/>
+          <w:sz w:val="24"/>
+          <w:szCs w:val="24"/>
+        </w:rPr>
+        <w:t>[</w:t>
+      </w:r>
+      <w:r>
+        <w:rPr>
+          <w:rStyle w:val="mop"/>
+          <w:rFonts w:asciiTheme="majorBidi" w:hAnsiTheme="majorBidi" w:cstheme="majorBidi"/>
+          <w:sz w:val="24"/>
+          <w:szCs w:val="24"/>
+        </w:rPr>
+        <w:t>sin</w:t>
+      </w:r>
+      <w:r>
+        <w:rPr>
+          <w:rStyle w:val="mopen"/>
+          <w:rFonts w:asciiTheme="majorBidi" w:hAnsiTheme="majorBidi" w:cstheme="majorBidi"/>
+          <w:sz w:val="24"/>
+          <w:szCs w:val="24"/>
+        </w:rPr>
+        <w:t>(</w:t>
+      </w:r>
+      <w:r>
+        <w:rPr>
+          <w:rStyle w:val="mord"/>
+          <w:rFonts w:asciiTheme="majorBidi" w:hAnsiTheme="majorBidi" w:cstheme="majorBidi"/>
+          <w:sz w:val="24"/>
+          <w:szCs w:val="24"/>
+        </w:rPr>
+        <w:t>ω1</w:t>
+      </w:r>
+      <w:r>
+        <w:rPr>
+          <w:rStyle w:val="vlist-s"/>
+          <w:rFonts w:asciiTheme="majorBidi" w:hAnsiTheme="majorBidi" w:cstheme="majorBidi"/>
+          <w:sz w:val="24"/>
+          <w:szCs w:val="24"/>
+        </w:rPr>
+        <w:t>​</w:t>
+      </w:r>
+      <w:r>
+        <w:rPr>
+          <w:rStyle w:val="mord"/>
+          <w:rFonts w:asciiTheme="majorBidi" w:hAnsiTheme="majorBidi" w:cstheme="majorBidi"/>
+          <w:sz w:val="24"/>
+          <w:szCs w:val="24"/>
+        </w:rPr>
+        <w:t>t</w:t>
+      </w:r>
+      <w:r>
+        <w:rPr>
+          <w:rStyle w:val="mclose"/>
+          <w:rFonts w:asciiTheme="majorBidi" w:hAnsiTheme="majorBidi" w:cstheme="majorBidi"/>
+          <w:sz w:val="24"/>
+          <w:szCs w:val="24"/>
+        </w:rPr>
+        <w:t>)</w:t>
+      </w:r>
+      <w:r>
+        <w:rPr>
+          <w:rStyle w:val="mpunct"/>
+          <w:rFonts w:asciiTheme="majorBidi" w:hAnsiTheme="majorBidi" w:cstheme="majorBidi"/>
+          <w:sz w:val="24"/>
+          <w:szCs w:val="24"/>
+        </w:rPr>
+        <w:t>,</w:t>
+      </w:r>
+      <w:r>
+        <w:rPr>
+          <w:rStyle w:val="mop"/>
+          <w:rFonts w:asciiTheme="majorBidi" w:hAnsiTheme="majorBidi" w:cstheme="majorBidi"/>
+          <w:sz w:val="24"/>
+          <w:szCs w:val="24"/>
+        </w:rPr>
+        <w:t>cos</w:t>
+      </w:r>
+      <w:r>
+        <w:rPr>
+          <w:rStyle w:val="mopen"/>
+          <w:rFonts w:asciiTheme="majorBidi" w:hAnsiTheme="majorBidi" w:cstheme="majorBidi"/>
+          <w:sz w:val="24"/>
+          <w:szCs w:val="24"/>
+        </w:rPr>
+        <w:t>(</w:t>
+      </w:r>
+      <w:r>
+        <w:rPr>
+          <w:rStyle w:val="mord"/>
+          <w:rFonts w:asciiTheme="majorBidi" w:hAnsiTheme="majorBidi" w:cstheme="majorBidi"/>
+          <w:sz w:val="24"/>
+          <w:szCs w:val="24"/>
+        </w:rPr>
+        <w:t>ω1</w:t>
+      </w:r>
+      <w:r>
+        <w:rPr>
+          <w:rStyle w:val="vlist-s"/>
+          <w:rFonts w:asciiTheme="majorBidi" w:hAnsiTheme="majorBidi" w:cstheme="majorBidi"/>
+          <w:sz w:val="24"/>
+          <w:szCs w:val="24"/>
+        </w:rPr>
+        <w:t>​</w:t>
+      </w:r>
+      <w:r>
+        <w:rPr>
+          <w:rStyle w:val="mord"/>
+          <w:rFonts w:asciiTheme="majorBidi" w:hAnsiTheme="majorBidi" w:cstheme="majorBidi"/>
+          <w:sz w:val="24"/>
+          <w:szCs w:val="24"/>
+        </w:rPr>
+        <w:t>t</w:t>
+      </w:r>
+      <w:r>
+        <w:rPr>
+          <w:rStyle w:val="mclose"/>
+          <w:rFonts w:asciiTheme="majorBidi" w:hAnsiTheme="majorBidi" w:cstheme="majorBidi"/>
+          <w:sz w:val="24"/>
+          <w:szCs w:val="24"/>
+        </w:rPr>
+        <w:t>)</w:t>
+      </w:r>
+      <w:r>
+        <w:rPr>
+          <w:rStyle w:val="mpunct"/>
+          <w:rFonts w:asciiTheme="majorBidi" w:hAnsiTheme="majorBidi" w:cstheme="majorBidi"/>
+          <w:sz w:val="24"/>
+          <w:szCs w:val="24"/>
+        </w:rPr>
+        <w:t>,</w:t>
+      </w:r>
+      <w:r>
+        <w:rPr>
+          <w:rStyle w:val="mop"/>
+          <w:rFonts w:asciiTheme="majorBidi" w:hAnsiTheme="majorBidi" w:cstheme="majorBidi"/>
+          <w:sz w:val="24"/>
+          <w:szCs w:val="24"/>
+        </w:rPr>
+        <w:t>sin</w:t>
+      </w:r>
+      <w:r>
+        <w:rPr>
+          <w:rStyle w:val="mopen"/>
+          <w:rFonts w:asciiTheme="majorBidi" w:hAnsiTheme="majorBidi" w:cstheme="majorBidi"/>
+          <w:sz w:val="24"/>
+          <w:szCs w:val="24"/>
+        </w:rPr>
+        <w:t>(</w:t>
+      </w:r>
+      <w:r>
+        <w:rPr>
+          <w:rStyle w:val="mord"/>
+          <w:rFonts w:asciiTheme="majorBidi" w:hAnsiTheme="majorBidi" w:cstheme="majorBidi"/>
+          <w:sz w:val="24"/>
+          <w:szCs w:val="24"/>
+        </w:rPr>
+        <w:t>ω2</w:t>
+      </w:r>
+      <w:r>
+        <w:rPr>
+          <w:rStyle w:val="vlist-s"/>
+          <w:rFonts w:asciiTheme="majorBidi" w:hAnsiTheme="majorBidi" w:cstheme="majorBidi"/>
+          <w:sz w:val="24"/>
+          <w:szCs w:val="24"/>
+        </w:rPr>
+        <w:t>​</w:t>
+      </w:r>
+      <w:r>
+        <w:rPr>
+          <w:rStyle w:val="mord"/>
+          <w:rFonts w:asciiTheme="majorBidi" w:hAnsiTheme="majorBidi" w:cstheme="majorBidi"/>
+          <w:sz w:val="24"/>
+          <w:szCs w:val="24"/>
+        </w:rPr>
+        <w:t>t</w:t>
+      </w:r>
+      <w:r>
+        <w:rPr>
+          <w:rStyle w:val="mclose"/>
+          <w:rFonts w:asciiTheme="majorBidi" w:hAnsiTheme="majorBidi" w:cstheme="majorBidi"/>
+          <w:sz w:val="24"/>
+          <w:szCs w:val="24"/>
+        </w:rPr>
+        <w:t>)</w:t>
+      </w:r>
+      <w:r>
+        <w:rPr>
+          <w:rStyle w:val="mpunct"/>
+          <w:rFonts w:asciiTheme="majorBidi" w:hAnsiTheme="majorBidi" w:cstheme="majorBidi"/>
+          <w:sz w:val="24"/>
+          <w:szCs w:val="24"/>
+        </w:rPr>
+        <w:t>,</w:t>
+      </w:r>
+      <w:r>
+        <w:rPr>
+          <w:rStyle w:val="mop"/>
+          <w:rFonts w:asciiTheme="majorBidi" w:hAnsiTheme="majorBidi" w:cstheme="majorBidi"/>
+          <w:sz w:val="24"/>
+          <w:szCs w:val="24"/>
+        </w:rPr>
+        <w:t>cos</w:t>
+      </w:r>
+      <w:r>
+        <w:rPr>
+          <w:rStyle w:val="mopen"/>
+          <w:rFonts w:asciiTheme="majorBidi" w:hAnsiTheme="majorBidi" w:cstheme="majorBidi"/>
+          <w:sz w:val="24"/>
+          <w:szCs w:val="24"/>
+        </w:rPr>
+        <w:t>(</w:t>
+      </w:r>
+      <w:r>
+        <w:rPr>
+          <w:rStyle w:val="mord"/>
+          <w:rFonts w:asciiTheme="majorBidi" w:hAnsiTheme="majorBidi" w:cstheme="majorBidi"/>
+          <w:sz w:val="24"/>
+          <w:szCs w:val="24"/>
+        </w:rPr>
+        <w:t>ω2</w:t>
+      </w:r>
+      <w:r>
+        <w:rPr>
+          <w:rStyle w:val="vlist-s"/>
+          <w:rFonts w:asciiTheme="majorBidi" w:hAnsiTheme="majorBidi" w:cstheme="majorBidi"/>
+          <w:sz w:val="24"/>
+          <w:szCs w:val="24"/>
+        </w:rPr>
+        <w:t>​</w:t>
+      </w:r>
+      <w:r>
+        <w:rPr>
+          <w:rStyle w:val="mord"/>
+          <w:rFonts w:asciiTheme="majorBidi" w:hAnsiTheme="majorBidi" w:cstheme="majorBidi"/>
+          <w:sz w:val="24"/>
+          <w:szCs w:val="24"/>
+        </w:rPr>
+        <w:t>t</w:t>
+      </w:r>
+      <w:r>
+        <w:rPr>
+          <w:rStyle w:val="mclose"/>
+          <w:rFonts w:asciiTheme="majorBidi" w:hAnsiTheme="majorBidi" w:cstheme="majorBidi"/>
+          <w:sz w:val="24"/>
+          <w:szCs w:val="24"/>
+        </w:rPr>
+        <w:t>)</w:t>
+      </w:r>
+      <w:r>
+        <w:rPr>
+          <w:rStyle w:val="mpunct"/>
+          <w:rFonts w:asciiTheme="majorBidi" w:hAnsiTheme="majorBidi" w:cstheme="majorBidi"/>
+          <w:sz w:val="24"/>
+          <w:szCs w:val="24"/>
+        </w:rPr>
+        <w:t>,</w:t>
+      </w:r>
+      <w:r>
+        <w:rPr>
+          <w:rStyle w:val="minner"/>
+          <w:rFonts w:asciiTheme="majorBidi" w:hAnsiTheme="majorBidi" w:cstheme="majorBidi"/>
+          <w:sz w:val="24"/>
+          <w:szCs w:val="24"/>
+        </w:rPr>
+        <w:t>…</w:t>
+      </w:r>
+      <w:r>
+        <w:rPr>
+          <w:rStyle w:val="mclose"/>
+          <w:rFonts w:asciiTheme="majorBidi" w:hAnsiTheme="majorBidi" w:cstheme="majorBidi"/>
+          <w:sz w:val="24"/>
+          <w:szCs w:val="24"/>
+        </w:rPr>
+        <w:t>]</w:t>
+      </w:r>
+    </w:p>
+    <w:p>
+      <w:pPr>
+        <w:spacing w:after="0" w:line="240" w:lineRule="auto"/>
+        <w:ind w:firstLine="360"/>
+        <w:rPr>
+          <w:rStyle w:val="mclose"/>
+        </w:rPr>
+      </w:pPr>
+    </w:p>
+    <w:p>
+      <w:pPr>
+        <w:tabs>
+          <w:tab w:val="left" w:pos="2700"/>
+        </w:tabs>
+        <w:spacing w:after="0" w:line="240" w:lineRule="auto"/>
+        <w:ind w:left="360"/>
+        <w:rPr>
+          <w:rFonts w:asciiTheme="majorBidi" w:hAnsiTheme="majorBidi" w:cstheme="majorBidi"/>
+          <w:sz w:val="24"/>
+          <w:szCs w:val="24"/>
+          <w:lang w:bidi="ar-EG"/>
+        </w:rPr>
+      </w:pPr>
+      <w:r>
+        <w:rPr>
+          <w:rFonts w:ascii="Times New Roman" w:eastAsia="Times New Roman" w:hAnsi="Times New Roman" w:cs="Times New Roman"/>
+          <w:kern w:val="0"/>
+          <w:sz w:val="24"/>
+          <w:szCs w:val="24"/>
+          <w:lang w:bidi="ar-EG"/>
+          <w14:ligatures w14:val="none"/>
+        </w:rPr>
+        <w:t xml:space="preserve">This is because </w:t>
+      </w:r>
+      <w:r>
+        <w:rPr>
+          <w:rFonts w:asciiTheme="majorBidi" w:hAnsiTheme="majorBidi" w:cstheme="majorBidi"/>
+          <w:sz w:val="24"/>
+          <w:szCs w:val="24"/>
+        </w:rPr>
+        <w:t>ξ(t)</w:t>
+      </w:r>
+      <w:r>
         <w:t xml:space="preserve"> </w:t>
       </w:r>
       <w:r>
         <w:rPr>
           <w:rFonts w:asciiTheme="majorBidi" w:hAnsiTheme="majorBidi" w:cstheme="majorBidi"/>
-          <w:kern w:val="0"/>
-          <w:sz w:val="24"/>
-          <w:szCs w:val="24"/>
-          <w14:ligatures w14:val="none"/>
-        </w:rPr>
-        <w:t>ϕ</w:t>
-      </w:r>
-      <w:r>
-        <w:rPr>
-          <w:rFonts w:asciiTheme="majorBidi" w:hAnsiTheme="majorBidi" w:cstheme="majorBidi"/>
-          <w:kern w:val="0"/>
-          <w:sz w:val="24"/>
-          <w:szCs w:val="24"/>
-          <w14:ligatures w14:val="none"/>
-        </w:rPr>
-        <w:t>i, i =</w:t>
-      </w:r>
-      <w:r>
-        <w:rPr>
-          <w:rFonts w:ascii="Cambria Math" w:hAnsi="Cambria Math" w:cs="Cambria Math"/>
-          <w:sz w:val="24"/>
-          <w:szCs w:val="24"/>
-        </w:rPr>
-        <w:t xml:space="preserve"> </w:t>
-      </w:r>
-      <w:r>
-        <w:rPr>
-          <w:rFonts w:ascii="Cambria Math" w:hAnsi="Cambria Math" w:cs="Cambria Math"/>
-          <w:sz w:val="24"/>
-          <w:szCs w:val="24"/>
-        </w:rPr>
-        <w:t xml:space="preserve">1,2,3,4 </w:t>
-      </w:r>
-      <w:r>
-        <w:rPr>
-          <w:rFonts w:ascii="Cambria Math" w:hAnsi="Cambria Math" w:cs="Cambria Math"/>
-          <w:sz w:val="24"/>
-          <w:szCs w:val="24"/>
-        </w:rPr>
-        <w:t>are constant for a given configuration</w:t>
-      </w:r>
-      <w:r>
-        <w:rPr>
-          <w:rFonts w:ascii="Cambria Math" w:hAnsi="Cambria Math" w:cs="Cambria Math"/>
-          <w:sz w:val="24"/>
-          <w:szCs w:val="24"/>
-        </w:rPr>
-        <w:t xml:space="preserve"> and therefore can be memorized. On the other hand, </w:t>
-      </w:r>
-      <w:r>
-        <w:rPr>
-          <w:rFonts w:ascii="Cambria Math" w:hAnsi="Cambria Math" w:cs="Cambria Math"/>
-          <w:sz w:val="24"/>
-          <w:szCs w:val="24"/>
-        </w:rPr>
-        <w:t>ξ(t) and A(t)</w:t>
-      </w:r>
-      <w:r>
-        <w:rPr>
-          <w:rFonts w:ascii="Cambria Math" w:hAnsi="Cambria Math" w:cs="Cambria Math"/>
-          <w:sz w:val="24"/>
-          <w:szCs w:val="24"/>
-        </w:rPr>
-        <w:t xml:space="preserve"> are variable </w:t>
-      </w:r>
-      <w:r>
-        <w:rPr>
-          <w:rFonts w:ascii="Cambria Math" w:hAnsi="Cambria Math" w:cs="Cambria Math"/>
-          <w:sz w:val="24"/>
-          <w:szCs w:val="24"/>
-        </w:rPr>
-        <w:t>and depend on t</w:t>
-      </w:r>
-      <w:r>
-        <w:rPr>
-          <w:rFonts w:asciiTheme="majorBidi" w:hAnsiTheme="majorBidi" w:cstheme="majorBidi"/>
-          <w:sz w:val="24"/>
-          <w:szCs w:val="24"/>
-          <w:lang w:bidi="ar-EG"/>
-        </w:rPr>
-        <w:t xml:space="preserve">heir previous value </w:t>
-      </w:r>
-      <w:r>
-        <w:rPr>
-          <w:rFonts w:ascii="Cambria Math" w:hAnsi="Cambria Math" w:cs="Cambria Math"/>
-          <w:sz w:val="24"/>
-          <w:szCs w:val="24"/>
-        </w:rPr>
-        <w:t xml:space="preserve">and the carrier velocity norms. Since the initial value for them in the optimizer is constant, a reasonable assumption would be that the network can memorize them if they remain unchanged. But since they only change based on the carrier velocities (which are provided to the policy), the policy can just memorize the initial condition and learn to change them similar to the optimizer </w:t>
-      </w:r>
-      <w:r>
-        <w:rPr>
-          <w:rFonts w:ascii="Cambria Math" w:hAnsi="Cambria Math" w:cs="Cambria Math"/>
-          <w:sz w:val="24"/>
-          <w:szCs w:val="24"/>
-        </w:rPr>
-        <w:t xml:space="preserve">conditioned on the velocity norms. The challenge is MLPs don’t have any memory or internal state. Consequently, if the policy learns to change </w:t>
-      </w:r>
-      <w:r>
-        <w:rPr>
-          <w:rFonts w:ascii="Cambria Math" w:hAnsi="Cambria Math" w:cs="Cambria Math"/>
-          <w:sz w:val="24"/>
-          <w:szCs w:val="24"/>
-        </w:rPr>
-        <w:t>ξ(t) and A(t)</w:t>
-      </w:r>
-      <w:r>
-        <w:rPr>
-          <w:rFonts w:ascii="Cambria Math" w:hAnsi="Cambria Math" w:cs="Cambria Math"/>
-          <w:sz w:val="24"/>
-          <w:szCs w:val="24"/>
-        </w:rPr>
-        <w:t xml:space="preserve"> in a given step based on its input and what the expert action was by the next step it will have no memory of this and will fall back to the default/initial </w:t>
-      </w:r>
-      <w:r>
-        <w:rPr>
-          <w:rFonts w:ascii="Cambria Math" w:hAnsi="Cambria Math" w:cs="Cambria Math"/>
-          <w:sz w:val="24"/>
-          <w:szCs w:val="24"/>
-        </w:rPr>
-        <w:t>ξ(t) and A(t)</w:t>
-      </w:r>
-      <w:r>
-        <w:rPr>
-          <w:rFonts w:ascii="Cambria Math" w:hAnsi="Cambria Math" w:cs="Cambria Math"/>
-          <w:sz w:val="24"/>
-          <w:szCs w:val="24"/>
-        </w:rPr>
-        <w:t xml:space="preserve"> that structurally memorized. A reasonable remedy would be to supply the policy’s last action as part of the current state/input. So </w:t>
-      </w:r>
-      <w:r>
-        <w:rPr>
-          <w:rFonts w:ascii="Cambria Math" w:hAnsi="Cambria Math" w:cs="Cambria Math"/>
-          <w:sz w:val="24"/>
-          <w:szCs w:val="24"/>
-        </w:rPr>
-        <w:t xml:space="preserve">a(t) </w:t>
-      </w:r>
-      <w:r>
-        <w:rPr>
-          <w:rFonts w:ascii="Cambria Math" w:hAnsi="Cambria Math" w:cs="Cambria Math"/>
-          <w:sz w:val="24"/>
-          <w:szCs w:val="24"/>
-        </w:rPr>
-        <w:t>∈</w:t>
-      </w:r>
-      <w:r>
-        <w:rPr>
-          <w:rFonts w:ascii="Cambria Math" w:hAnsi="Cambria Math" w:cs="Cambria Math"/>
-          <w:sz w:val="24"/>
-          <w:szCs w:val="24"/>
-        </w:rPr>
-        <w:t xml:space="preserve"> s(t+1) or in our case </w:t>
-      </w:r>
-      <w:r>
-        <w:rPr>
-          <w:rFonts w:ascii="Cambria Math" w:hAnsi="Cambria Math" w:cs="Cambria Math"/>
-          <w:kern w:val="0"/>
-          <w:sz w:val="24"/>
-          <w:szCs w:val="24"/>
-          <w14:ligatures w14:val="none"/>
-        </w:rPr>
-        <w:t>𝜆</w:t>
-      </w:r>
-      <w:r>
-        <w:rPr>
-          <w:rFonts w:ascii="Cambria Math" w:hAnsi="Cambria Math" w:cs="Cambria Math"/>
-          <w:kern w:val="0"/>
-          <w:sz w:val="24"/>
-          <w:szCs w:val="24"/>
-          <w14:ligatures w14:val="none"/>
-        </w:rPr>
-        <w:t>(t)</w:t>
-      </w:r>
-      <w:r>
-        <w:rPr>
-          <w:rFonts w:ascii="Cambria Math" w:hAnsi="Cambria Math" w:cs="Cambria Math"/>
-          <w:kern w:val="0"/>
-          <w:sz w:val="24"/>
-          <w:szCs w:val="24"/>
-          <w14:ligatures w14:val="none"/>
-        </w:rPr>
-        <w:t xml:space="preserve"> </w:t>
-      </w:r>
-      <w:r>
-        <w:rPr>
-          <w:rFonts w:ascii="Cambria Math" w:hAnsi="Cambria Math" w:cs="Cambria Math"/>
-          <w:kern w:val="0"/>
-          <w:sz w:val="24"/>
-          <w:szCs w:val="24"/>
-          <w14:ligatures w14:val="none"/>
-        </w:rPr>
-        <w:t>∈</w:t>
-      </w:r>
-      <w:r>
-        <w:rPr>
-          <w:rFonts w:ascii="Cambria Math" w:hAnsi="Cambria Math" w:cs="Cambria Math"/>
-          <w:kern w:val="0"/>
-          <w:sz w:val="24"/>
-          <w:szCs w:val="24"/>
-          <w14:ligatures w14:val="none"/>
-        </w:rPr>
-        <w:t xml:space="preserve"> s(t+1)</w:t>
-      </w:r>
-      <w:r>
-        <w:rPr>
-          <w:rFonts w:ascii="Cambria Math" w:hAnsi="Cambria Math" w:cs="Cambria Math"/>
-          <w:kern w:val="0"/>
-          <w:sz w:val="24"/>
-          <w:szCs w:val="24"/>
-          <w14:ligatures w14:val="none"/>
-        </w:rPr>
-        <w:t xml:space="preserve">. </w:t>
-      </w:r>
-    </w:p>
-    <w:p>
-      <w:pPr>
-        <w:spacing w:line="360" w:lineRule="auto"/>
-        <w:ind w:left="360"/>
-        <w:rPr>
-          <w:rFonts w:ascii="Cambria Math" w:hAnsi="Cambria Math" w:cs="Cambria Math" w:hint="cs"/>
+          <w:sz w:val="24"/>
+          <w:szCs w:val="24"/>
+        </w:rPr>
+        <w:t xml:space="preserve">can change from trajectory to another and </w:t>
+      </w:r>
+      <w:r>
+        <w:rPr>
+          <w:rFonts w:asciiTheme="majorBidi" w:hAnsiTheme="majorBidi" w:cstheme="majorBidi"/>
+          <w:sz w:val="24"/>
+          <w:szCs w:val="24"/>
+        </w:rPr>
+        <w:t>within the same trajectory so the policy</w:t>
+      </w:r>
+      <w:r>
+        <w:rPr>
+          <w:rFonts w:asciiTheme="majorBidi" w:hAnsiTheme="majorBidi" w:cstheme="majorBidi"/>
+          <w:sz w:val="24"/>
+          <w:szCs w:val="24"/>
+        </w:rPr>
+        <w:t xml:space="preserve"> needs to learn to switch to a </w:t>
+      </w:r>
+      <w:r>
+        <w:rPr>
+          <w:rFonts w:asciiTheme="majorBidi" w:hAnsiTheme="majorBidi" w:cstheme="majorBidi"/>
+          <w:sz w:val="24"/>
+          <w:szCs w:val="24"/>
+        </w:rPr>
+        <w:t>different</w:t>
+      </w:r>
+      <w:r>
+        <w:rPr>
+          <w:rFonts w:asciiTheme="majorBidi" w:hAnsiTheme="majorBidi" w:cstheme="majorBidi"/>
+          <w:sz w:val="24"/>
+          <w:szCs w:val="24"/>
+        </w:rPr>
+        <w:t xml:space="preserve"> frequency and time itself using it</w:t>
+      </w:r>
+      <w:r>
+        <w:rPr>
+          <w:rFonts w:asciiTheme="majorBidi" w:hAnsiTheme="majorBidi" w:cstheme="majorBidi"/>
+          <w:sz w:val="24"/>
+          <w:szCs w:val="24"/>
+        </w:rPr>
+        <w:t xml:space="preserve">. Specifically, we use seven </w:t>
+      </w:r>
+      <w:r>
+        <w:rPr>
+          <w:rFonts w:asciiTheme="majorBidi" w:hAnsiTheme="majorBidi" w:cstheme="majorBidi"/>
+          <w:sz w:val="24"/>
+          <w:szCs w:val="24"/>
+        </w:rPr>
+        <w:t xml:space="preserve">frequencies </w:t>
+      </w:r>
+      <w:r>
+        <w:rPr>
+          <w:rFonts w:asciiTheme="majorBidi" w:hAnsiTheme="majorBidi" w:cstheme="majorBidi"/>
+          <w:sz w:val="24"/>
+          <w:szCs w:val="24"/>
+        </w:rPr>
+        <w:t>{1.5, 1.75, 2.0, 2.25, 2.5, 2.75</w:t>
+      </w:r>
+      <w:r>
+        <w:rPr>
+          <w:rFonts w:asciiTheme="majorBidi" w:hAnsiTheme="majorBidi" w:cstheme="majorBidi"/>
+          <w:sz w:val="24"/>
+          <w:szCs w:val="24"/>
+        </w:rPr>
+        <w:t xml:space="preserve">, </w:t>
+      </w:r>
+      <w:r>
+        <w:rPr>
+          <w:rFonts w:asciiTheme="majorBidi" w:hAnsiTheme="majorBidi" w:cstheme="majorBidi"/>
+          <w:sz w:val="24"/>
+          <w:szCs w:val="24"/>
+        </w:rPr>
+        <w:t>3.0</w:t>
+      </w:r>
+      <w:r>
+        <w:rPr>
+          <w:rFonts w:asciiTheme="majorBidi" w:hAnsiTheme="majorBidi" w:cstheme="majorBidi"/>
+          <w:sz w:val="24"/>
+          <w:szCs w:val="24"/>
+        </w:rPr>
+        <w:t>}</w:t>
+      </w:r>
+      <w:r>
+        <w:rPr>
+          <w:rFonts w:asciiTheme="majorBidi" w:hAnsiTheme="majorBidi" w:cstheme="majorBidi"/>
+          <w:sz w:val="24"/>
+          <w:szCs w:val="24"/>
+        </w:rPr>
+        <w:t xml:space="preserve"> rad/s</w:t>
+      </w:r>
+      <w:r>
+        <w:rPr>
+          <w:rFonts w:asciiTheme="majorBidi" w:hAnsiTheme="majorBidi" w:cstheme="majorBidi"/>
+          <w:sz w:val="24"/>
+          <w:szCs w:val="24"/>
+        </w:rPr>
+        <w:t>. These</w:t>
+      </w:r>
+      <w:r>
+        <w:rPr>
+          <w:rFonts w:asciiTheme="majorBidi" w:hAnsiTheme="majorBidi" w:cstheme="majorBidi"/>
+          <w:sz w:val="24"/>
+          <w:szCs w:val="24"/>
+        </w:rPr>
+        <w:t xml:space="preserve"> frequencies were selected based on observing </w:t>
+      </w:r>
+      <w:r>
+        <w:rPr>
+          <w:rFonts w:asciiTheme="majorBidi" w:hAnsiTheme="majorBidi" w:cstheme="majorBidi"/>
+          <w:sz w:val="24"/>
+          <w:szCs w:val="24"/>
+        </w:rPr>
+        <w:t>ξ(t)</w:t>
+      </w:r>
+      <w:r>
+        <w:rPr>
+          <w:rFonts w:asciiTheme="majorBidi" w:hAnsiTheme="majorBidi" w:cstheme="majorBidi"/>
+          <w:sz w:val="24"/>
+          <w:szCs w:val="24"/>
+        </w:rPr>
+        <w:t xml:space="preserve"> on a wide variation of trajectories. It was observed that </w:t>
+      </w:r>
+      <w:r>
+        <w:rPr>
+          <w:rFonts w:asciiTheme="majorBidi" w:hAnsiTheme="majorBidi" w:cstheme="majorBidi"/>
+          <w:sz w:val="24"/>
+          <w:szCs w:val="24"/>
+        </w:rPr>
+        <w:t>ξ(t)</w:t>
+      </w:r>
+      <w:r>
+        <w:rPr>
+          <w:rFonts w:asciiTheme="majorBidi" w:hAnsiTheme="majorBidi" w:cstheme="majorBidi"/>
+          <w:sz w:val="24"/>
+          <w:szCs w:val="24"/>
+        </w:rPr>
+        <w:t xml:space="preserve"> never dips below 1.5</w:t>
+      </w:r>
+      <w:r>
+        <w:rPr>
+          <w:rFonts w:asciiTheme="majorBidi" w:hAnsiTheme="majorBidi" w:cstheme="majorBidi"/>
+          <w:sz w:val="24"/>
+          <w:szCs w:val="24"/>
+        </w:rPr>
+        <w:t xml:space="preserve"> rad/s</w:t>
+      </w:r>
+      <w:r>
+        <w:rPr>
+          <w:rFonts w:asciiTheme="majorBidi" w:hAnsiTheme="majorBidi" w:cstheme="majorBidi"/>
+          <w:sz w:val="24"/>
+          <w:szCs w:val="24"/>
+        </w:rPr>
+        <w:t xml:space="preserve"> and never goes above 3.0</w:t>
+      </w:r>
+      <w:r>
+        <w:rPr>
+          <w:rFonts w:asciiTheme="majorBidi" w:hAnsiTheme="majorBidi" w:cstheme="majorBidi"/>
+          <w:sz w:val="24"/>
+          <w:szCs w:val="24"/>
+        </w:rPr>
+        <w:t xml:space="preserve"> rad/s, so that was the appropriate range to provide. </w:t>
+      </w:r>
+      <w:r>
+        <w:rPr>
+          <w:rFonts w:asciiTheme="majorBidi" w:hAnsiTheme="majorBidi" w:cstheme="majorBidi"/>
+          <w:sz w:val="24"/>
+          <w:szCs w:val="24"/>
+        </w:rPr>
+        <w:t>A spacing of 0.25 rad/s was selected to create a densely spaced frequency set, providing a finer representation of temporal variations within our narrow frequency range</w:t>
+      </w:r>
+      <w:r>
+        <w:rPr>
+          <w:rFonts w:asciiTheme="majorBidi" w:hAnsiTheme="majorBidi" w:cstheme="majorBidi"/>
+          <w:sz w:val="24"/>
+          <w:szCs w:val="24"/>
+        </w:rPr>
+        <w:t xml:space="preserve"> while </w:t>
+      </w:r>
+      <w:r>
+        <w:rPr>
+          <w:rFonts w:asciiTheme="majorBidi" w:hAnsiTheme="majorBidi" w:cstheme="majorBidi"/>
+          <w:sz w:val="24"/>
+          <w:szCs w:val="24"/>
+        </w:rPr>
+        <w:t>avoiding redundancy and excessive growth in the dimensionality of the input representation</w:t>
+      </w:r>
+      <w:r>
+        <w:rPr>
+          <w:rFonts w:asciiTheme="majorBidi" w:hAnsiTheme="majorBidi" w:cstheme="majorBidi"/>
+          <w:sz w:val="24"/>
+          <w:szCs w:val="24"/>
+        </w:rPr>
+        <w:t>. This enables the network to better distinguish between closely spaced temporal frequencies without increasing the total numb</w:t>
+      </w:r>
+      <w:r>
+        <w:rPr>
+          <w:rFonts w:asciiTheme="majorBidi" w:hAnsiTheme="majorBidi" w:cstheme="majorBidi"/>
+          <w:sz w:val="24"/>
+          <w:szCs w:val="24"/>
+        </w:rPr>
+        <w:t>er of frequencies unnecessarily</w:t>
+      </w:r>
+      <w:r>
+        <w:rPr>
+          <w:rFonts w:asciiTheme="majorBidi" w:hAnsiTheme="majorBidi" w:cstheme="majorBidi"/>
+          <w:sz w:val="24"/>
+          <w:szCs w:val="24"/>
+        </w:rPr>
+        <w:t>.</w:t>
+      </w:r>
+    </w:p>
+    <w:p>
+      <w:pPr>
+        <w:spacing w:line="360" w:lineRule="auto"/>
+        <w:ind w:left="360"/>
+        <w:rPr>
+          <w:rFonts w:asciiTheme="majorBidi" w:hAnsiTheme="majorBidi" w:cstheme="majorBidi" w:hint="cs"/>
           <w:sz w:val="24"/>
           <w:szCs w:val="24"/>
           <w:rtl/>
-        </w:rPr>
-      </w:pPr>
-      <w:r>
-        <w:rPr>
-          <w:rFonts w:ascii="Cambria Math" w:hAnsi="Cambria Math" w:cs="Cambria Math"/>
-          <w:kern w:val="0"/>
-          <w:sz w:val="24"/>
-          <w:szCs w:val="24"/>
-          <w14:ligatures w14:val="none"/>
-        </w:rPr>
-        <w:t xml:space="preserve">For learning a single trajectory, this proved to be </w:t>
-      </w:r>
-      <w:r>
-        <w:rPr>
-          <w:rFonts w:ascii="Cambria Math" w:hAnsi="Cambria Math" w:cs="Cambria Math"/>
-          <w:kern w:val="0"/>
-          <w:sz w:val="24"/>
-          <w:szCs w:val="24"/>
-          <w14:ligatures w14:val="none"/>
-        </w:rPr>
-        <w:t xml:space="preserve">sufficient. However, during </w:t>
-      </w:r>
-      <w:r>
-        <w:rPr>
-          <w:rFonts w:ascii="Cambria Math" w:hAnsi="Cambria Math" w:cs="Cambria Math"/>
-          <w:kern w:val="0"/>
-          <w:sz w:val="24"/>
-          <w:szCs w:val="24"/>
-          <w14:ligatures w14:val="none"/>
-        </w:rPr>
-        <w:t xml:space="preserve">generalization it was not enough. By analyzing how it fails, more history information were determined to be necessary (will be discussed in detail in the results section). As a result, instead of just supplying the last </w:t>
-      </w:r>
-      <w:r>
-        <w:rPr>
-          <w:rFonts w:ascii="Cambria Math" w:hAnsi="Cambria Math" w:cs="Cambria Math"/>
-          <w:kern w:val="0"/>
-          <w:sz w:val="24"/>
-          <w:szCs w:val="24"/>
-          <w14:ligatures w14:val="none"/>
-        </w:rPr>
-        <w:t xml:space="preserve">𝜆 </w:t>
-      </w:r>
-      <w:r>
-        <w:rPr>
-          <w:rFonts w:ascii="Cambria Math" w:hAnsi="Cambria Math" w:cs="Cambria Math"/>
-          <w:kern w:val="0"/>
-          <w:sz w:val="24"/>
-          <w:szCs w:val="24"/>
-          <w14:ligatures w14:val="none"/>
-        </w:rPr>
-        <w:t>as an input to the next time step, l</w:t>
-      </w:r>
-      <w:r>
-        <w:rPr>
-          <w:rFonts w:ascii="Cambria Math" w:hAnsi="Cambria Math" w:cs="Cambria Math"/>
-          <w:kern w:val="0"/>
-          <w:sz w:val="24"/>
-          <w:szCs w:val="24"/>
-          <w14:ligatures w14:val="none"/>
-        </w:rPr>
-        <w:t>og-spaced point taps (λ at lags 1, 2, 4</w:t>
-      </w:r>
-      <w:r>
-        <w:rPr>
-          <w:rFonts w:ascii="Cambria Math" w:hAnsi="Cambria Math" w:cs="Cambria Math"/>
-          <w:kern w:val="0"/>
-          <w:sz w:val="24"/>
-          <w:szCs w:val="24"/>
-          <w14:ligatures w14:val="none"/>
-        </w:rPr>
-        <w:t xml:space="preserve">, </w:t>
-      </w:r>
-      <w:r>
-        <w:rPr>
-          <w:rFonts w:ascii="Cambria Math" w:hAnsi="Cambria Math" w:cs="Cambria Math"/>
-          <w:kern w:val="0"/>
-          <w:sz w:val="24"/>
-          <w:szCs w:val="24"/>
-          <w14:ligatures w14:val="none"/>
-        </w:rPr>
-        <w:t>…</w:t>
-      </w:r>
-      <w:r>
-        <w:rPr>
-          <w:rFonts w:ascii="Cambria Math" w:hAnsi="Cambria Math" w:cs="Cambria Math"/>
-          <w:kern w:val="0"/>
-          <w:sz w:val="24"/>
-          <w:szCs w:val="24"/>
-          <w14:ligatures w14:val="none"/>
-        </w:rPr>
-        <w:t xml:space="preserve"> , </w:t>
-      </w:r>
-      <w:r>
-        <w:rPr>
-          <w:rFonts w:ascii="Cambria Math" w:hAnsi="Cambria Math" w:cs="Cambria Math"/>
-          <w:kern w:val="0"/>
-          <w:sz w:val="24"/>
-          <w:szCs w:val="24"/>
-          <w14:ligatures w14:val="none"/>
-        </w:rPr>
-        <w:t>256 steps)</w:t>
-      </w:r>
-      <w:r>
-        <w:rPr>
-          <w:rFonts w:ascii="Cambria Math" w:hAnsi="Cambria Math" w:cs="Cambria Math"/>
-          <w:kern w:val="0"/>
-          <w:sz w:val="24"/>
-          <w:szCs w:val="24"/>
-          <w14:ligatures w14:val="none"/>
-        </w:rPr>
-        <w:t xml:space="preserve"> were used.</w:t>
-      </w:r>
-      <w:r>
-        <w:rPr>
-          <w:rFonts w:ascii="Cambria Math" w:hAnsi="Cambria Math" w:cs="Cambria Math"/>
-          <w:kern w:val="0"/>
-          <w:sz w:val="24"/>
-          <w:szCs w:val="24"/>
-          <w14:ligatures w14:val="none"/>
-        </w:rPr>
-        <w:t xml:space="preserve"> </w:t>
-      </w:r>
+          <w:lang w:bidi="ar-EG"/>
+        </w:rPr>
+      </w:pPr>
+    </w:p>
+    <w:p>
+      <w:pPr>
+        <w:spacing w:line="360" w:lineRule="auto"/>
+        <w:ind w:left="360"/>
+        <w:rPr>
+          <w:rFonts w:asciiTheme="majorBidi" w:hAnsiTheme="majorBidi" w:cstheme="majorBidi" w:hint="cs"/>
+          <w:sz w:val="24"/>
+          <w:szCs w:val="24"/>
+          <w:rtl/>
+          <w:lang w:bidi="ar-EG"/>
+        </w:rPr>
+      </w:pPr>
     </w:p>
     <w:p>
       <w:pPr>
@@ -8715,7 +10350,6 @@
           <w:rFonts w:asciiTheme="majorBidi" w:hAnsiTheme="majorBidi" w:cstheme="majorBidi"/>
           <w:sz w:val="24"/>
           <w:szCs w:val="24"/>
-          <w:lang w:bidi="ar-EG"/>
         </w:rPr>
       </w:pPr>
       <w:r>
@@ -8733,6 +10367,43 @@
           <w:szCs w:val="24"/>
         </w:rPr>
         <w:t xml:space="preserve"> old papers and sofia’s work</w:t>
+      </w:r>
+    </w:p>
+    <w:p>
+      <w:pPr>
+        <w:pStyle w:val="ListParagraph"/>
+        <w:spacing w:line="360" w:lineRule="auto"/>
+        <w:ind w:left="360"/>
+        <w:rPr>
+          <w:rFonts w:asciiTheme="majorBidi" w:hAnsiTheme="majorBidi" w:cstheme="majorBidi"/>
+          <w:sz w:val="24"/>
+          <w:szCs w:val="24"/>
+          <w:lang w:bidi="ar-EG"/>
+        </w:rPr>
+      </w:pPr>
+      <w:r>
+        <w:rPr>
+          <w:rFonts w:asciiTheme="majorBidi" w:hAnsiTheme="majorBidi" w:cstheme="majorBidi"/>
+          <w:sz w:val="24"/>
+          <w:szCs w:val="24"/>
+        </w:rPr>
+        <w:t xml:space="preserve">[5] </w:t>
+      </w:r>
+      <w:r>
+        <w:rPr>
+          <w:rFonts w:asciiTheme="majorBidi" w:hAnsiTheme="majorBidi" w:cstheme="majorBidi"/>
+          <w:sz w:val="24"/>
+          <w:szCs w:val="24"/>
+        </w:rPr>
+        <w:t>Tancik et al.</w:t>
+      </w:r>
+      <w:r>
+        <w:rPr>
+          <w:rFonts w:asciiTheme="majorBidi" w:hAnsiTheme="majorBidi" w:cstheme="majorBidi"/>
+          <w:sz w:val="24"/>
+          <w:szCs w:val="24"/>
+        </w:rPr>
+        <w:t xml:space="preserve"> 2020, fourier time enconding</w:t>
       </w:r>
     </w:p>
     <w:sectPr>
@@ -10394,6 +12065,71 @@
     <w:basedOn w:val="DefaultParagraphFont"/>
     <w:rsid w:val="00F122D7"/>
   </w:style>
+  <w:style w:type="paragraph" w:customStyle="1" w:styleId="pdq2pgselectionanchorcontainer">
+    <w:name w:val="pdq2pg_selectionanchorcontainer"/>
+    <w:basedOn w:val="Normal"/>
+    <w:rsid w:val="00AF3DC8"/>
+    <w:pPr>
+      <w:spacing w:before="100" w:beforeAutospacing="1" w:after="100" w:afterAutospacing="1" w:line="240" w:lineRule="auto"/>
+    </w:pPr>
+    <w:rPr>
+      <w:rFonts w:ascii="Times New Roman" w:eastAsia="Times New Roman" w:hAnsi="Times New Roman" w:cs="Times New Roman"/>
+      <w:kern w:val="0"/>
+      <w:sz w:val="24"/>
+      <w:szCs w:val="24"/>
+      <w14:ligatures w14:val="none"/>
+    </w:rPr>
+  </w:style>
+  <w:style w:type="character" w:customStyle="1" w:styleId="katex">
+    <w:name w:val="katex"/>
+    <w:basedOn w:val="DefaultParagraphFont"/>
+    <w:rsid w:val="00AF3DC8"/>
+  </w:style>
+  <w:style w:type="character" w:styleId="Strong">
+    <w:name w:val="Strong"/>
+    <w:basedOn w:val="DefaultParagraphFont"/>
+    <w:uiPriority w:val="22"/>
+    <w:qFormat/>
+    <w:rsid w:val="00AF3DC8"/>
+    <w:rPr>
+      <w:b/>
+      <w:bCs/>
+    </w:rPr>
+  </w:style>
+  <w:style w:type="character" w:styleId="Emphasis">
+    <w:name w:val="Emphasis"/>
+    <w:basedOn w:val="DefaultParagraphFont"/>
+    <w:uiPriority w:val="20"/>
+    <w:qFormat/>
+    <w:rsid w:val="00AF3DC8"/>
+    <w:rPr>
+      <w:i/>
+      <w:iCs/>
+    </w:rPr>
+  </w:style>
+  <w:style w:type="paragraph" w:styleId="NormalWeb">
+    <w:name w:val="Normal (Web)"/>
+    <w:basedOn w:val="Normal"/>
+    <w:uiPriority w:val="99"/>
+    <w:semiHidden/>
+    <w:unhideWhenUsed/>
+    <w:rsid w:val="004F7B98"/>
+    <w:pPr>
+      <w:spacing w:before="100" w:beforeAutospacing="1" w:after="100" w:afterAutospacing="1" w:line="240" w:lineRule="auto"/>
+    </w:pPr>
+    <w:rPr>
+      <w:rFonts w:ascii="Times New Roman" w:eastAsia="Times New Roman" w:hAnsi="Times New Roman" w:cs="Times New Roman"/>
+      <w:kern w:val="0"/>
+      <w:sz w:val="24"/>
+      <w:szCs w:val="24"/>
+      <w14:ligatures w14:val="none"/>
+    </w:rPr>
+  </w:style>
+  <w:style w:type="character" w:customStyle="1" w:styleId="mop">
+    <w:name w:val="mop"/>
+    <w:basedOn w:val="DefaultParagraphFont"/>
+    <w:rsid w:val="004F7B98"/>
+  </w:style>
 </w:styles>
 </file>
 

</xml_diff>